<commit_message>
[Documentation] Rewrite hw7 sections 3-6 in Traditional Chinese following hw5 style
Convert all body text, figure captions, GRASP descriptions, and table
introductions from English to Traditional Chinese. Figure captions now
follow the '圖 X-Y 中文說明' format used in hw5. Section headings remain
in English per hw5 convention; '[new]' labels removed from heading text.
</commit_message>
<xml_diff>
--- a/hw/hw7/113598009_7.docx
+++ b/hw/hw7/113598009_7.docx
@@ -2939,6 +2939,60 @@
                 <w:sz w:val="20"/>
               </w:rPr>
               <w:t>Iteration II implementation: UC-02 (Define Style Profile) and UC-03 (Check with Interactive Fix Suggestions). Add Design, Implementation Class Model, Programming, and Unit Testing sections. 7 new classes, 6 modified classes, 28 JUnit 5 tests all pass.</w:t>
+            </w:r>
+          </w:p>
+        </w:tc>
+      </w:tr>
+      <w:tr>
+        <w:tc>
+          <w:tcPr>
+            <w:tcW w:type="dxa" w:w="1040"/>
+          </w:tcPr>
+          <w:p>
+            <w:r>
+              <w:rPr>
+                <w:sz w:val="20"/>
+              </w:rPr>
+              <w:t>9.0</w:t>
+            </w:r>
+          </w:p>
+        </w:tc>
+        <w:tc>
+          <w:tcPr>
+            <w:tcW w:type="dxa" w:w="1494"/>
+          </w:tcPr>
+          <w:p>
+            <w:r>
+              <w:rPr>
+                <w:sz w:val="20"/>
+              </w:rPr>
+              <w:t>2026-06-14</w:t>
+            </w:r>
+          </w:p>
+        </w:tc>
+        <w:tc>
+          <w:tcPr>
+            <w:tcW w:type="dxa" w:w="1495"/>
+          </w:tcPr>
+          <w:p>
+            <w:r>
+              <w:rPr>
+                <w:sz w:val="20"/>
+              </w:rPr>
+              <w:t>FrankLi</w:t>
+            </w:r>
+          </w:p>
+        </w:tc>
+        <w:tc>
+          <w:tcPr>
+            <w:tcW w:type="dxa" w:w="4997"/>
+          </w:tcPr>
+          <w:p>
+            <w:r>
+              <w:rPr>
+                <w:sz w:val="20"/>
+              </w:rPr>
+              <w:t>Iteration II 實作：UC-02（Define Style Profile）與 UC-03（Check with Interactive Fix Suggestions）。新增 Design、Implementation Class Model、Programming、Unit Testing 章節。7 個新類別、6 個修改類別，28 個 JUnit 5 測試全部通過。</w:t>
             </w:r>
           </w:p>
         </w:tc>
@@ -19253,7 +19307,7 @@
         <w:pStyle w:val="1"/>
       </w:pPr>
       <w:r>
-        <w:t>3. Design [new]</w:t>
+        <w:t>3. Design</w:t>
       </w:r>
     </w:p>
     <w:p>
@@ -19261,13 +19315,13 @@
         <w:pStyle w:val="2"/>
       </w:pPr>
       <w:r>
-        <w:t>3.1 Logical Architecture with UML Package Diagram [new]</w:t>
+        <w:t>3.1 Logical Architecture</w:t>
       </w:r>
     </w:p>
     <w:p>
       <w:pPr/>
       <w:r>
-        <w:t>The arch-checker system is organised into four horizontal layers: CLI, Application, Domain, and Infrastructure. The CLI layer depends on the Application layer for business logic and on the Infrastructure layer for concrete adapters; it uses picocli as the CLI framework. The Application layer defines interfaces (CodeParser, ProfileLoader, SuppressionStore, Reporter) that the Infrastructure layer implements, following the Dependency Inversion Principle. The Domain layer contains pure business objects with no outward dependencies. Iteration II adds FixCommand, ProfileCommand, ProfileInitCommand, ProfileValidateCommand (CLI layer) and InteractiveFixer, ProfileTemplateService, ProfileValidateService (Application layer).</w:t>
+        <w:t>arch-checker 為單一使用者的 CLI 工具（無 GUI、無資料庫後端）。本節以 UML package diagram 方式呈現 Iteration II 系統的組織架構，並說明各 package 之職責與相依方向。系統分為四個水平層：CLI 層使用 picocli 框架處理指令；Application 層定義業務邏輯與介面（CodeParser、ProfileLoader、SuppressionStore、Reporter）；Domain 層包含純粹的領域物件，無對外依賴；Infrastructure 層實作 Application 層所定義的 port 介面，遵循相依反轉原則（Dependency Inversion Principle）。Iteration II 於 CLI 層新增 FixCommand、ProfileCommand、ProfileInitCommand、ProfileValidateCommand，於 Application 層新增 InteractiveFixer、ProfileTemplateService、ProfileValidateService。</w:t>
       </w:r>
     </w:p>
     <w:p>
@@ -19318,7 +19372,7 @@
           <w:i/>
           <w:sz w:val="20"/>
         </w:rPr>
-        <w:t>Figure 3.1 — Logical Architecture (UML Package Diagram)</w:t>
+        <w:t>圖 3-1 Logical Architecture（UML Package Diagram）</w:t>
       </w:r>
     </w:p>
     <w:p>
@@ -19326,7 +19380,7 @@
         <w:pStyle w:val="2"/>
       </w:pPr>
       <w:r>
-        <w:t>3.2 Use-Case Realizations with GRASP Patterns [new]</w:t>
+        <w:t>3.2 Use-Case Realizations with GRASP Patterns</w:t>
       </w:r>
     </w:p>
     <w:p>
@@ -19340,7 +19394,7 @@
     <w:p>
       <w:pPr/>
       <w:r>
-        <w:t>UC-02 is the most significant new use case in Iteration II. It exposes two system events: initProfile(outputPath) generates a YAML template, and validateProfile(yamlPath) validates an edited profile and reports how many rules were loaded.</w:t>
+        <w:t>UC-02 為 Iteration II 最重要的新增使用案例。本節以 System Sequence Diagram（SSD）識別系統事件，共有兩個系統事件：initProfile(outputPath) 產生 YAML 範本檔，validateProfile(yamlPath) 驗證已編輯的 Profile 並回報成功載入的規則數量。</w:t>
       </w:r>
     </w:p>
     <w:p>
@@ -19391,7 +19445,7 @@
           <w:i/>
           <w:sz w:val="20"/>
         </w:rPr>
-        <w:t>Figure 3.2.1 — SSD for UC-02 Define Style Profile</w:t>
+        <w:t>圖 3-2.1 UC-02 Define Style Profile — System Sequence Diagram</w:t>
       </w:r>
     </w:p>
     <w:p>
@@ -19405,31 +19459,31 @@
     <w:p>
       <w:pPr/>
       <w:r>
-        <w:t>System Event 1: initProfile(outputPath)</w:t>
+        <w:t>系統事件 1：initProfile(outputPath)</w:t>
       </w:r>
     </w:p>
     <w:p>
       <w:pPr/>
       <w:r>
-        <w:t>GRASP patterns applied:</w:t>
+        <w:t>GRASP 模式應用：</w:t>
       </w:r>
     </w:p>
     <w:p>
       <w:pPr/>
       <w:r>
-        <w:t>• Controller: ProfileInitCommand handles the initProfile system event as a use-case controller (one controller per use case).</w:t>
+        <w:t>• Controller：ProfileInitCommand 作為 use-case controller 處理 initProfile 系統事件（一個 use case 對應一個 controller）。</w:t>
       </w:r>
     </w:p>
     <w:p>
       <w:pPr/>
       <w:r>
-        <w:t>• Information Expert + Creator: ProfileTemplateService has full knowledge of the template structure and is responsible for creating and writing the YAML file.</w:t>
+        <w:t>• Information Expert + Creator：ProfileTemplateService 具備範本結構的完整知識，負責建立並寫出 YAML 檔案。</w:t>
       </w:r>
     </w:p>
     <w:p>
       <w:pPr/>
       <w:r>
-        <w:t>• Low Coupling: ProfileInitCommand creates ProfileTemplateService locally, keeping the CLI independent of file-system details.</w:t>
+        <w:t>• Low Coupling：ProfileInitCommand 於本地建立 ProfileTemplateService，使 CLI 層與檔案系統細節保持獨立。</w:t>
       </w:r>
     </w:p>
     <w:p>
@@ -19480,7 +19534,7 @@
           <w:i/>
           <w:sz w:val="20"/>
         </w:rPr>
-        <w:t>Figure 3.2.2a — SD for initProfile() with GRASP labels</w:t>
+        <w:t>圖 3-2.2a SD for initProfile()（標示 GRASP 模式）</w:t>
       </w:r>
     </w:p>
     <w:p>
@@ -19489,37 +19543,37 @@
     <w:p>
       <w:pPr/>
       <w:r>
-        <w:t>System Event 2: validateProfile(yamlPath)</w:t>
+        <w:t>系統事件 2：validateProfile(yamlPath)</w:t>
       </w:r>
     </w:p>
     <w:p>
       <w:pPr/>
       <w:r>
-        <w:t>GRASP patterns applied:</w:t>
+        <w:t>GRASP 模式應用：</w:t>
       </w:r>
     </w:p>
     <w:p>
       <w:pPr/>
       <w:r>
-        <w:t>• Controller: ProfileValidateCommand handles the validateProfile event.</w:t>
+        <w:t>• Controller：ProfileValidateCommand 處理 validateProfile 系統事件。</w:t>
       </w:r>
     </w:p>
     <w:p>
       <w:pPr/>
       <w:r>
-        <w:t>• Information Expert: ProfileValidateService knows validation orchestration; YamlProfileLoader is the expert on YAML parsing and StyleProfile creation.</w:t>
+        <w:t>• Information Expert：ProfileValidateService 掌握驗證的業務邏輯；YamlProfileLoader 為解析 YAML 與建立 StyleProfile 的資訊專家。</w:t>
       </w:r>
     </w:p>
     <w:p>
       <w:pPr/>
       <w:r>
-        <w:t>• Creator: YamlProfileLoader creates StyleProfile and ComplianceRule objects since it holds the parsed YAML data.</w:t>
+        <w:t>• Creator：YamlProfileLoader 持有已解析的 YAML 資料，因此負責建立 StyleProfile與 ComplianceRule 物件。</w:t>
       </w:r>
     </w:p>
     <w:p>
       <w:pPr/>
       <w:r>
-        <w:t>• Low Coupling: ProfileValidateService depends on the ProfileLoader interface, not on YamlProfileLoader directly, enabling easy substitution.</w:t>
+        <w:t>• Low Coupling：ProfileValidateService 依賴 ProfileLoader 介面，而非直接依賴 YamlProfileLoader，便於替換實作。</w:t>
       </w:r>
     </w:p>
     <w:p>
@@ -19570,7 +19624,7 @@
           <w:i/>
           <w:sz w:val="20"/>
         </w:rPr>
-        <w:t>Figure 3.2.2b — SD for validateProfile() with GRASP labels</w:t>
+        <w:t>圖 3-2.2b SD for validateProfile()（標示 GRASP 模式）</w:t>
       </w:r>
     </w:p>
     <w:p>
@@ -19578,13 +19632,13 @@
         <w:pStyle w:val="2"/>
       </w:pPr>
       <w:r>
-        <w:t>3.3 Design Class Model [new]</w:t>
+        <w:t>3.3 Design Class Model</w:t>
       </w:r>
     </w:p>
     <w:p>
       <w:pPr/>
       <w:r>
-        <w:t>The Design Class Diagram (DCD) below shows all classes, attributes, and key methods of the system after Iteration II. Classes marked [new] are new additions; those marked [mod] have been modified. The four ComplianceRule subclasses now include suggestion messages on each Violation they produce, supporting UC-03's interactive display.</w:t>
+        <w:t>下圖為 Iteration II 之 Design Class Diagram（DCD），涵蓋系統所有類別、屬性與主要方法。標示 [new] 者為新增類別，標示 [mod] 者為已修改之類別。四個 ComplianceRule 子類別（NamingRule、DependencyRule、SupertypeRule、PackageRule）在其產生的每個 Violation 上加入 suggestion 訊息，以支援 UC-03 的互動式修復顯示。</w:t>
       </w:r>
     </w:p>
     <w:p>
@@ -19635,7 +19689,7 @@
           <w:i/>
           <w:sz w:val="20"/>
         </w:rPr>
-        <w:t>Figure 3.3 — Design Class Diagram (Iteration II)</w:t>
+        <w:t>圖 3-3 Design Class Diagram（Iteration II）</w:t>
       </w:r>
     </w:p>
     <w:p>
@@ -19643,7 +19697,13 @@
         <w:pStyle w:val="1"/>
       </w:pPr>
       <w:r>
-        <w:t>4. Implementation Class Model [new]</w:t>
+        <w:t>4. Implementation Class Model</w:t>
+      </w:r>
+    </w:p>
+    <w:p>
+      <w:pPr/>
+      <w:r>
+        <w:t>本章節依實作完成之 Java 程式碼繪製 Implementation Class Diagram（4.1），與 §3.3 之 Design Class Model 進行差異比較（4.2），最後以 Lines of Code 量化實作規模（4.3）。</w:t>
       </w:r>
     </w:p>
     <w:p>
@@ -19651,13 +19711,13 @@
         <w:pStyle w:val="2"/>
       </w:pPr>
       <w:r>
-        <w:t>4.1 Implementation Class Diagram [new]</w:t>
+        <w:t>4.1 Implementation Class Diagram</w:t>
       </w:r>
     </w:p>
     <w:p>
       <w:pPr/>
       <w:r>
-        <w:t>The Implementation Class Diagram (ICD) reflects the actual compiled structure of the system. Because we followed the DCD closely, the ICD is structurally identical to Figure 3.3. The key additions compared to Iteration I are the seven new classes (FixCommand, ProfileCommand, ProfileInitCommand, ProfileValidateCommand, InteractiveFixer, ProfileTemplateService, ProfileValidateService) and the suggestion field on Violation.</w:t>
+        <w:t>下圖為 arch-checker 之 Implementation Class Diagram（ICD），反映系統實際編譯後的結構。由於實作緊跟 DCD，ICD 在結構上與圖 3-3 相同。與 Iteration I 相比，主要新增為七個新類別（FixCommand、ProfileCommand、ProfileInitCommand、ProfileValidateCommand、InteractiveFixer、ProfileTemplateService、ProfileValidateService）以及 Violation 上的 suggestion 欄位。</w:t>
       </w:r>
     </w:p>
     <w:p>
@@ -19708,7 +19768,7 @@
           <w:i/>
           <w:sz w:val="20"/>
         </w:rPr>
-        <w:t>Figure 4.1 — Implementation Class Diagram (same structure as DCD; Iteration II additions highlighted in green)</w:t>
+        <w:t>圖 4-1 Implementation Class Diagram（與 DCD 結構相同；Iteration II 新增以綠色標示）</w:t>
       </w:r>
     </w:p>
     <w:p>
@@ -19716,13 +19776,21 @@
         <w:pStyle w:val="2"/>
       </w:pPr>
       <w:r>
-        <w:t>4.2 Comparison: Design vs Implementation [new]</w:t>
+        <w:t>4.2 Differences between Design and Implementation Class Model</w:t>
+      </w:r>
+    </w:p>
+    <w:p>
+      <w:pPr>
+        <w:pStyle w:val="3"/>
+      </w:pPr>
+      <w:r>
+        <w:t>Table 4.2.1: Comparison of Design and Implementation (Iteration II changes)</w:t>
       </w:r>
     </w:p>
     <w:p>
       <w:pPr/>
       <w:r>
-        <w:t>Table 4.2.1 lists all classes and selected methods that were added or changed in Iteration II, comparing the DCD (Design) with the actual code (Implementation). 'Yes' means the class/method exists in that artifact.</w:t>
+        <w:t>下表逐一列出 Iteration II 新增或修改的所有類別與選定方法，比較 DCD（設計）與實際程式碼（實作）之差異。「Yes」表示該類別／方法存在於該成品中。</w:t>
       </w:r>
     </w:p>
     <w:tbl>
@@ -19754,7 +19822,7 @@
                 <w:b/>
                 <w:sz w:val="20"/>
               </w:rPr>
-              <w:t>Class</w:t>
+              <w:t>類別</w:t>
             </w:r>
           </w:p>
         </w:tc>
@@ -19775,7 +19843,7 @@
                 <w:b/>
                 <w:sz w:val="20"/>
               </w:rPr>
-              <w:t>Method / Attribute</w:t>
+              <w:t>方法 / 屬性</w:t>
             </w:r>
           </w:p>
         </w:tc>
@@ -19796,7 +19864,7 @@
                 <w:b/>
                 <w:sz w:val="20"/>
               </w:rPr>
-              <w:t>Design</w:t>
+              <w:t>設計</w:t>
             </w:r>
           </w:p>
         </w:tc>
@@ -19817,7 +19885,7 @@
                 <w:b/>
                 <w:sz w:val="20"/>
               </w:rPr>
-              <w:t>Imp.</w:t>
+              <w:t>實作</w:t>
             </w:r>
           </w:p>
         </w:tc>
@@ -20715,7 +20783,7 @@
               <w:rPr>
                 <w:sz w:val="20"/>
               </w:rPr>
-              <w:t>suggestion: String [0..1]  (new attribute)</w:t>
+              <w:t>suggestion: String [0..1]（新增屬性）</w:t>
             </w:r>
           </w:p>
         </w:tc>
@@ -20793,7 +20861,7 @@
               <w:rPr>
                 <w:sz w:val="20"/>
               </w:rPr>
-              <w:t>getSuggestion(): String  (new method)</w:t>
+              <w:t>getSuggestion(): String（新增方法）</w:t>
             </w:r>
           </w:p>
         </w:tc>
@@ -20871,7 +20939,7 @@
               <w:rPr>
                 <w:sz w:val="20"/>
               </w:rPr>
-              <w:t>hasSuggestion(): boolean  (new method)</w:t>
+              <w:t>hasSuggestion(): boolean（新增方法）</w:t>
             </w:r>
           </w:p>
         </w:tc>
@@ -20949,7 +21017,7 @@
               <w:rPr>
                 <w:sz w:val="20"/>
               </w:rPr>
-              <w:t>validate(): now sets suggestion on Violation</w:t>
+              <w:t>validate()：現於 Violation 上設定 suggestion</w:t>
             </w:r>
           </w:p>
         </w:tc>
@@ -21027,7 +21095,7 @@
               <w:rPr>
                 <w:sz w:val="20"/>
               </w:rPr>
-              <w:t>validate(): now sets suggestion on Violation</w:t>
+              <w:t>validate()：現於 Violation 上設定 suggestion</w:t>
             </w:r>
           </w:p>
         </w:tc>
@@ -21105,7 +21173,7 @@
               <w:rPr>
                 <w:sz w:val="20"/>
               </w:rPr>
-              <w:t>validate(): now sets suggestion on Violation</w:t>
+              <w:t>validate()：現於 Violation 上設定 suggestion</w:t>
             </w:r>
           </w:p>
         </w:tc>
@@ -21183,7 +21251,7 @@
               <w:rPr>
                 <w:sz w:val="20"/>
               </w:rPr>
-              <w:t>validate(): now sets suggestion on Violation</w:t>
+              <w:t>validate()：現於 Violation 上設定 suggestion</w:t>
             </w:r>
           </w:p>
         </w:tc>
@@ -21261,7 +21329,7 @@
               <w:rPr>
                 <w:sz w:val="20"/>
               </w:rPr>
-              <w:t>subcommands: added ProfileCommand, FixCommand</w:t>
+              <w:t>subcommands：新增 ProfileCommand、FixCommand</w:t>
             </w:r>
           </w:p>
         </w:tc>
@@ -21306,24 +21374,20 @@
       </w:tr>
     </w:tbl>
     <w:p>
-      <w:pPr>
-        <w:jc w:val="center"/>
-      </w:pPr>
-      <w:r>
-        <w:rPr>
-          <w:i/>
-          <w:sz w:val="20"/>
-        </w:rPr>
-        <w:t>Table 4.2.1 — Comparison of Design vs Implementation (Iteration II changes)</w:t>
-      </w:r>
-    </w:p>
-    <w:p>
       <w:pPr/>
     </w:p>
     <w:p>
+      <w:pPr>
+        <w:pStyle w:val="3"/>
+      </w:pPr>
+      <w:r>
+        <w:t>Table 4.2.2: Summary of Implementation Class/Method Changes</w:t>
+      </w:r>
+    </w:p>
+    <w:p>
       <w:pPr/>
       <w:r>
-        <w:t>Table 4.2.2 summarises the overall count of changes.</w:t>
+        <w:t>下表統計 Iteration II 整體之類別與方法變動數量。</w:t>
       </w:r>
     </w:p>
     <w:tbl>
@@ -21375,7 +21439,7 @@
                 <w:b/>
                 <w:sz w:val="20"/>
               </w:rPr>
-              <w:t>Added</w:t>
+              <w:t>新增</w:t>
             </w:r>
           </w:p>
         </w:tc>
@@ -21396,7 +21460,7 @@
                 <w:b/>
                 <w:sz w:val="20"/>
               </w:rPr>
-              <w:t>Removed</w:t>
+              <w:t>移除</w:t>
             </w:r>
           </w:p>
         </w:tc>
@@ -21417,7 +21481,7 @@
                 <w:b/>
                 <w:sz w:val="20"/>
               </w:rPr>
-              <w:t>Modified (signature change)</w:t>
+              <w:t>修改（簽章變更）</w:t>
             </w:r>
           </w:p>
         </w:tc>
@@ -21438,7 +21502,7 @@
               <w:rPr>
                 <w:sz w:val="20"/>
               </w:rPr>
-              <w:t>Class</w:t>
+              <w:t>類別</w:t>
             </w:r>
           </w:p>
         </w:tc>
@@ -21495,7 +21559,7 @@
               <w:rPr>
                 <w:sz w:val="20"/>
               </w:rPr>
-              <w:t>6 (Main, Violation, NamingRule, DependencyRule, SupertypeRule, PackageRule)</w:t>
+              <w:t>6（Main、Violation、NamingRule、DependencyRule、SupertypeRule、PackageRule）</w:t>
             </w:r>
           </w:p>
         </w:tc>
@@ -21516,7 +21580,7 @@
               <w:rPr>
                 <w:sz w:val="20"/>
               </w:rPr>
-              <w:t>Method / Attribute</w:t>
+              <w:t>方法 / 屬性</w:t>
             </w:r>
           </w:p>
         </w:tc>
@@ -21581,28 +21645,24 @@
     </w:tbl>
     <w:p>
       <w:pPr>
-        <w:jc w:val="center"/>
-      </w:pPr>
-      <w:r>
-        <w:rPr>
-          <w:i/>
-          <w:sz w:val="20"/>
-        </w:rPr>
-        <w:t>Table 4.2.2 — Summary of Implementation Class/Method Changes</w:t>
-      </w:r>
-    </w:p>
-    <w:p>
-      <w:pPr>
         <w:pStyle w:val="2"/>
       </w:pPr>
       <w:r>
-        <w:t>4.3 Line of Code [new]</w:t>
+        <w:t>4.3 Calculate Line of Code</w:t>
+      </w:r>
+    </w:p>
+    <w:p>
+      <w:pPr>
+        <w:pStyle w:val="3"/>
+      </w:pPr>
+      <w:r>
+        <w:t>Table 4.3.1: Line of Code of Classes</w:t>
       </w:r>
     </w:p>
     <w:p>
       <w:pPr/>
       <w:r>
-        <w:t>The following table counts non-blank, non-comment lines of code for each production class (without test code). Classes new in Iteration II are marked [new]; modified ones are marked [mod].</w:t>
+        <w:t>LOC 採「排除空行與單行 // 註解、整段 /* … */ 區塊」之計算方式；method 數含 public、private、protected 之具體方法（不計 abstract 宣告與建構子，但計入介面方法）。Iteration II 新增之類別標示 [new]，修改之類別標示 [mod]。</w:t>
       </w:r>
     </w:p>
     <w:tbl>
@@ -21655,7 +21715,7 @@
                 <w:b/>
                 <w:sz w:val="20"/>
               </w:rPr>
-              <w:t>Class Name</w:t>
+              <w:t>類別名稱</w:t>
             </w:r>
           </w:p>
         </w:tc>
@@ -21676,7 +21736,7 @@
                 <w:b/>
                 <w:sz w:val="20"/>
               </w:rPr>
-              <w:t># Methods</w:t>
+              <w:t>方法數</w:t>
             </w:r>
           </w:p>
         </w:tc>
@@ -21697,7 +21757,7 @@
                 <w:b/>
                 <w:sz w:val="20"/>
               </w:rPr>
-              <w:t>LOC (excl. comments/blanks)</w:t>
+              <w:t>LOC（不含註解／空行）</w:t>
             </w:r>
           </w:p>
         </w:tc>
@@ -24310,7 +24370,7 @@
               <w:rPr>
                 <w:sz w:val="20"/>
               </w:rPr>
-              <w:t>Sum</w:t>
+              <w:t>合計</w:t>
             </w:r>
           </w:p>
         </w:tc>
@@ -24356,22 +24416,16 @@
     </w:tbl>
     <w:p>
       <w:pPr>
-        <w:jc w:val="center"/>
-      </w:pPr>
-      <w:r>
-        <w:rPr>
-          <w:i/>
-          <w:sz w:val="20"/>
-        </w:rPr>
-        <w:t>Table 4.3 — Line of Code per Production Class</w:t>
-      </w:r>
-    </w:p>
-    <w:p>
-      <w:pPr>
         <w:pStyle w:val="1"/>
       </w:pPr>
       <w:r>
-        <w:t>5. Programming [new]</w:t>
+        <w:t>5. Programming</w:t>
+      </w:r>
+    </w:p>
+    <w:p>
+      <w:pPr/>
+      <w:r>
+        <w:t>本章節依需求 5.1 提供系統執行畫面截圖，並於 5.2 節錄 Iteration II 最具代表性之原始碼。</w:t>
       </w:r>
     </w:p>
     <w:p>
@@ -24379,13 +24433,13 @@
         <w:pStyle w:val="2"/>
       </w:pPr>
       <w:r>
-        <w:t>5.1 Snapshots of System Execution [new]</w:t>
+        <w:t>5.1 Snapshots of System Execution</w:t>
       </w:r>
     </w:p>
     <w:p>
       <w:pPr/>
       <w:r>
-        <w:t>UC-02: profile init and validate</w:t>
+        <w:t>UC-02 profile init 與 validate 執行畫面：</w:t>
       </w:r>
     </w:p>
     <w:p>
@@ -24501,7 +24555,7 @@
     <w:p>
       <w:pPr/>
       <w:r>
-        <w:t>UC-01: check compliance (running tool on its own source with the generated template — expected violations because the template uses a strict NamingRule requiring all classes to end with 'Service'):</w:t>
+        <w:t>UC-01 架構合規檢查執行畫面（使用產生的 profile 範本對自身原始碼進行檢查；因範本的 NamingRule 要求所有類別以 'Service' 結尾，故預期出現多筆違規）：</w:t>
       </w:r>
     </w:p>
     <w:p>
@@ -24561,7 +24615,7 @@
           <w:rFonts w:ascii="Courier New" w:hAnsi="Courier New"/>
           <w:sz w:val="16"/>
         </w:rPr>
-        <w:t>... (36 violations total)</w:t>
+        <w:t>... (共 36 筆違規)</w:t>
       </w:r>
     </w:p>
     <w:p>
@@ -24593,13 +24647,13 @@
         <w:pStyle w:val="2"/>
       </w:pPr>
       <w:r>
-        <w:t>5.2 Source Code Listing [new]</w:t>
+        <w:t>5.2 Source Code Listing</w:t>
       </w:r>
     </w:p>
     <w:p>
       <w:pPr/>
       <w:r>
-        <w:t>The following listings show the most important source files for Iteration II (new / modified). For the full source, see the project repository.</w:t>
+        <w:t>下列依序列出 Iteration II 最重要的原始碼（新增或修改之類別）。完整原始碼請參見專案儲存庫。</w:t>
       </w:r>
     </w:p>
     <w:p>
@@ -24608,7 +24662,7 @@
         <w:rPr>
           <w:b/>
         </w:rPr>
-        <w:t>— Violation.java [mod] — suggestion field added</w:t>
+        <w:t>— Violation.java [mod]（新增 suggestion 欄位）</w:t>
       </w:r>
     </w:p>
     <w:p>
@@ -28918,7 +28972,7 @@
         <w:pStyle w:val="1"/>
       </w:pPr>
       <w:r>
-        <w:t>6. Unit Testing [new]</w:t>
+        <w:t>6. Unit Testing</w:t>
       </w:r>
     </w:p>
     <w:p>
@@ -28926,7 +28980,13 @@
         <w:pStyle w:val="2"/>
       </w:pPr>
       <w:r>
-        <w:t>6.1 Snapshots of Testing Result [new]</w:t>
+        <w:t>6.1 Snapshots of Testing Result</w:t>
+      </w:r>
+    </w:p>
+    <w:p>
+      <w:pPr/>
+      <w:r>
+        <w:t>以下為 mvn test 執行結果截圖，共 28 個 JUnit 5 測試全數通過：</w:t>
       </w:r>
     </w:p>
     <w:p>
@@ -28962,7 +29022,7 @@
           <w:rFonts w:ascii="Courier New" w:hAnsi="Courier New"/>
           <w:sz w:val="16"/>
         </w:rPr>
-        <w:t>[INFO] Tests run: 3, Failures: 0, Errors: 0, Skipped: 0  ✓</w:t>
+        <w:t>[INFO] Tests run: 3, Failures: 0, Errors: 0, Skipped: 0  OK</w:t>
       </w:r>
     </w:p>
     <w:p>
@@ -28986,7 +29046,7 @@
           <w:rFonts w:ascii="Courier New" w:hAnsi="Courier New"/>
           <w:sz w:val="16"/>
         </w:rPr>
-        <w:t>[INFO] Tests run: 4, Failures: 0, Errors: 0, Skipped: 0  ✓</w:t>
+        <w:t>[INFO] Tests run: 4, Failures: 0, Errors: 0, Skipped: 0  OK</w:t>
       </w:r>
     </w:p>
     <w:p>
@@ -29010,7 +29070,7 @@
           <w:rFonts w:ascii="Courier New" w:hAnsi="Courier New"/>
           <w:sz w:val="16"/>
         </w:rPr>
-        <w:t>[INFO] Tests run: 3, Failures: 0, Errors: 0, Skipped: 0  ✓</w:t>
+        <w:t>[INFO] Tests run: 3, Failures: 0, Errors: 0, Skipped: 0  OK</w:t>
       </w:r>
     </w:p>
     <w:p>
@@ -29034,7 +29094,7 @@
           <w:rFonts w:ascii="Courier New" w:hAnsi="Courier New"/>
           <w:sz w:val="16"/>
         </w:rPr>
-        <w:t>[INFO] Tests run: 2, Failures: 0, Errors: 0, Skipped: 0  ✓</w:t>
+        <w:t>[INFO] Tests run: 2, Failures: 0, Errors: 0, Skipped: 0  OK</w:t>
       </w:r>
     </w:p>
     <w:p>
@@ -29058,7 +29118,7 @@
           <w:rFonts w:ascii="Courier New" w:hAnsi="Courier New"/>
           <w:sz w:val="16"/>
         </w:rPr>
-        <w:t>[INFO] Tests run: 3, Failures: 0, Errors: 0, Skipped: 0  ✓</w:t>
+        <w:t>[INFO] Tests run: 3, Failures: 0, Errors: 0, Skipped: 0  OK</w:t>
       </w:r>
     </w:p>
     <w:p>
@@ -29082,7 +29142,7 @@
           <w:rFonts w:ascii="Courier New" w:hAnsi="Courier New"/>
           <w:sz w:val="16"/>
         </w:rPr>
-        <w:t>[INFO] Tests run: 3, Failures: 0, Errors: 0, Skipped: 0  ✓</w:t>
+        <w:t>[INFO] Tests run: 3, Failures: 0, Errors: 0, Skipped: 0  OK</w:t>
       </w:r>
     </w:p>
     <w:p>
@@ -29106,7 +29166,7 @@
           <w:rFonts w:ascii="Courier New" w:hAnsi="Courier New"/>
           <w:sz w:val="16"/>
         </w:rPr>
-        <w:t>[INFO] Tests run: 2, Failures: 0, Errors: 0, Skipped: 0  ✓</w:t>
+        <w:t>[INFO] Tests run: 2, Failures: 0, Errors: 0, Skipped: 0  OK</w:t>
       </w:r>
     </w:p>
     <w:p>
@@ -29130,7 +29190,7 @@
           <w:rFonts w:ascii="Courier New" w:hAnsi="Courier New"/>
           <w:sz w:val="16"/>
         </w:rPr>
-        <w:t>[INFO] Tests run: 2, Failures: 0, Errors: 0, Skipped: 0  ✓</w:t>
+        <w:t>[INFO] Tests run: 2, Failures: 0, Errors: 0, Skipped: 0  OK</w:t>
       </w:r>
     </w:p>
     <w:p>
@@ -29154,7 +29214,7 @@
           <w:rFonts w:ascii="Courier New" w:hAnsi="Courier New"/>
           <w:sz w:val="16"/>
         </w:rPr>
-        <w:t>[INFO] Tests run: 3, Failures: 0, Errors: 0, Skipped: 0  ✓</w:t>
+        <w:t>[INFO] Tests run: 3, Failures: 0, Errors: 0, Skipped: 0  OK</w:t>
       </w:r>
     </w:p>
     <w:p>
@@ -29178,7 +29238,7 @@
           <w:rFonts w:ascii="Courier New" w:hAnsi="Courier New"/>
           <w:sz w:val="16"/>
         </w:rPr>
-        <w:t>[INFO] Tests run: 3, Failures: 0, Errors: 0, Skipped: 0  ✓</w:t>
+        <w:t>[INFO] Tests run: 3, Failures: 0, Errors: 0, Skipped: 0  OK</w:t>
       </w:r>
     </w:p>
     <w:p>
@@ -29210,13 +29270,13 @@
         <w:pStyle w:val="2"/>
       </w:pPr>
       <w:r>
-        <w:t>6.2 Unit Testing Code Listing [new]</w:t>
+        <w:t>6.2 Unit Testing Code Listing</w:t>
       </w:r>
     </w:p>
     <w:p>
       <w:pPr/>
       <w:r>
-        <w:t>The following test files cover the new Iteration II functionality:</w:t>
+        <w:t>下列測試檔案涵蓋 Iteration II 的新增功能：</w:t>
       </w:r>
     </w:p>
     <w:p>
@@ -29225,7 +29285,7 @@
         <w:rPr>
           <w:b/>
         </w:rPr>
-        <w:t>— InteractiveFixerTest.java [new] — UC-03 interactive fixer</w:t>
+        <w:t>— InteractiveFixerTest.java [new]（UC-03 互動式修復）</w:t>
       </w:r>
     </w:p>
     <w:p>
@@ -30704,7 +30764,7 @@
         <w:rPr>
           <w:b/>
         </w:rPr>
-        <w:t>— ProfileTemplateServiceTest.java [new] — UC-02 template generation</w:t>
+        <w:t>— ProfileTemplateServiceTest.java [new]（UC-02 範本產生）</w:t>
       </w:r>
     </w:p>
     <w:p>
@@ -31327,7 +31387,7 @@
         <w:rPr>
           <w:b/>
         </w:rPr>
-        <w:t>— ComplianceCheckServiceTest.java — core compliance check</w:t>
+        <w:t>— ComplianceCheckServiceTest.java（核心合規檢查）</w:t>
       </w:r>
     </w:p>
     <w:p>
@@ -32628,7 +32688,7 @@
         <w:rPr>
           <w:b/>
         </w:rPr>
-        <w:t>— NamingRuleTest.java — NamingRule with suggestion</w:t>
+        <w:t>— NamingRuleTest.java（NamingRule 含 suggestion）</w:t>
       </w:r>
     </w:p>
     <w:p>
@@ -33333,7 +33393,7 @@
         <w:rPr>
           <w:b/>
         </w:rPr>
-        <w:t>— DependencyRuleTest.java — DependencyRule with suggestion</w:t>
+        <w:t>— DependencyRuleTest.java（DependencyRule 含 suggestion）</w:t>
       </w:r>
     </w:p>
     <w:p>
@@ -36073,6 +36133,73 @@
                 <w:rFonts w:eastAsia="標楷體"/>
               </w:rPr>
               <w:t>3.5H</w:t>
+            </w:r>
+          </w:p>
+        </w:tc>
+      </w:tr>
+      <w:tr>
+        <w:tc>
+          <w:tcPr>
+            <w:tcW w:type="dxa" w:w="1800"/>
+          </w:tcPr>
+          <w:p>
+            <w:r>
+              <w:rPr>
+                <w:sz w:val="20"/>
+              </w:rPr>
+              <w:t>113598009</w:t>
+            </w:r>
+          </w:p>
+        </w:tc>
+        <w:tc>
+          <w:tcPr>
+            <w:tcW w:type="dxa" w:w="1500"/>
+          </w:tcPr>
+          <w:p>
+            <w:r>
+              <w:rPr>
+                <w:sz w:val="20"/>
+              </w:rPr>
+              <w:t>FrankLi</w:t>
+            </w:r>
+          </w:p>
+        </w:tc>
+        <w:tc>
+          <w:tcPr>
+            <w:tcW w:type="dxa" w:w="1200"/>
+          </w:tcPr>
+          <w:p>
+            <w:r>
+              <w:rPr>
+                <w:sz w:val="20"/>
+              </w:rPr>
+              <w:t>HW#7</w:t>
+            </w:r>
+          </w:p>
+        </w:tc>
+        <w:tc>
+          <w:tcPr>
+            <w:tcW w:type="dxa" w:w="2526"/>
+          </w:tcPr>
+          <w:p>
+            <w:r>
+              <w:rPr>
+                <w:sz w:val="20"/>
+              </w:rPr>
+              <w:t>115/06/14  20:00 ~ 23:59</w:t>
+            </w:r>
+          </w:p>
+        </w:tc>
+        <w:tc>
+          <w:tcPr>
+            <w:tcW w:type="dxa" w:w="2000"/>
+          </w:tcPr>
+          <w:p>
+            <w:r>
+              <w:rPr>
+                <w:sz w:val="20"/>
+              </w:rPr>
+              <w:t>4H</w:t>
             </w:r>
           </w:p>
         </w:tc>

</xml_diff>

<commit_message>
[Documentation] Add Iteration II draw.io diagrams and rebuild HW7 docx with updated PNGs
</commit_message>
<xml_diff>
--- a/hw/hw7/113598009_7.docx
+++ b/hw/hw7/113598009_7.docx
@@ -2939,6 +2939,60 @@
                 <w:sz w:val="20"/>
               </w:rPr>
               <w:t>Iteration II implementation: UC-02 (Define Style Profile) and UC-03 (Check with Interactive Fix Suggestions). Add Design, Implementation Class Model, Programming, and Unit Testing sections. 7 new classes, 6 modified classes, 28 JUnit 5 tests all pass.</w:t>
+            </w:r>
+          </w:p>
+        </w:tc>
+      </w:tr>
+      <w:tr>
+        <w:tc>
+          <w:tcPr>
+            <w:tcW w:type="dxa" w:w="1040"/>
+          </w:tcPr>
+          <w:p>
+            <w:r>
+              <w:rPr>
+                <w:sz w:val="20"/>
+              </w:rPr>
+              <w:t>9.0</w:t>
+            </w:r>
+          </w:p>
+        </w:tc>
+        <w:tc>
+          <w:tcPr>
+            <w:tcW w:type="dxa" w:w="1494"/>
+          </w:tcPr>
+          <w:p>
+            <w:r>
+              <w:rPr>
+                <w:sz w:val="20"/>
+              </w:rPr>
+              <w:t>2026-06-14</w:t>
+            </w:r>
+          </w:p>
+        </w:tc>
+        <w:tc>
+          <w:tcPr>
+            <w:tcW w:type="dxa" w:w="1495"/>
+          </w:tcPr>
+          <w:p>
+            <w:r>
+              <w:rPr>
+                <w:sz w:val="20"/>
+              </w:rPr>
+              <w:t>FrankLi</w:t>
+            </w:r>
+          </w:p>
+        </w:tc>
+        <w:tc>
+          <w:tcPr>
+            <w:tcW w:type="dxa" w:w="4997"/>
+          </w:tcPr>
+          <w:p>
+            <w:r>
+              <w:rPr>
+                <w:sz w:val="20"/>
+              </w:rPr>
+              <w:t>Iteration II 實作：UC-02（Define Style Profile）與 UC-03（Check with Interactive Fix Suggestions）。新增 Design、Implementation Class Model、Programming、Unit Testing 章節。7 個新類別、6 個修改類別，28 個 JUnit 5 測試全部通過。</w:t>
             </w:r>
           </w:p>
         </w:tc>
@@ -19331,7 +19385,7 @@
       <w:r>
         <w:drawing>
           <wp:inline xmlns:a="http://schemas.openxmlformats.org/drawingml/2006/main" xmlns:pic="http://schemas.openxmlformats.org/drawingml/2006/picture">
-            <wp:extent cx="5486400" cy="6504156"/>
+            <wp:extent cx="5486400" cy="8326741"/>
             <wp:docPr id="1473456421" name="Picture 1473456421"/>
             <wp:cNvGraphicFramePr>
               <a:graphicFrameLocks noChangeAspect="1"/>
@@ -19340,11 +19394,11 @@
               <a:graphicData uri="http://schemas.openxmlformats.org/drawingml/2006/picture">
                 <pic:pic>
                   <pic:nvPicPr>
-                    <pic:cNvPr id="0" name="image.png"/>
+                    <pic:cNvPr id="0" name="logical_arch.png"/>
                     <pic:cNvPicPr/>
                   </pic:nvPicPr>
                   <pic:blipFill>
-                    <a:blip r:embed="rId11"/>
+                    <a:blip r:embed="rId16"/>
                     <a:stretch>
                       <a:fillRect/>
                     </a:stretch>
@@ -19352,7 +19406,7 @@
                   <pic:spPr>
                     <a:xfrm>
                       <a:off x="0" y="0"/>
-                      <a:ext cx="5486400" cy="6504156"/>
+                      <a:ext cx="5486400" cy="8326741"/>
                     </a:xfrm>
                     <a:prstGeom prst="rect"/>
                   </pic:spPr>
@@ -19404,7 +19458,7 @@
       <w:r>
         <w:drawing>
           <wp:inline xmlns:a="http://schemas.openxmlformats.org/drawingml/2006/main" xmlns:pic="http://schemas.openxmlformats.org/drawingml/2006/picture">
-            <wp:extent cx="5486400" cy="4578970"/>
+            <wp:extent cx="5486400" cy="4027413"/>
             <wp:docPr id="1473456421" name="Picture 1473456421"/>
             <wp:cNvGraphicFramePr>
               <a:graphicFrameLocks noChangeAspect="1"/>
@@ -19413,11 +19467,11 @@
               <a:graphicData uri="http://schemas.openxmlformats.org/drawingml/2006/picture">
                 <pic:pic>
                   <pic:nvPicPr>
-                    <pic:cNvPr id="0" name="image.png"/>
+                    <pic:cNvPr id="0" name="uc02_ssd.png"/>
                     <pic:cNvPicPr/>
                   </pic:nvPicPr>
                   <pic:blipFill>
-                    <a:blip r:embed="rId12"/>
+                    <a:blip r:embed="rId17"/>
                     <a:stretch>
                       <a:fillRect/>
                     </a:stretch>
@@ -19425,7 +19479,7 @@
                   <pic:spPr>
                     <a:xfrm>
                       <a:off x="0" y="0"/>
-                      <a:ext cx="5486400" cy="4578970"/>
+                      <a:ext cx="5486400" cy="4027413"/>
                     </a:xfrm>
                     <a:prstGeom prst="rect"/>
                   </pic:spPr>
@@ -19493,7 +19547,7 @@
       <w:r>
         <w:drawing>
           <wp:inline xmlns:a="http://schemas.openxmlformats.org/drawingml/2006/main" xmlns:pic="http://schemas.openxmlformats.org/drawingml/2006/picture">
-            <wp:extent cx="5669280" cy="3576007"/>
+            <wp:extent cx="5669280" cy="3061732"/>
             <wp:docPr id="1473456421" name="Picture 1473456421"/>
             <wp:cNvGraphicFramePr>
               <a:graphicFrameLocks noChangeAspect="1"/>
@@ -19502,11 +19556,11 @@
               <a:graphicData uri="http://schemas.openxmlformats.org/drawingml/2006/picture">
                 <pic:pic>
                   <pic:nvPicPr>
-                    <pic:cNvPr id="0" name="image.png"/>
+                    <pic:cNvPr id="0" name="uc02_sd_init.png"/>
                     <pic:cNvPicPr/>
                   </pic:nvPicPr>
                   <pic:blipFill>
-                    <a:blip r:embed="rId13"/>
+                    <a:blip r:embed="rId18"/>
                     <a:stretch>
                       <a:fillRect/>
                     </a:stretch>
@@ -19514,7 +19568,7 @@
                   <pic:spPr>
                     <a:xfrm>
                       <a:off x="0" y="0"/>
-                      <a:ext cx="5669280" cy="3576007"/>
+                      <a:ext cx="5669280" cy="3061732"/>
                     </a:xfrm>
                     <a:prstGeom prst="rect"/>
                   </pic:spPr>
@@ -19583,7 +19637,7 @@
       <w:r>
         <w:drawing>
           <wp:inline xmlns:a="http://schemas.openxmlformats.org/drawingml/2006/main" xmlns:pic="http://schemas.openxmlformats.org/drawingml/2006/picture">
-            <wp:extent cx="5669280" cy="3342736"/>
+            <wp:extent cx="5669280" cy="2755962"/>
             <wp:docPr id="1473456421" name="Picture 1473456421"/>
             <wp:cNvGraphicFramePr>
               <a:graphicFrameLocks noChangeAspect="1"/>
@@ -19592,11 +19646,11 @@
               <a:graphicData uri="http://schemas.openxmlformats.org/drawingml/2006/picture">
                 <pic:pic>
                   <pic:nvPicPr>
-                    <pic:cNvPr id="0" name="image.png"/>
+                    <pic:cNvPr id="0" name="uc02_sd_validate.png"/>
                     <pic:cNvPicPr/>
                   </pic:nvPicPr>
                   <pic:blipFill>
-                    <a:blip r:embed="rId14"/>
+                    <a:blip r:embed="rId19"/>
                     <a:stretch>
                       <a:fillRect/>
                     </a:stretch>
@@ -19604,7 +19658,7 @@
                   <pic:spPr>
                     <a:xfrm>
                       <a:off x="0" y="0"/>
-                      <a:ext cx="5669280" cy="3342736"/>
+                      <a:ext cx="5669280" cy="2755962"/>
                     </a:xfrm>
                     <a:prstGeom prst="rect"/>
                   </pic:spPr>
@@ -19648,7 +19702,7 @@
       <w:r>
         <w:drawing>
           <wp:inline xmlns:a="http://schemas.openxmlformats.org/drawingml/2006/main" xmlns:pic="http://schemas.openxmlformats.org/drawingml/2006/picture">
-            <wp:extent cx="5760720" cy="4221799"/>
+            <wp:extent cx="5760720" cy="5470973"/>
             <wp:docPr id="1473456421" name="Picture 1473456421"/>
             <wp:cNvGraphicFramePr>
               <a:graphicFrameLocks noChangeAspect="1"/>
@@ -19657,11 +19711,11 @@
               <a:graphicData uri="http://schemas.openxmlformats.org/drawingml/2006/picture">
                 <pic:pic>
                   <pic:nvPicPr>
-                    <pic:cNvPr id="0" name="image.png"/>
+                    <pic:cNvPr id="0" name="dcd.png"/>
                     <pic:cNvPicPr/>
                   </pic:nvPicPr>
                   <pic:blipFill>
-                    <a:blip r:embed="rId15"/>
+                    <a:blip r:embed="rId20"/>
                     <a:stretch>
                       <a:fillRect/>
                     </a:stretch>
@@ -19669,7 +19723,7 @@
                   <pic:spPr>
                     <a:xfrm>
                       <a:off x="0" y="0"/>
-                      <a:ext cx="5760720" cy="4221799"/>
+                      <a:ext cx="5760720" cy="5470973"/>
                     </a:xfrm>
                     <a:prstGeom prst="rect"/>
                   </pic:spPr>
@@ -19727,7 +19781,7 @@
       <w:r>
         <w:drawing>
           <wp:inline xmlns:a="http://schemas.openxmlformats.org/drawingml/2006/main" xmlns:pic="http://schemas.openxmlformats.org/drawingml/2006/picture">
-            <wp:extent cx="5760720" cy="4221799"/>
+            <wp:extent cx="5760720" cy="5470973"/>
             <wp:docPr id="1473456421" name="Picture 1473456421"/>
             <wp:cNvGraphicFramePr>
               <a:graphicFrameLocks noChangeAspect="1"/>
@@ -19736,11 +19790,11 @@
               <a:graphicData uri="http://schemas.openxmlformats.org/drawingml/2006/picture">
                 <pic:pic>
                   <pic:nvPicPr>
-                    <pic:cNvPr id="0" name="image.png"/>
+                    <pic:cNvPr id="0" name="dcd.png"/>
                     <pic:cNvPicPr/>
                   </pic:nvPicPr>
                   <pic:blipFill>
-                    <a:blip r:embed="rId15"/>
+                    <a:blip r:embed="rId20"/>
                     <a:stretch>
                       <a:fillRect/>
                     </a:stretch>
@@ -19748,7 +19802,7 @@
                   <pic:spPr>
                     <a:xfrm>
                       <a:off x="0" y="0"/>
-                      <a:ext cx="5760720" cy="4221799"/>
+                      <a:ext cx="5760720" cy="5470973"/>
                     </a:xfrm>
                     <a:prstGeom prst="rect"/>
                   </pic:spPr>
@@ -36133,6 +36187,73 @@
                 <w:rFonts w:eastAsia="標楷體"/>
               </w:rPr>
               <w:t>3.5H</w:t>
+            </w:r>
+          </w:p>
+        </w:tc>
+      </w:tr>
+      <w:tr>
+        <w:tc>
+          <w:tcPr>
+            <w:tcW w:type="dxa" w:w="1800"/>
+          </w:tcPr>
+          <w:p>
+            <w:r>
+              <w:rPr>
+                <w:sz w:val="20"/>
+              </w:rPr>
+              <w:t>113598009</w:t>
+            </w:r>
+          </w:p>
+        </w:tc>
+        <w:tc>
+          <w:tcPr>
+            <w:tcW w:type="dxa" w:w="1500"/>
+          </w:tcPr>
+          <w:p>
+            <w:r>
+              <w:rPr>
+                <w:sz w:val="20"/>
+              </w:rPr>
+              <w:t>FrankLi</w:t>
+            </w:r>
+          </w:p>
+        </w:tc>
+        <w:tc>
+          <w:tcPr>
+            <w:tcW w:type="dxa" w:w="1200"/>
+          </w:tcPr>
+          <w:p>
+            <w:r>
+              <w:rPr>
+                <w:sz w:val="20"/>
+              </w:rPr>
+              <w:t>HW#7</w:t>
+            </w:r>
+          </w:p>
+        </w:tc>
+        <w:tc>
+          <w:tcPr>
+            <w:tcW w:type="dxa" w:w="2526"/>
+          </w:tcPr>
+          <w:p>
+            <w:r>
+              <w:rPr>
+                <w:sz w:val="20"/>
+              </w:rPr>
+              <w:t>115/06/14  20:00 ~ 23:59</w:t>
+            </w:r>
+          </w:p>
+        </w:tc>
+        <w:tc>
+          <w:tcPr>
+            <w:tcW w:type="dxa" w:w="2000"/>
+          </w:tcPr>
+          <w:p>
+            <w:r>
+              <w:rPr>
+                <w:sz w:val="20"/>
+              </w:rPr>
+              <w:t>4H</w:t>
             </w:r>
           </w:p>
         </w:tc>

</xml_diff>

<commit_message>
[Documentation] Replace GRASP bullet lists with tables in hw7 sections 3.2.2 and 3.2.4
Convert three GRASP pattern descriptions from bullet-point paragraphs to
3-column tables (GRASP 模式 | 套用類別 | 說明) for clearer presentation:
- 3.2.2 initProfile(): Controller / Information Expert+Creator / Low Coupling
- 3.2.2 validateProfile(): Controller / Information Expert / Creator / Low Coupling
- 3.2.4 fix(): Controller / Information Expert / Low Coupling
</commit_message>
<xml_diff>
--- a/hw/hw7/113598009_7.docx
+++ b/hw/hw7/113598009_7.docx
@@ -13646,26 +13646,165 @@
         <w:t>系統事件 1：initProfile(outputPath)</w:t>
       </w:r>
     </w:p>
-    <w:p>
-      <w:r>
-        <w:t>GRASP 模式應用：</w:t>
-      </w:r>
-    </w:p>
-    <w:p>
-      <w:r>
-        <w:t>• Controller：ProfileInitCommand 作為 use-case controller 處理 initProfile 系統事件（一個 use case 對應一個 controller）。</w:t>
-      </w:r>
-    </w:p>
-    <w:p>
-      <w:r>
-        <w:t>• Information Expert + Creator：ProfileTemplateService 具備範本結構的完整知識，負責建立並寫出 YAML 檔案。</w:t>
-      </w:r>
-    </w:p>
-    <w:p>
-      <w:r>
-        <w:t>• Low Coupling：ProfileInitCommand 於本地建立 ProfileTemplateService，使 CLI 層與檔案系統細節保持獨立。</w:t>
-      </w:r>
-    </w:p>
+    <w:tbl>
+      <w:tblPr>
+        <w:tblW w:w="9026" w:type="dxa"/>
+        <w:tblBorders>
+          <w:top w:val="single" w:sz="4" w:space="0" w:color="AAAAAA"/>
+          <w:left w:val="single" w:sz="4" w:space="0" w:color="AAAAAA"/>
+          <w:bottom w:val="single" w:sz="4" w:space="0" w:color="AAAAAA"/>
+          <w:right w:val="single" w:sz="4" w:space="0" w:color="AAAAAA"/>
+          <w:insideH w:val="single" w:sz="4" w:space="0" w:color="AAAAAA"/>
+          <w:insideV w:val="single" w:sz="4" w:space="0" w:color="AAAAAA"/>
+        </w:tblBorders>
+        <w:tblCellMar>
+          <w:top w:w="80" w:type="dxa"/>
+          <w:left w:w="120" w:type="dxa"/>
+          <w:bottom w:w="80" w:type="dxa"/>
+          <w:right w:w="120" w:type="dxa"/>
+        </w:tblCellMar>
+      </w:tblPr>
+      <w:tr>
+        <w:tc>
+          <w:tcPr>
+            <w:tcW w:w="1600" w:type="dxa"/>
+            <w:shd w:val="clear" w:color="auto" w:fill="DDDDDD"/>
+          </w:tcPr>
+          <w:p>
+            <w:r>
+              <w:rPr>
+                <w:b/>
+              </w:rPr>
+              <w:t>GRASP 模式</w:t>
+            </w:r>
+          </w:p>
+        </w:tc>
+        <w:tc>
+          <w:tcPr>
+            <w:tcW w:w="2400" w:type="dxa"/>
+            <w:shd w:val="clear" w:color="auto" w:fill="DDDDDD"/>
+          </w:tcPr>
+          <w:p>
+            <w:r>
+              <w:rPr>
+                <w:b/>
+              </w:rPr>
+              <w:t>套用類別</w:t>
+            </w:r>
+          </w:p>
+        </w:tc>
+        <w:tc>
+          <w:tcPr>
+            <w:tcW w:w="5026" w:type="dxa"/>
+            <w:shd w:val="clear" w:color="auto" w:fill="DDDDDD"/>
+          </w:tcPr>
+          <w:p>
+            <w:r>
+              <w:rPr>
+                <w:b/>
+              </w:rPr>
+              <w:t>說明</w:t>
+            </w:r>
+          </w:p>
+        </w:tc>
+      </w:tr>
+      <w:tr>
+        <w:tc>
+          <w:tcPr>
+            <w:tcW w:w="1600" w:type="dxa"/>
+          </w:tcPr>
+          <w:p>
+            <w:r>
+              <w:t xml:space="preserve">Controller</w:t>
+            </w:r>
+          </w:p>
+        </w:tc>
+        <w:tc>
+          <w:tcPr>
+            <w:tcW w:w="2400" w:type="dxa"/>
+          </w:tcPr>
+          <w:p>
+            <w:r>
+              <w:t xml:space="preserve">ProfileInitCommand</w:t>
+            </w:r>
+          </w:p>
+        </w:tc>
+        <w:tc>
+          <w:tcPr>
+            <w:tcW w:w="5026" w:type="dxa"/>
+          </w:tcPr>
+          <w:p>
+            <w:r>
+              <w:t xml:space="preserve">作為 use-case controller 處理 initProfile 系統事件（一 use case 對應一 controller）。</w:t>
+            </w:r>
+          </w:p>
+        </w:tc>
+      </w:tr>
+      <w:tr>
+        <w:tc>
+          <w:tcPr>
+            <w:tcW w:w="1600" w:type="dxa"/>
+          </w:tcPr>
+          <w:p>
+            <w:r>
+              <w:t xml:space="preserve">Information Expert + Creator</w:t>
+            </w:r>
+          </w:p>
+        </w:tc>
+        <w:tc>
+          <w:tcPr>
+            <w:tcW w:w="2400" w:type="dxa"/>
+          </w:tcPr>
+          <w:p>
+            <w:r>
+              <w:t xml:space="preserve">ProfileTemplateService</w:t>
+            </w:r>
+          </w:p>
+        </w:tc>
+        <w:tc>
+          <w:tcPr>
+            <w:tcW w:w="5026" w:type="dxa"/>
+          </w:tcPr>
+          <w:p>
+            <w:r>
+              <w:t xml:space="preserve">具備範本結構的完整知識，負責建立並寫出 YAML 檔案。</w:t>
+            </w:r>
+          </w:p>
+        </w:tc>
+      </w:tr>
+      <w:tr>
+        <w:tc>
+          <w:tcPr>
+            <w:tcW w:w="1600" w:type="dxa"/>
+          </w:tcPr>
+          <w:p>
+            <w:r>
+              <w:t xml:space="preserve">Low Coupling</w:t>
+            </w:r>
+          </w:p>
+        </w:tc>
+        <w:tc>
+          <w:tcPr>
+            <w:tcW w:w="2400" w:type="dxa"/>
+          </w:tcPr>
+          <w:p>
+            <w:r>
+              <w:t xml:space="preserve">ProfileInitCommand</w:t>
+            </w:r>
+          </w:p>
+        </w:tc>
+        <w:tc>
+          <w:tcPr>
+            <w:tcW w:w="5026" w:type="dxa"/>
+          </w:tcPr>
+          <w:p>
+            <w:r>
+              <w:t xml:space="preserve">於本地建立 ProfileTemplateService，使 CLI 層與檔案系統細節保持獨立。</w:t>
+            </w:r>
+          </w:p>
+        </w:tc>
+      </w:tr>
+    </w:tbl>
     <w:p>
       <w:pPr>
         <w:jc w:val="center"/>
@@ -13730,31 +13869,197 @@
         <w:t>系統事件 2：validateProfile(yamlPath)</w:t>
       </w:r>
     </w:p>
-    <w:p>
-      <w:r>
-        <w:t>GRASP 模式應用：</w:t>
-      </w:r>
-    </w:p>
-    <w:p>
-      <w:r>
-        <w:t>• Controller：ProfileValidateCommand 處理 validateProfile 系統事件。</w:t>
-      </w:r>
-    </w:p>
-    <w:p>
-      <w:r>
-        <w:t>• Information Expert：ProfileValidateService 掌握驗證的業務邏輯；YamlProfileLoader 為解析 YAML 與建立 StyleProfile 的資訊專家。</w:t>
-      </w:r>
-    </w:p>
-    <w:p>
-      <w:r>
-        <w:t>• Creator：YamlProfileLoader 持有已解析的 YAML 資料，因此負責建立 StyleProfile與 ComplianceRule 物件。</w:t>
-      </w:r>
-    </w:p>
-    <w:p>
-      <w:r>
-        <w:t>• Low Coupling：ProfileValidateService 依賴 ProfileLoader 介面，而非直接依賴 YamlProfileLoader，便於替換實作。</w:t>
-      </w:r>
-    </w:p>
+    <w:tbl>
+      <w:tblPr>
+        <w:tblW w:w="9026" w:type="dxa"/>
+        <w:tblBorders>
+          <w:top w:val="single" w:sz="4" w:space="0" w:color="AAAAAA"/>
+          <w:left w:val="single" w:sz="4" w:space="0" w:color="AAAAAA"/>
+          <w:bottom w:val="single" w:sz="4" w:space="0" w:color="AAAAAA"/>
+          <w:right w:val="single" w:sz="4" w:space="0" w:color="AAAAAA"/>
+          <w:insideH w:val="single" w:sz="4" w:space="0" w:color="AAAAAA"/>
+          <w:insideV w:val="single" w:sz="4" w:space="0" w:color="AAAAAA"/>
+        </w:tblBorders>
+        <w:tblCellMar>
+          <w:top w:w="80" w:type="dxa"/>
+          <w:left w:w="120" w:type="dxa"/>
+          <w:bottom w:w="80" w:type="dxa"/>
+          <w:right w:w="120" w:type="dxa"/>
+        </w:tblCellMar>
+      </w:tblPr>
+      <w:tr>
+        <w:tc>
+          <w:tcPr>
+            <w:tcW w:w="1600" w:type="dxa"/>
+            <w:shd w:val="clear" w:color="auto" w:fill="DDDDDD"/>
+          </w:tcPr>
+          <w:p>
+            <w:r>
+              <w:rPr>
+                <w:b/>
+              </w:rPr>
+              <w:t>GRASP 模式</w:t>
+            </w:r>
+          </w:p>
+        </w:tc>
+        <w:tc>
+          <w:tcPr>
+            <w:tcW w:w="2400" w:type="dxa"/>
+            <w:shd w:val="clear" w:color="auto" w:fill="DDDDDD"/>
+          </w:tcPr>
+          <w:p>
+            <w:r>
+              <w:rPr>
+                <w:b/>
+              </w:rPr>
+              <w:t>套用類別</w:t>
+            </w:r>
+          </w:p>
+        </w:tc>
+        <w:tc>
+          <w:tcPr>
+            <w:tcW w:w="5026" w:type="dxa"/>
+            <w:shd w:val="clear" w:color="auto" w:fill="DDDDDD"/>
+          </w:tcPr>
+          <w:p>
+            <w:r>
+              <w:rPr>
+                <w:b/>
+              </w:rPr>
+              <w:t>說明</w:t>
+            </w:r>
+          </w:p>
+        </w:tc>
+      </w:tr>
+      <w:tr>
+        <w:tc>
+          <w:tcPr>
+            <w:tcW w:w="1600" w:type="dxa"/>
+          </w:tcPr>
+          <w:p>
+            <w:r>
+              <w:t xml:space="preserve">Controller</w:t>
+            </w:r>
+          </w:p>
+        </w:tc>
+        <w:tc>
+          <w:tcPr>
+            <w:tcW w:w="2400" w:type="dxa"/>
+          </w:tcPr>
+          <w:p>
+            <w:r>
+              <w:t xml:space="preserve">ProfileValidateCommand</w:t>
+            </w:r>
+          </w:p>
+        </w:tc>
+        <w:tc>
+          <w:tcPr>
+            <w:tcW w:w="5026" w:type="dxa"/>
+          </w:tcPr>
+          <w:p>
+            <w:r>
+              <w:t xml:space="preserve">處理 validateProfile 系統事件。</w:t>
+            </w:r>
+          </w:p>
+        </w:tc>
+      </w:tr>
+      <w:tr>
+        <w:tc>
+          <w:tcPr>
+            <w:tcW w:w="1600" w:type="dxa"/>
+          </w:tcPr>
+          <w:p>
+            <w:r>
+              <w:t xml:space="preserve">Information Expert</w:t>
+            </w:r>
+          </w:p>
+        </w:tc>
+        <w:tc>
+          <w:tcPr>
+            <w:tcW w:w="2400" w:type="dxa"/>
+          </w:tcPr>
+          <w:p>
+            <w:r>
+              <w:t xml:space="preserve">ProfileValidateService, YamlProfileLoader</w:t>
+            </w:r>
+          </w:p>
+        </w:tc>
+        <w:tc>
+          <w:tcPr>
+            <w:tcW w:w="5026" w:type="dxa"/>
+          </w:tcPr>
+          <w:p>
+            <w:r>
+              <w:t xml:space="preserve">掌握驗證業務邏輯；YamlProfileLoader 解析 YAML 並建立 StyleProfile。</w:t>
+            </w:r>
+          </w:p>
+        </w:tc>
+      </w:tr>
+      <w:tr>
+        <w:tc>
+          <w:tcPr>
+            <w:tcW w:w="1600" w:type="dxa"/>
+          </w:tcPr>
+          <w:p>
+            <w:r>
+              <w:t xml:space="preserve">Creator</w:t>
+            </w:r>
+          </w:p>
+        </w:tc>
+        <w:tc>
+          <w:tcPr>
+            <w:tcW w:w="2400" w:type="dxa"/>
+          </w:tcPr>
+          <w:p>
+            <w:r>
+              <w:t xml:space="preserve">YamlProfileLoader</w:t>
+            </w:r>
+          </w:p>
+        </w:tc>
+        <w:tc>
+          <w:tcPr>
+            <w:tcW w:w="5026" w:type="dxa"/>
+          </w:tcPr>
+          <w:p>
+            <w:r>
+              <w:t xml:space="preserve">持有已解析的 YAML 資料，負責建立 StyleProfile 與 ComplianceRule 物件。</w:t>
+            </w:r>
+          </w:p>
+        </w:tc>
+      </w:tr>
+      <w:tr>
+        <w:tc>
+          <w:tcPr>
+            <w:tcW w:w="1600" w:type="dxa"/>
+          </w:tcPr>
+          <w:p>
+            <w:r>
+              <w:t xml:space="preserve">Low Coupling</w:t>
+            </w:r>
+          </w:p>
+        </w:tc>
+        <w:tc>
+          <w:tcPr>
+            <w:tcW w:w="2400" w:type="dxa"/>
+          </w:tcPr>
+          <w:p>
+            <w:r>
+              <w:t xml:space="preserve">ProfileValidateService</w:t>
+            </w:r>
+          </w:p>
+        </w:tc>
+        <w:tc>
+          <w:tcPr>
+            <w:tcW w:w="5026" w:type="dxa"/>
+          </w:tcPr>
+          <w:p>
+            <w:r>
+              <w:t xml:space="preserve">依賴 ProfileLoader 介面，而非直接依賴 YamlProfileLoader，便於替換實作。</w:t>
+            </w:r>
+          </w:p>
+        </w:tc>
+      </w:tr>
+    </w:tbl>
     <w:p>
       <w:pPr>
         <w:jc w:val="center"/>
@@ -13897,26 +14202,165 @@
         <w:t>系統事件：fix(sourcePath, profilePath)</w:t>
       </w:r>
     </w:p>
-    <w:p>
-      <w:r>
-        <w:t>GRASP 模式應用：</w:t>
-      </w:r>
-    </w:p>
-    <w:p>
-      <w:r>
-        <w:t>• Controller：FixCommand 作為 UC-03 之 use-case controller，接收並處理 fix 系統事件（一個 use case 對應一個 controller）。</w:t>
-      </w:r>
-    </w:p>
-    <w:p>
-      <w:r>
-        <w:t>• Information Expert：InteractiveFixer 掌握互動式修復之完整業務邏輯，包括逐一顯示違規與建議、讀取使用者決策、呼叫 SuppressionStore 寫出抑制記錄。</w:t>
-      </w:r>
-    </w:p>
-    <w:p>
-      <w:r>
-        <w:t>• Low Coupling：FixCommand 僅依賴 InteractiveFixer 介面與 ComplianceCheckService 介面，不直接操作具體 I/O 邏輯，便於替換實作。</w:t>
-      </w:r>
-    </w:p>
+    <w:tbl>
+      <w:tblPr>
+        <w:tblW w:w="9026" w:type="dxa"/>
+        <w:tblBorders>
+          <w:top w:val="single" w:sz="4" w:space="0" w:color="AAAAAA"/>
+          <w:left w:val="single" w:sz="4" w:space="0" w:color="AAAAAA"/>
+          <w:bottom w:val="single" w:sz="4" w:space="0" w:color="AAAAAA"/>
+          <w:right w:val="single" w:sz="4" w:space="0" w:color="AAAAAA"/>
+          <w:insideH w:val="single" w:sz="4" w:space="0" w:color="AAAAAA"/>
+          <w:insideV w:val="single" w:sz="4" w:space="0" w:color="AAAAAA"/>
+        </w:tblBorders>
+        <w:tblCellMar>
+          <w:top w:w="80" w:type="dxa"/>
+          <w:left w:w="120" w:type="dxa"/>
+          <w:bottom w:w="80" w:type="dxa"/>
+          <w:right w:w="120" w:type="dxa"/>
+        </w:tblCellMar>
+      </w:tblPr>
+      <w:tr>
+        <w:tc>
+          <w:tcPr>
+            <w:tcW w:w="1600" w:type="dxa"/>
+            <w:shd w:val="clear" w:color="auto" w:fill="DDDDDD"/>
+          </w:tcPr>
+          <w:p>
+            <w:r>
+              <w:rPr>
+                <w:b/>
+              </w:rPr>
+              <w:t>GRASP 模式</w:t>
+            </w:r>
+          </w:p>
+        </w:tc>
+        <w:tc>
+          <w:tcPr>
+            <w:tcW w:w="2400" w:type="dxa"/>
+            <w:shd w:val="clear" w:color="auto" w:fill="DDDDDD"/>
+          </w:tcPr>
+          <w:p>
+            <w:r>
+              <w:rPr>
+                <w:b/>
+              </w:rPr>
+              <w:t>套用類別</w:t>
+            </w:r>
+          </w:p>
+        </w:tc>
+        <w:tc>
+          <w:tcPr>
+            <w:tcW w:w="5026" w:type="dxa"/>
+            <w:shd w:val="clear" w:color="auto" w:fill="DDDDDD"/>
+          </w:tcPr>
+          <w:p>
+            <w:r>
+              <w:rPr>
+                <w:b/>
+              </w:rPr>
+              <w:t>說明</w:t>
+            </w:r>
+          </w:p>
+        </w:tc>
+      </w:tr>
+      <w:tr>
+        <w:tc>
+          <w:tcPr>
+            <w:tcW w:w="1600" w:type="dxa"/>
+          </w:tcPr>
+          <w:p>
+            <w:r>
+              <w:t xml:space="preserve">Controller</w:t>
+            </w:r>
+          </w:p>
+        </w:tc>
+        <w:tc>
+          <w:tcPr>
+            <w:tcW w:w="2400" w:type="dxa"/>
+          </w:tcPr>
+          <w:p>
+            <w:r>
+              <w:t xml:space="preserve">FixCommand</w:t>
+            </w:r>
+          </w:p>
+        </w:tc>
+        <w:tc>
+          <w:tcPr>
+            <w:tcW w:w="5026" w:type="dxa"/>
+          </w:tcPr>
+          <w:p>
+            <w:r>
+              <w:t xml:space="preserve">作為 UC-03 之 use-case controller，接收並處理 fix 系統事件（一 use case 對應一 controller）。</w:t>
+            </w:r>
+          </w:p>
+        </w:tc>
+      </w:tr>
+      <w:tr>
+        <w:tc>
+          <w:tcPr>
+            <w:tcW w:w="1600" w:type="dxa"/>
+          </w:tcPr>
+          <w:p>
+            <w:r>
+              <w:t xml:space="preserve">Information Expert</w:t>
+            </w:r>
+          </w:p>
+        </w:tc>
+        <w:tc>
+          <w:tcPr>
+            <w:tcW w:w="2400" w:type="dxa"/>
+          </w:tcPr>
+          <w:p>
+            <w:r>
+              <w:t xml:space="preserve">InteractiveFixer</w:t>
+            </w:r>
+          </w:p>
+        </w:tc>
+        <w:tc>
+          <w:tcPr>
+            <w:tcW w:w="5026" w:type="dxa"/>
+          </w:tcPr>
+          <w:p>
+            <w:r>
+              <w:t xml:space="preserve">掌握互動式修復之完整業務邏輯，逐一顯示違規與建議、讀取使用者決策、呼叫 SuppressionStore 寫出抑制記錄。</w:t>
+            </w:r>
+          </w:p>
+        </w:tc>
+      </w:tr>
+      <w:tr>
+        <w:tc>
+          <w:tcPr>
+            <w:tcW w:w="1600" w:type="dxa"/>
+          </w:tcPr>
+          <w:p>
+            <w:r>
+              <w:t xml:space="preserve">Low Coupling</w:t>
+            </w:r>
+          </w:p>
+        </w:tc>
+        <w:tc>
+          <w:tcPr>
+            <w:tcW w:w="2400" w:type="dxa"/>
+          </w:tcPr>
+          <w:p>
+            <w:r>
+              <w:t xml:space="preserve">FixCommand</w:t>
+            </w:r>
+          </w:p>
+        </w:tc>
+        <w:tc>
+          <w:tcPr>
+            <w:tcW w:w="5026" w:type="dxa"/>
+          </w:tcPr>
+          <w:p>
+            <w:r>
+              <w:t xml:space="preserve">僅依賴 InteractiveFixer 與 ComplianceCheckService 介面，不直接操作具體 I/O 邏輯，便於替換實作。</w:t>
+            </w:r>
+          </w:p>
+        </w:tc>
+      </w:tr>
+    </w:tbl>
     <w:p>
       <w:pPr>
         <w:jc w:val="center"/>

</xml_diff>

<commit_message>
[Documentation] Update UC-03 SD, DCD, and docx to reflect SuppressionService delegation
Update UC-03 Sequence Diagram to show FixCommand delegating to SuppressionService
(which then calls SuppressionStore.loadAll/save) instead of calling SuppressionStore
directly. Update DCD FixCommand method signature (runInteractiveLoop param store->service,
remove deleted private suppress method). Update docx Section 3.2.6 GRASP table (change
Information Expert/SuppressionStore to Pure Fabrication/SuppressionService), Low Coupling
explanation, and UC-04 MSS step 1. Also export updated PNG diagrams.
</commit_message>
<xml_diff>
--- a/hw/hw7/113598009_7.docx
+++ b/hw/hw7/113598009_7.docx
@@ -2007,7 +2007,7 @@
               <w:rPr>
                 <w:sz w:val="20"/>
               </w:rPr>
-              <w:t>實作 Iteration II：新增 UC-02 定義風格設定檔、UC-03 互動式違規修正；7 個新類別，28 個 JUnit 5 測試全部通過。</w:t>
+              <w:t>實作 Iteration II：新增 UC-02 定義風格設定檔、UC-03 互動式違規修正；6 個新類別，28 個 JUnit 5 測試全部通過。</w:t>
             </w:r>
           </w:p>
         </w:tc>
@@ -2863,7 +2863,7 @@
         <w:lastRenderedPageBreak/>
         <w:drawing>
           <wp:inline distT="0" distB="0" distL="0" distR="0" wp14:anchorId="6E69ABBC" wp14:editId="66EE38FE">
-            <wp:extent cx="5731510" cy="3557270"/>
+            <wp:extent cx="5731510" cy="3530899"/>
             <wp:effectExtent l="0" t="0" r="0" b="0"/>
             <wp:docPr id="1473456420" name="圖片 1"/>
             <wp:cNvGraphicFramePr>
@@ -2891,7 +2891,7 @@
                   <pic:spPr>
                     <a:xfrm>
                       <a:off x="0" y="0"/>
-                      <a:ext cx="5731510" cy="3557270"/>
+                      <a:ext cx="5731510" cy="3530899"/>
                     </a:xfrm>
                     <a:prstGeom prst="rect">
                       <a:avLst/>
@@ -5250,7 +5250,60 @@
           <w:sz w:val="26"/>
           <w:szCs w:val="26"/>
         </w:rPr>
-        <w:t>UC-02: Define Style Profile (Fully Dressed)</w:t>
+        <w:t>UC-02: Define Style Profile (Brief)</w:t>
+      </w:r>
+      <w:r>
+        <w:rPr>
+          <w:rFonts w:eastAsia="標楷體"/>
+          <w:b/>
+          <w:bCs/>
+          <w:sz w:val="26"/>
+          <w:szCs w:val="26"/>
+          <w:highlight w:val="yellow"/>
+        </w:rPr>
+        <w:t>　← Iteration II（本迭代實作）</w:t>
+      </w:r>
+    </w:p>
+    <w:p>
+      <w:pPr>
+        <w:spacing w:before="60" w:after="60"/>
+        <w:jc w:val="both"/>
+        <w:rPr>
+          <w:rFonts w:eastAsia="標楷體"/>
+        </w:rPr>
+      </w:pPr>
+      <w:r>
+        <w:rPr>
+          <w:rFonts w:eastAsia="標楷體"/>
+        </w:rPr>
+        <w:t>Developer 執行 arch-checker profile init &lt;outputPath&gt;，系統於指定路徑產生含預設規則範例與欄位說明的 YAML 模板，供 Developer 手動編輯後用於 UC-01 或 UC-03 合規檢查。輸出目錄不存在時系統自動建立；若路徑已有檔案則覆蓋。</w:t>
+      </w:r>
+    </w:p>
+    <w:p>
+      <w:pPr>
+        <w:rPr>
+          <w:rFonts w:eastAsia="標楷體"/>
+        </w:rPr>
+      </w:pPr>
+    </w:p>
+    <w:p>
+      <w:pPr>
+        <w:spacing w:before="240" w:after="120"/>
+        <w:rPr>
+          <w:rFonts w:eastAsia="標楷體"/>
+        </w:rPr>
+      </w:pPr>
+      <w:r>
+        <w:rPr>
+          <w:rFonts w:eastAsia="標楷體"/>
+          <w:b/>
+          <w:bCs/>
+          <w:sz w:val="26"/>
+          <w:szCs w:val="26"/>
+        </w:rPr>
+        <w:t xml:space="preserve">UC-03: Check Architecture Compliance with Interactive Fix Suggestions (Fully </w:t>
+        <w:lastRenderedPageBreak/>
+        <w:t>Dressed)</w:t>
       </w:r>
       <w:r>
         <w:rPr>
@@ -5346,7 +5399,7 @@
               <w:rPr>
                 <w:rFonts w:eastAsia="標楷體"/>
               </w:rPr>
-              <w:t>UC-02</w:t>
+              <w:t>UC-03</w:t>
             </w:r>
           </w:p>
         </w:tc>
@@ -5412,7 +5465,7 @@
               <w:rPr>
                 <w:rFonts w:eastAsia="標楷體"/>
               </w:rPr>
-              <w:t>Define Style Profile</w:t>
+              <w:t>Check Architecture Compliance with Interactive Fix Suggestions</w:t>
             </w:r>
           </w:p>
         </w:tc>
@@ -5676,7 +5729,7 @@
               <w:rPr>
                 <w:rFonts w:eastAsia="標楷體"/>
               </w:rPr>
-              <w:t>Developer：想用最少工夫定義出可重複使用的架構規則，希望工具提供模板降低手寫 YAML 的門檻，並在儲存前即時得知格式是否正確。</w:t>
+              <w:t>Developer：想逐條審視每個 Violation 並當場決定是否 suppress，希望系統提供可操作的修復建議，而不只是列出錯誤清單。</w:t>
             </w:r>
           </w:p>
           <w:p>
@@ -5690,7 +5743,7 @@
               <w:rPr>
                 <w:rFonts w:eastAsia="標楷體"/>
               </w:rPr>
-              <w:t>Team Lead：想要團隊共享一份統一的 Profile 並版本控制於 Git，確保規則描述清楚且長期可維護。</w:t>
+              <w:t>Team Lead：想知道哪些 Violation 是「已知且接受」的技術債，並有持久化且可稽核的 suppression 紀錄，而非無聲地被略過。</w:t>
             </w:r>
           </w:p>
         </w:tc>
@@ -5756,7 +5809,21 @@
               <w:rPr>
                 <w:rFonts w:eastAsia="標楷體"/>
               </w:rPr>
-              <w:t>arch-checker 已安裝並可在系統中存取</w:t>
+              <w:t>1. 同 UC-01 的前置條件</w:t>
+            </w:r>
+          </w:p>
+          <w:p>
+            <w:pPr>
+              <w:spacing w:before="40"/>
+              <w:rPr>
+                <w:rFonts w:eastAsia="標楷體"/>
+              </w:rPr>
+            </w:pPr>
+            <w:r>
+              <w:rPr>
+                <w:rFonts w:eastAsia="標楷體"/>
+              </w:rPr>
+              <w:t>2. Terminal 支援互動式輸入（非 pipe 重定向的 non-TTY 模式）</w:t>
             </w:r>
           </w:p>
         </w:tc>
@@ -5822,7 +5889,7 @@
               <w:rPr>
                 <w:rFonts w:eastAsia="標楷體"/>
               </w:rPr>
-              <w:t>一個語法正確、至少含 1 條規則的 .yaml Profile 檔案存在於磁碟，且可被 UC-01 成功載入使用</w:t>
+              <w:t>對每條 Violation，三種結果之一成立：(a) Suppression 記錄寫入 .arch-checker-suppress.yaml，(b) Violation 保留在報告中，(c) 流程中止；最終 ComplianceReport 反映所有決策結果</w:t>
             </w:r>
           </w:p>
         </w:tc>
@@ -5888,7 +5955,7 @@
               <w:rPr>
                 <w:rFonts w:eastAsia="標楷體"/>
               </w:rPr>
-              <w:t>1. Developer 發出建立新 Style Profile 模板的要求，並指定輸出位置</w:t>
+              <w:t>1. Developer 發出以互動模式對指定專案進行架構合規檢查的要求，並指定 Style Profile</w:t>
             </w:r>
           </w:p>
           <w:p>
@@ -5902,8 +5969,7 @@
               <w:rPr>
                 <w:rFonts w:eastAsia="標楷體"/>
               </w:rPr>
-              <w:lastRenderedPageBreak/>
-              <w:t>2. 系統產生含預設結構與欄位說明註解的空白 YAML 模板，寫入指定位置</w:t>
+              <w:t>2. 系統完成掃描流程（同 UC-01 Step 2–7）：走訪檔案、解析 AST、套用規則、收集所有 Violation</w:t>
             </w:r>
           </w:p>
           <w:p>
@@ -5917,7 +5983,7 @@
               <w:rPr>
                 <w:rFonts w:eastAsia="標楷體"/>
               </w:rPr>
-              <w:t>3. Developer 完成 YAML 編輯後，發出驗證 Style Profile 的要求</w:t>
+              <w:t>3. 系統展示第一條 Violation，顯示：檔案路徑與行號、違反的 ComplianceRule ID 與說明、RefactoringSuggestion（若存在）</w:t>
             </w:r>
           </w:p>
           <w:p>
@@ -5931,7 +5997,7 @@
               <w:rPr>
                 <w:rFonts w:eastAsia="標楷體"/>
               </w:rPr>
-              <w:t>4. 系統讀取並解析 YAML 檔</w:t>
+              <w:t>4. 系統提示 Developer 選擇動作（Suppress? [y/n/q]）</w:t>
             </w:r>
           </w:p>
           <w:p>
@@ -5945,7 +6011,7 @@
               <w:rPr>
                 <w:rFonts w:eastAsia="標楷體"/>
               </w:rPr>
-              <w:t>5. 系統驗證每條規則的 type（NamingRule / DependencyRule / SupertypeRule / PackageRule）與所有必填欄位</w:t>
+              <w:t>5. Developer 輸入 y：系統將此 Violation（rule ID、檔案路徑、行號、時間戳記）記錄至 .arch-checker-suppress.yaml</w:t>
             </w:r>
           </w:p>
           <w:p>
@@ -5959,7 +6025,7 @@
               <w:rPr>
                 <w:rFonts w:eastAsia="標楷體"/>
               </w:rPr>
-              <w:t>6. 系統驗證每個 package pattern 的語法（只允許英數字、*、.）</w:t>
+              <w:t>6. 系統展示下一條 Violation（回到 Step 3）</w:t>
             </w:r>
           </w:p>
           <w:p>
@@ -5973,7 +6039,7 @@
               <w:rPr>
                 <w:rFonts w:eastAsia="標楷體"/>
               </w:rPr>
-              <w:t>7. 系統輸出驗證成功訊息，顯示載入的規則數量</w:t>
+              <w:t>7. 所有 Violation 處理完畢後，系統輸出摘要：已檢查的檔案數、剩餘 Violation 數、已接受的 Suppression 數</w:t>
             </w:r>
           </w:p>
           <w:p>
@@ -5987,7 +6053,7 @@
               <w:rPr>
                 <w:rFonts w:eastAsia="標楷體"/>
               </w:rPr>
-              <w:t>8. Developer 在執行 UC-01 時指定此 Profile</w:t>
+              <w:t>8. 系統回傳 exit code（0 = 無未接受 Violation，1 = 有未接受 Violation）</w:t>
             </w:r>
           </w:p>
         </w:tc>
@@ -6023,38 +6089,67 @@
                 <w:bCs/>
                 <w:color w:val="000000"/>
               </w:rPr>
+              <w:t>Extensions</w:t>
+            </w:r>
+          </w:p>
+        </w:tc>
+        <w:tc>
+          <w:tcPr>
+            <w:tcW w:w="6726" w:type="dxa"/>
+            <w:tcBorders>
+              <w:top w:val="single" w:sz="1" w:space="0" w:color="AAAAAA"/>
+              <w:left w:val="single" w:sz="1" w:space="0" w:color="AAAAAA"/>
+              <w:bottom w:val="single" w:sz="1" w:space="0" w:color="AAAAAA"/>
+              <w:right w:val="single" w:sz="1" w:space="0" w:color="AAAAAA"/>
+            </w:tcBorders>
+            <w:tcMar>
+              <w:top w:w="80" w:type="dxa"/>
+              <w:left w:w="120" w:type="dxa"/>
+              <w:bottom w:w="80" w:type="dxa"/>
+              <w:right w:w="120" w:type="dxa"/>
+            </w:tcMar>
+          </w:tcPr>
+          <w:p>
+            <w:pPr>
+              <w:rPr>
+                <w:rFonts w:eastAsia="標楷體"/>
+              </w:rPr>
+            </w:pPr>
+            <w:r>
+              <w:rPr>
+                <w:rFonts w:eastAsia="標楷體"/>
+              </w:rPr>
+              <w:t>3a. 此 Violation 有 RefactoringSuggestion：系統在顯示 [y/n/q] 提示前，額外顯示建議操作</w:t>
+            </w:r>
+          </w:p>
+          <w:p>
+            <w:pPr>
+              <w:spacing w:before="40"/>
+              <w:rPr>
+                <w:rFonts w:eastAsia="標楷體"/>
+              </w:rPr>
+            </w:pPr>
+            <w:r>
+              <w:rPr>
+                <w:rFonts w:eastAsia="標楷體"/>
+              </w:rPr>
+              <w:t>3b. 掃描後無 Violation：系統直接輸出全部通過訊息，不進入互動迴圈，exit code 0</w:t>
+            </w:r>
+          </w:p>
+          <w:p>
+            <w:pPr>
+              <w:spacing w:before="40"/>
+              <w:rPr>
+                <w:rFonts w:eastAsia="標楷體"/>
+              </w:rPr>
+            </w:pPr>
+            <w:r>
+              <w:rPr>
+                <w:rFonts w:eastAsia="標楷體"/>
+              </w:rPr>
+              <w:t>5a. Developer 輸入 n：此 Violation 保留在最終報告中，系統繼</w:t>
               <w:lastRenderedPageBreak/>
-              <w:t>Extensions</w:t>
-            </w:r>
-          </w:p>
-        </w:tc>
-        <w:tc>
-          <w:tcPr>
-            <w:tcW w:w="6726" w:type="dxa"/>
-            <w:tcBorders>
-              <w:top w:val="single" w:sz="1" w:space="0" w:color="AAAAAA"/>
-              <w:left w:val="single" w:sz="1" w:space="0" w:color="AAAAAA"/>
-              <w:bottom w:val="single" w:sz="1" w:space="0" w:color="AAAAAA"/>
-              <w:right w:val="single" w:sz="1" w:space="0" w:color="AAAAAA"/>
-            </w:tcBorders>
-            <w:tcMar>
-              <w:top w:w="80" w:type="dxa"/>
-              <w:left w:w="120" w:type="dxa"/>
-              <w:bottom w:w="80" w:type="dxa"/>
-              <w:right w:w="120" w:type="dxa"/>
-            </w:tcMar>
-          </w:tcPr>
-          <w:p>
-            <w:pPr>
-              <w:rPr>
-                <w:rFonts w:eastAsia="標楷體"/>
-              </w:rPr>
-            </w:pPr>
-            <w:r>
-              <w:rPr>
-                <w:rFonts w:eastAsia="標楷體"/>
-              </w:rPr>
-              <w:t>3a. Developer 跳過模板建立步驟，直接對已存在的 YAML 發出驗證要求：從 Step 4 開始，正常執行</w:t>
+              <w:t>續下一條（Step 6）</w:t>
             </w:r>
           </w:p>
           <w:p>
@@ -6068,7 +6163,7 @@
               <w:rPr>
                 <w:rFonts w:eastAsia="標楷體"/>
               </w:rPr>
-              <w:t>4a. 指定檔案不存在：系統輸出錯誤訊息，終止</w:t>
+              <w:t>5b. Developer 輸入 q：系統中止互動迴圈，輸出已處理部分的 partial report，exit code 1</w:t>
             </w:r>
           </w:p>
           <w:p>
@@ -6082,7 +6177,7 @@
               <w:rPr>
                 <w:rFonts w:eastAsia="標楷體"/>
               </w:rPr>
-              <w:t>5a. YAML 頂層結構錯誤（不是合法的 YAML mapping）：系統輸出錯誤訊息與錯誤行號，終止</w:t>
+              <w:t>5c. Developer 輸入非法值（非 y/n/q）：系統輸出 Invalid input. Please enter y, n, or q:，重新等待輸入</w:t>
             </w:r>
           </w:p>
           <w:p>
@@ -6096,35 +6191,7 @@
               <w:rPr>
                 <w:rFonts w:eastAsia="標楷體"/>
               </w:rPr>
-              <w:t>5b. 遇到未知的 rule type：系統輸出錯誤訊息，列出允許的規則類型，終止</w:t>
-            </w:r>
-          </w:p>
-          <w:p>
-            <w:pPr>
-              <w:spacing w:before="40"/>
-              <w:rPr>
-                <w:rFonts w:eastAsia="標楷體"/>
-              </w:rPr>
-            </w:pPr>
-            <w:r>
-              <w:rPr>
-                <w:rFonts w:eastAsia="標楷體"/>
-              </w:rPr>
-              <w:t>6a. package pattern 含非法字元：系統輸出錯誤訊息，終止</w:t>
-            </w:r>
-          </w:p>
-          <w:p>
-            <w:pPr>
-              <w:spacing w:before="40"/>
-              <w:rPr>
-                <w:rFonts w:eastAsia="標楷體"/>
-              </w:rPr>
-            </w:pPr>
-            <w:r>
-              <w:rPr>
-                <w:rFonts w:eastAsia="標楷體"/>
-              </w:rPr>
-              <w:t>7a. YAML 格式正確但 rules 清單為空：系統輸出警告訊息，表示 Profile 有效但不會產生違規，exit code 0</w:t>
+              <w:t>8a. 所有 Violation 均被 suppress（全部輸入 y）：報告顯示全部通過（含已抑制數量），exit code 0</w:t>
             </w:r>
           </w:p>
         </w:tc>
@@ -6160,6 +6227,7 @@
                 <w:bCs/>
                 <w:color w:val="000000"/>
               </w:rPr>
+              <w:lastRenderedPageBreak/>
               <w:t>Special Requirements</w:t>
             </w:r>
           </w:p>
@@ -6190,7 +6258,7 @@
               <w:rPr>
                 <w:rFonts w:eastAsia="標楷體"/>
               </w:rPr>
-              <w:t>NFR-02（Usability）：所有 validation 錯誤訊息必須清楚指出 YAML 錯誤行號，並提供修正建議</w:t>
+              <w:t>NFR-02（Usability）：互動提示須清晰易懂，Developer 無需查閱文件即能理解 [y/n/q] 各選項的含義</w:t>
             </w:r>
           </w:p>
           <w:p>
@@ -6204,7 +6272,7 @@
               <w:rPr>
                 <w:rFonts w:eastAsia="標楷體"/>
               </w:rPr>
-              <w:t>NFR-04（Extensibility）：擴充新的規則類型不應影響現有規則的合規檢查行為</w:t>
+              <w:t>NFR-06（Testability）：互動流程的合規性檢查邏輯必須可透過 unit test 獨立驗證，不依賴完整的 CLI 環境</w:t>
             </w:r>
           </w:p>
         </w:tc>
@@ -6270,7 +6338,7 @@
               <w:rPr>
                 <w:rFonts w:eastAsia="標楷體"/>
               </w:rPr>
-              <w:t>*a. Profile 格式為 YAML（以 SnakeYAML 解析），採 UTF-8 編碼</w:t>
+              <w:t>*a. Suppression 記錄寫入 .arch-checker-suppress.yaml，包含：rule ID、reason（預設為 suppressed interactively）、timestamp</w:t>
             </w:r>
           </w:p>
           <w:p>
@@ -6284,7 +6352,7 @@
               <w:rPr>
                 <w:rFonts w:eastAsia="標楷體"/>
               </w:rPr>
-              <w:t>*b. Developer 可使用任意文字編輯器（VS Code、IntelliJ、Vim 等），不需 IDE plugin</w:t>
+              <w:t>4a. [y/n/q] 輸入大小寫不敏感（Y、Yes 均視為接受）</w:t>
             </w:r>
           </w:p>
           <w:p>
@@ -6298,7 +6366,7 @@
               <w:rPr>
                 <w:rFonts w:eastAsia="標楷體"/>
               </w:rPr>
-              <w:t>2a. 若輸出目錄不存在，系統自動建立</w:t>
+              <w:t>*b. 若 stdout 被 pipe 重定向（non-TTY），系統自動降級為非互動批次模式並輸出警告</w:t>
             </w:r>
           </w:p>
         </w:tc>
@@ -6364,7 +6432,7 @@
               <w:rPr>
                 <w:rFonts w:eastAsia="標楷體"/>
               </w:rPr>
-              <w:t>每個新專案通常執行一次；規則有異動時重複執行 validate；相對低頻，以週或月為單位</w:t>
+              <w:t>本地開發初次建立 suppression 清單時使用，通常每個新專案執行一次；後續違規出現時按需使用，整體低頻</w:t>
             </w:r>
           </w:p>
         </w:tc>
@@ -6430,7 +6498,7 @@
               <w:rPr>
                 <w:rFonts w:eastAsia="標楷體"/>
               </w:rPr>
-              <w:t>是否提供 JSON Schema 供 IntelliJ / VS Code 在編輯 Profile YAML 時自動補全？</w:t>
+              <w:t>是否需要提供 --accept-all 選項，一次 suppress 所有 Violation？</w:t>
             </w:r>
           </w:p>
           <w:p>
@@ -6444,7 +6512,7 @@
               <w:rPr>
                 <w:rFonts w:eastAsia="標楷體"/>
               </w:rPr>
-              <w:t>Profile 是否支援繼承（extends: &lt;other-yaml-path&gt;）以在既有規則上擴充？</w:t>
+              <w:t>Suppression 是否應設有效期限，避免長期堆積技術債？</w:t>
             </w:r>
           </w:p>
         </w:tc>
@@ -6472,20 +6540,7 @@
           <w:sz w:val="26"/>
           <w:szCs w:val="26"/>
         </w:rPr>
-        <w:t xml:space="preserve">UC-03: Check Architecture Compliance with Interactive Fix Suggestions (Fully </w:t>
-        <w:lastRenderedPageBreak/>
-        <w:t>Dressed)</w:t>
-      </w:r>
-      <w:r>
-        <w:rPr>
-          <w:rFonts w:eastAsia="標楷體"/>
-          <w:b/>
-          <w:bCs/>
-          <w:sz w:val="26"/>
-          <w:szCs w:val="26"/>
-          <w:highlight w:val="yellow"/>
-        </w:rPr>
-        <w:t>　← Iteration II（本迭代實作）</w:t>
+        <w:t>UC-04: Suppress a Violation (Fully Dressed)</w:t>
       </w:r>
     </w:p>
     <w:tbl>
@@ -6570,7 +6625,7 @@
               <w:rPr>
                 <w:rFonts w:eastAsia="標楷體"/>
               </w:rPr>
-              <w:t>UC-03</w:t>
+              <w:t>UC-04</w:t>
             </w:r>
           </w:p>
         </w:tc>
@@ -6636,7 +6691,7 @@
               <w:rPr>
                 <w:rFonts w:eastAsia="標楷體"/>
               </w:rPr>
-              <w:t>Check Architecture Compliance with Interactive Fix Suggestions</w:t>
+              <w:t>Suppress a Violation</w:t>
             </w:r>
           </w:p>
         </w:tc>
@@ -6768,7 +6823,7 @@
               <w:rPr>
                 <w:rFonts w:eastAsia="標楷體"/>
               </w:rPr>
-              <w:t>User Goal</w:t>
+              <w:t>Subfunction</w:t>
             </w:r>
           </w:p>
         </w:tc>
@@ -6834,7 +6889,7 @@
               <w:rPr>
                 <w:rFonts w:eastAsia="標楷體"/>
               </w:rPr>
-              <w:t>Developer</w:t>
+              <w:t>（由 UC-03 互動迴圈驅動，Developer 以選擇 y 間接觸發）</w:t>
             </w:r>
           </w:p>
         </w:tc>
@@ -6900,21 +6955,7 @@
               <w:rPr>
                 <w:rFonts w:eastAsia="標楷體"/>
               </w:rPr>
-              <w:t>Developer：想逐條審視每個 Violation 並當場決定是否 suppress，希望系統提供可操作的修復建議，而不只是列出錯誤清單。</w:t>
-            </w:r>
-          </w:p>
-          <w:p>
-            <w:pPr>
-              <w:spacing w:before="40"/>
-              <w:rPr>
-                <w:rFonts w:eastAsia="標楷體"/>
-              </w:rPr>
-            </w:pPr>
-            <w:r>
-              <w:rPr>
-                <w:rFonts w:eastAsia="標楷體"/>
-              </w:rPr>
-              <w:t>Team Lead：想知道哪些 Violation 是「已知且接受」的技術債，並有持久化且可稽核的 suppression 紀錄，而非無聲地被略過。</w:t>
+              <w:t>Developer：希望在不修改程式碼的情況下，將已知且接受的違規排除於後續合規報告之外。</w:t>
             </w:r>
           </w:p>
         </w:tc>
@@ -6980,7 +7021,7 @@
               <w:rPr>
                 <w:rFonts w:eastAsia="標楷體"/>
               </w:rPr>
-              <w:t>1. 同 UC-01 的前置條件</w:t>
+              <w:t>目標 Violation 已存在於本次 ViolationReport 中</w:t>
             </w:r>
           </w:p>
           <w:p>
@@ -6994,7 +7035,7 @@
               <w:rPr>
                 <w:rFonts w:eastAsia="標楷體"/>
               </w:rPr>
-              <w:t>2. Terminal 支援互動式輸入（非 pipe 重定向的 non-TTY 模式）</w:t>
+              <w:t>.arch-checker-suppress.yaml 路徑可存取（檔案不存在時由系統建立）</w:t>
             </w:r>
           </w:p>
         </w:tc>
@@ -7060,7 +7101,7 @@
               <w:rPr>
                 <w:rFonts w:eastAsia="標楷體"/>
               </w:rPr>
-              <w:t>對每條 Violation，三種結果之一成立：(a) Suppression 記錄寫入 .arch-checker-suppress.yaml，(b) Violation 保留在報告中，(c) 流程中止；最終 ComplianceReport 反映所有決策結果</w:t>
+              <w:t>Violation 的 rule ID、檔案路徑、行號與時間戳記已持久化至 .arch-checker-suppress.yaml；UC-01／UC-03 下次執行時該違規不再出現於報告</w:t>
             </w:r>
           </w:p>
         </w:tc>
@@ -7126,7 +7167,7 @@
               <w:rPr>
                 <w:rFonts w:eastAsia="標楷體"/>
               </w:rPr>
-              <w:t>1. Developer 發出以互動模式對指定專案進行架構合規檢查的要求，並指定 Style Profile</w:t>
+              <w:t>1. UC-03 互動迴圈收到 Developer 選擇 y，FixCommand 委派 SuppressionService.suppress(violation, profile, suppressFile) 執行</w:t>
             </w:r>
           </w:p>
           <w:p>
@@ -7140,7 +7181,7 @@
               <w:rPr>
                 <w:rFonts w:eastAsia="標楷體"/>
               </w:rPr>
-              <w:t>2. 系統完成掃描流程（同 UC-01 Step 2–7）：走訪檔案、解析 AST、套用規則、收集所有 Violation</w:t>
+              <w:t>2. 系統從 .arch-checker-suppress.yaml 載入現有 Suppression 清單</w:t>
             </w:r>
           </w:p>
           <w:p>
@@ -7154,7 +7195,7 @@
               <w:rPr>
                 <w:rFonts w:eastAsia="標楷體"/>
               </w:rPr>
-              <w:t>3. 系統展示第一條 Violation，顯示：檔案路徑與行號、違反的 ComplianceRule ID 與說明、RefactoringSuggestion（若存在）</w:t>
+              <w:t>3. 系統建立新的 Suppression 記錄（rule ID、檔案路徑、行號、"Suppressed interactively"、當前 ISO-8601 時間戳記）</w:t>
             </w:r>
           </w:p>
           <w:p>
@@ -7168,75 +7209,7 @@
               <w:rPr>
                 <w:rFonts w:eastAsia="標楷體"/>
               </w:rPr>
-              <w:t>4. 系統提示</w:t>
-            </w:r>
-            <w:r>
-              <w:rPr>
-                <w:rFonts w:eastAsia="標楷體" w:hint="eastAsia"/>
-              </w:rPr>
-              <w:t>是否接受</w:t>
-            </w:r>
-            <w:r>
-              <w:rPr>
-                <w:rFonts w:eastAsia="標楷體"/>
-              </w:rPr>
-              <w:t xml:space="preserve"> suppression?</w:t>
-            </w:r>
-          </w:p>
-          <w:p>
-            <w:pPr>
-              <w:spacing w:before="40"/>
-              <w:rPr>
-                <w:rFonts w:eastAsia="標楷體"/>
-              </w:rPr>
-            </w:pPr>
-            <w:r>
-              <w:rPr>
-                <w:rFonts w:eastAsia="標楷體"/>
-              </w:rPr>
-              <w:t>5. Developer 輸入 y：系統將此 Violation 的 rule ID 與時間戳記寫入 .arch-checker-suppress.yaml</w:t>
-            </w:r>
-          </w:p>
-          <w:p>
-            <w:pPr>
-              <w:spacing w:before="40"/>
-              <w:rPr>
-                <w:rFonts w:eastAsia="標楷體"/>
-              </w:rPr>
-            </w:pPr>
-            <w:r>
-              <w:rPr>
-                <w:rFonts w:eastAsia="標楷體"/>
-              </w:rPr>
-              <w:t>6. 系統展示下一條 Violation（回到 Step 3）</w:t>
-            </w:r>
-          </w:p>
-          <w:p>
-            <w:pPr>
-              <w:spacing w:before="40"/>
-              <w:rPr>
-                <w:rFonts w:eastAsia="標楷體"/>
-              </w:rPr>
-            </w:pPr>
-            <w:r>
-              <w:rPr>
-                <w:rFonts w:eastAsia="標楷體"/>
-              </w:rPr>
-              <w:t>7. 所有 Violation 處理完畢後，系統輸出最終 ComplianceReport（已扣除接受的 suppression）</w:t>
-            </w:r>
-          </w:p>
-          <w:p>
-            <w:pPr>
-              <w:spacing w:before="40"/>
-              <w:rPr>
-                <w:rFonts w:eastAsia="標楷體"/>
-              </w:rPr>
-            </w:pPr>
-            <w:r>
-              <w:rPr>
-                <w:rFonts w:eastAsia="標楷體"/>
-              </w:rPr>
-              <w:t>8. 系統回傳 exit code（0 = 無未接受 Violation，1 = 有未接受 Violation）</w:t>
+              <w:t>4. 系統將更新後的 Suppression 清單寫回 .arch-checker-suppress.yaml</w:t>
             </w:r>
           </w:p>
         </w:tc>
@@ -7302,7 +7275,7 @@
               <w:rPr>
                 <w:rFonts w:eastAsia="標楷體"/>
               </w:rPr>
-              <w:t>3a. 此 Violation 有 RefactoringSuggestion：系統在顯示 [y/n/q] 提示前，額外顯示建議操作</w:t>
+              <w:t>*a. .arch-checker-suppress.yaml 不存在：系統建立新檔後寫入，正常結束</w:t>
             </w:r>
           </w:p>
           <w:p>
@@ -7316,65 +7289,7 @@
               <w:rPr>
                 <w:rFonts w:eastAsia="標楷體"/>
               </w:rPr>
-              <w:t>3b. 掃描後無 Violation：系統直接輸出全部通過訊息，不進入互動迴圈，exit code 0</w:t>
-            </w:r>
-          </w:p>
-          <w:p>
-            <w:pPr>
-              <w:spacing w:before="40"/>
-              <w:rPr>
-                <w:rFonts w:eastAsia="標楷體"/>
-              </w:rPr>
-            </w:pPr>
-            <w:r>
-              <w:rPr>
-                <w:rFonts w:eastAsia="標楷體"/>
-              </w:rPr>
-              <w:t>5a. Developer 輸入 n：此 Violation 保留在最終報告中，系統繼</w:t>
-              <w:lastRenderedPageBreak/>
-              <w:t>續下一條（Step 6）</w:t>
-            </w:r>
-          </w:p>
-          <w:p>
-            <w:pPr>
-              <w:spacing w:before="40"/>
-              <w:rPr>
-                <w:rFonts w:eastAsia="標楷體"/>
-              </w:rPr>
-            </w:pPr>
-            <w:r>
-              <w:rPr>
-                <w:rFonts w:eastAsia="標楷體"/>
-              </w:rPr>
-              <w:t>5b. Developer 輸入 q：系統中止互動迴圈，輸出已處理部分的 partial report，exit code 1</w:t>
-            </w:r>
-          </w:p>
-          <w:p>
-            <w:pPr>
-              <w:spacing w:before="40"/>
-              <w:rPr>
-                <w:rFonts w:eastAsia="標楷體"/>
-              </w:rPr>
-            </w:pPr>
-            <w:r>
-              <w:rPr>
-                <w:rFonts w:eastAsia="標楷體"/>
-              </w:rPr>
-              <w:t>5c. Developer 輸入非法值（非 y/n/q）：系統輸出 Invalid input. Please enter y, n, or q:，重新等待輸入</w:t>
-            </w:r>
-          </w:p>
-          <w:p>
-            <w:pPr>
-              <w:spacing w:before="40"/>
-              <w:rPr>
-                <w:rFonts w:eastAsia="標楷體"/>
-              </w:rPr>
-            </w:pPr>
-            <w:r>
-              <w:rPr>
-                <w:rFonts w:eastAsia="標楷體"/>
-              </w:rPr>
-              <w:t>8a. 所有 Violation 均被 suppress（全部輸入 y）：報告顯示全部通過（含已抑制數量），exit code 0</w:t>
+              <w:t>*b. 磁碟寫入失敗（空間不足或無寫入權限）：系統拋出例外，錯誤向上傳遞至 UC-03 並輸出錯誤訊息</w:t>
             </w:r>
           </w:p>
         </w:tc>
@@ -7410,7 +7325,6 @@
                 <w:bCs/>
                 <w:color w:val="000000"/>
               </w:rPr>
-              <w:lastRenderedPageBreak/>
               <w:t>Special Requirements</w:t>
             </w:r>
           </w:p>
@@ -7441,21 +7355,7 @@
               <w:rPr>
                 <w:rFonts w:eastAsia="標楷體"/>
               </w:rPr>
-              <w:t>NFR-02（Usability）：互動提示須清晰易懂，Developer 無需查閱文件即能理解 [y/n/q] 各選項的含義</w:t>
-            </w:r>
-          </w:p>
-          <w:p>
-            <w:pPr>
-              <w:spacing w:before="40"/>
-              <w:rPr>
-                <w:rFonts w:eastAsia="標楷體"/>
-              </w:rPr>
-            </w:pPr>
-            <w:r>
-              <w:rPr>
-                <w:rFonts w:eastAsia="標楷體"/>
-              </w:rPr>
-              <w:t>NFR-06（Testability）：互動流程的合規性檢查邏輯必須可透過 unit test 獨立驗證，不依賴完整的 CLI 環境</w:t>
+              <w:t>NFR-03（Traceability）：每筆 Suppression 記錄須含 rule ID、file path、line number 及 ISO-8601 timestamp，以便日後稽核</w:t>
             </w:r>
           </w:p>
         </w:tc>
@@ -7491,7 +7391,7 @@
                 <w:bCs/>
                 <w:color w:val="000000"/>
               </w:rPr>
-              <w:t>Technology and Data Variations List</w:t>
+              <w:t>Technology and Data Variations</w:t>
             </w:r>
           </w:p>
         </w:tc>
@@ -7521,35 +7421,7 @@
               <w:rPr>
                 <w:rFonts w:eastAsia="標楷體"/>
               </w:rPr>
-              <w:t>*a. Suppression 記錄寫入 .arch-checker-suppress.yaml，包含：rule ID、reason（預設為 suppressed interactively）、timestamp</w:t>
-            </w:r>
-          </w:p>
-          <w:p>
-            <w:pPr>
-              <w:spacing w:before="40"/>
-              <w:rPr>
-                <w:rFonts w:eastAsia="標楷體"/>
-              </w:rPr>
-            </w:pPr>
-            <w:r>
-              <w:rPr>
-                <w:rFonts w:eastAsia="標楷體"/>
-              </w:rPr>
-              <w:t>4a. [y/n/q] 輸入大小寫不敏感（Y、Yes 均視為接受）</w:t>
-            </w:r>
-          </w:p>
-          <w:p>
-            <w:pPr>
-              <w:spacing w:before="40"/>
-              <w:rPr>
-                <w:rFonts w:eastAsia="標楷體"/>
-              </w:rPr>
-            </w:pPr>
-            <w:r>
-              <w:rPr>
-                <w:rFonts w:eastAsia="標楷體"/>
-              </w:rPr>
-              <w:t>*b. 若 stdout 被 pipe 重定向（non-TTY），系統自動降級為非互動批次模式並輸出警告</w:t>
+              <w:t>*a. Suppression 清單存於 YAML 格式（以 SnakeYAML 讀寫），預設路徑為 .arch-checker-suppress.yaml</w:t>
             </w:r>
           </w:p>
         </w:tc>
@@ -7615,7 +7487,7 @@
               <w:rPr>
                 <w:rFonts w:eastAsia="標楷體"/>
               </w:rPr>
-              <w:t>本地開發初次建立 suppression 清單時使用，通常每個新專案執行一次；後續違規出現時按需使用，整體低頻</w:t>
+              <w:t>每次 UC-03 互動迴圈中 Developer 選擇 y 時觸發；頻率取決於本次 ViolationReport 的違規數量與 Developer 的決策</w:t>
             </w:r>
           </w:p>
         </w:tc>
@@ -7681,66 +7553,12 @@
               <w:rPr>
                 <w:rFonts w:eastAsia="標楷體"/>
               </w:rPr>
-              <w:t>是否需要提供 --accept-all 選項，一次 suppress 所有 Violation？</w:t>
-            </w:r>
-          </w:p>
-          <w:p>
-            <w:pPr>
-              <w:spacing w:before="40"/>
-              <w:rPr>
-                <w:rFonts w:eastAsia="標楷體"/>
-              </w:rPr>
-            </w:pPr>
-            <w:r>
-              <w:rPr>
-                <w:rFonts w:eastAsia="標楷體"/>
-              </w:rPr>
-              <w:t>Suppression 是否應設有效期限，避免長期堆積技術債？</w:t>
+              <w:t>suppress 指令亦可由 Developer 直接執行以獨立觸發本 UC</w:t>
             </w:r>
           </w:p>
         </w:tc>
       </w:tr>
     </w:tbl>
-    <w:p>
-      <w:pPr>
-        <w:rPr>
-          <w:rFonts w:eastAsia="標楷體"/>
-        </w:rPr>
-      </w:pPr>
-    </w:p>
-    <w:p>
-      <w:pPr>
-        <w:spacing w:before="240" w:after="120"/>
-        <w:rPr>
-          <w:rFonts w:eastAsia="標楷體"/>
-        </w:rPr>
-      </w:pPr>
-      <w:r>
-        <w:rPr>
-          <w:rFonts w:eastAsia="標楷體"/>
-          <w:b/>
-          <w:bCs/>
-          <w:sz w:val="26"/>
-          <w:szCs w:val="26"/>
-        </w:rPr>
-        <w:t>UC-04: Suppress a Violation (Brief)</w:t>
-      </w:r>
-    </w:p>
-    <w:p>
-      <w:pPr>
-        <w:spacing w:before="60" w:after="60"/>
-        <w:jc w:val="both"/>
-        <w:rPr>
-          <w:rFonts w:eastAsia="標楷體"/>
-        </w:rPr>
-      </w:pPr>
-      <w:r>
-        <w:rPr>
-          <w:rFonts w:eastAsia="標楷體"/>
-        </w:rPr>
-        <w:t>Developer 發出抑制特定違規的要求，並提供 rule ID 與原因說明。系統將 suppression 記錄（rule ID、reason、timestamp）寫入 .arch-checker-suppress.yaml。下次執行 UC-01 時，於 Step 8 過濾生效。</w:t>
-      </w:r>
-    </w:p>
     <w:p>
       <w:pPr>
         <w:rPr>
@@ -13493,7 +13311,7 @@
       <w:r>
         <w:t xml:space="preserve">arch-checker 為單一使用者的 CLI 工具（無 GUI、無資料庫後端）。本節以 UML </w:t>
         <w:lastRenderedPageBreak/>
-        <w:t>package diagram 方式呈現 Iteration II 系統的組織架構，並說明各 package 之職責與相依方向。系統分為四個水平層：CLI 層使用 picocli 框架處理指令；Application 層定義業務邏輯與介面（CodeParser、ProfileLoader、SuppressionStore、Reporter）；Domain 層包含純粹的領域物件，無對外依賴；Infrastructure 層實作 Application 層所定義的 port 介面，遵循相依反轉原則（Dependency Inversion Principle）。Iteration II 於 CLI 層新增 FixCommand、ProfileCommand、ProfileInitCommand、ProfileValidateCommand，於 Application 層新增 InteractiveFixer、ProfileTemplateService、ProfileValidateService。</w:t>
+        <w:t>package diagram 方式呈現 Iteration II 系統的組織架構，並說明各 package 之職責與相依方向。系統分為四個水平層：CLI 層使用 picocli 框架處理指令；Application 層定義業務邏輯與介面（CodeParser、ProfileLoader、SuppressionStore、Reporter）；Domain 層包含純粹的領域物件，無對外依賴；Infrastructure 層實作 Application 層所定義的 port 介面，遵循相依反轉原則（Dependency Inversion Principle）。Iteration II 於 CLI 層新增 FixCommand、ProfileCommand、ProfileInitCommand、ProfileValidateCommand，其中 FixCommand 負責 UC-03 互動邏輯（顯示違規、讀取決策），並委派 SuppressionService 執行 suppress 流程；於 Application 層新增 ProfileTemplateService、ProfileValidateService、SuppressionService。</w:t>
       </w:r>
     </w:p>
     <w:p>
@@ -13567,13 +13385,12 @@
         <w:pStyle w:val="3"/>
       </w:pPr>
       <w:r>
-        <w:lastRenderedPageBreak/>
-        <w:t>3.2.1 System Sequence Diagram — UC-02 Define Style Profile</w:t>
-      </w:r>
-    </w:p>
-    <w:p>
-      <w:r>
-        <w:t>UC-02 為 Iteration II 最重要的新增使用案例。本節以 System Sequence Diagram（SSD）識別系統事件，共有兩個系統事件：initProfile(outputPath) 產生 YAML 範本檔，validateProfile(yamlPath) 驗證已編輯的 Profile 並回報成功載入的規則數量。</w:t>
+        <w:t>3.2.1 System Sequence Diagram — UC-01 Check Architecture Compliance</w:t>
+      </w:r>
+    </w:p>
+    <w:p>
+      <w:r>
+        <w:t>Developer 對 :System 發出單一系統事件 runCheck(projectPath, profilePath)，系統執行所有啟用的合規規則並回傳 ViolationReport，最終以 exitCode 結束程序。</w:t>
       </w:r>
     </w:p>
     <w:p>
@@ -13585,8 +13402,598 @@
           <w:noProof/>
         </w:rPr>
         <w:drawing>
+          <wp:inline distT="0" distB="0" distL="0" distR="0" wp14:anchorId="B1001001" wp14:editId="B1001002">
+            <wp:extent cx="5731510" cy="7940000"/>
+            <wp:effectExtent l="0" t="0" r="0" b="0"/>
+            <wp:docPr id="2001" name="Picture uc01_ssd"/>
+            <wp:cNvGraphicFramePr>
+              <a:graphicFrameLocks xmlns:a="http://schemas.openxmlformats.org/drawingml/2006/main" noChangeAspect="1"/>
+            </wp:cNvGraphicFramePr>
+            <a:graphic xmlns:a="http://schemas.openxmlformats.org/drawingml/2006/main">
+              <a:graphicData uri="http://schemas.openxmlformats.org/drawingml/2006/picture">
+                <pic:pic xmlns:pic="http://schemas.openxmlformats.org/drawingml/2006/picture">
+                  <pic:nvPicPr>
+                    <pic:cNvPr id="0" name="uc01_ssd.png"/>
+                    <pic:cNvPicPr/>
+                  </pic:nvPicPr>
+                  <pic:blipFill>
+                    <a:blip r:embed="rId19"/>
+                    <a:stretch>
+                      <a:fillRect/>
+                    </a:stretch>
+                  </pic:blipFill>
+                  <pic:spPr>
+                    <a:xfrm>
+                      <a:off x="0" y="0"/>
+                      <a:ext cx="5731510" cy="7940000"/>
+                    </a:xfrm>
+                    <a:prstGeom prst="rect">
+                      <a:avLst/>
+                    </a:prstGeom>
+                  </pic:spPr>
+                </pic:pic>
+              </a:graphicData>
+            </a:graphic>
+          </wp:inline>
+        </w:drawing>
+      </w:r>
+    </w:p>
+    <w:p>
+      <w:pPr>
+        <w:jc w:val="center"/>
+      </w:pPr>
+      <w:r>
+        <w:rPr>
+          <w:i/>
+          <w:sz w:val="20"/>
+        </w:rPr>
+        <w:t>圖 3-2.1 UC-01 Check Architecture Compliance — System Sequence Diagram</w:t>
+      </w:r>
+    </w:p>
+    <w:p>
+      <w:pPr>
+        <w:pStyle w:val="3"/>
+      </w:pPr>
+      <w:r>
+        <w:t>3.2.2 Sequence Diagram with GRASP Patterns — UC-01</w:t>
+      </w:r>
+    </w:p>
+    <w:p>
+      <w:r>
+        <w:t>系統事件：runCheck(projectPath, profilePath)</w:t>
+      </w:r>
+    </w:p>
+    <w:tbl>
+      <w:tblPr>
+        <w:tblW w:w="9026" w:type="dxa"/>
+        <w:tblInd w:w="283" w:type="dxa"/>
+        <w:tblBorders>
+          <w:top w:val="single" w:sz="4" w:space="0" w:color="auto"/>
+          <w:left w:val="single" w:sz="4" w:space="0" w:color="auto"/>
+          <w:bottom w:val="single" w:sz="4" w:space="0" w:color="auto"/>
+          <w:right w:val="single" w:sz="4" w:space="0" w:color="auto"/>
+          <w:insideH w:val="single" w:sz="4" w:space="0" w:color="auto"/>
+          <w:insideV w:val="single" w:sz="4" w:space="0" w:color="auto"/>
+        </w:tblBorders>
+        <w:tblLook w:val="04A0" w:firstRow="1" w:lastRow="0" w:firstColumn="1" w:lastColumn="0" w:noHBand="0" w:noVBand="1"/>
+      </w:tblPr>
+      <w:tblGrid>
+        <w:gridCol w:w="1900"/>
+        <w:gridCol w:w="3000"/>
+        <w:gridCol w:w="4126"/>
+      </w:tblGrid>
+      <w:tr>
+        <w:trPr>
+          <w:tblHeader/>
+        </w:trPr>
+        <w:tc>
+          <w:tcPr>
+            <w:tcW w:w="1900" w:type="dxa"/>
+            <w:tcBorders>
+              <w:top w:val="single" w:sz="1" w:space="0" w:color="555555"/>
+              <w:left w:val="single" w:sz="1" w:space="0" w:color="555555"/>
+              <w:bottom w:val="single" w:sz="1" w:space="0" w:color="555555"/>
+              <w:right w:val="single" w:sz="1" w:space="0" w:color="555555"/>
+            </w:tcBorders>
+            <w:shd w:val="clear" w:color="auto" w:fill="2E4057"/>
+            <w:tcMar>
+              <w:top w:w="80" w:type="dxa"/>
+              <w:left w:w="120" w:type="dxa"/>
+              <w:bottom w:w="80" w:type="dxa"/>
+              <w:right w:w="120" w:type="dxa"/>
+            </w:tcMar>
+          </w:tcPr>
+          <w:p>
+            <w:r>
+              <w:rPr>
+                <w:b/>
+                <w:bCs/>
+                <w:color w:val="FFFFFF"/>
+              </w:rPr>
+              <w:t>GRASP Pattern</w:t>
+            </w:r>
+          </w:p>
+        </w:tc>
+        <w:tc>
+          <w:tcPr>
+            <w:tcW w:w="3000" w:type="dxa"/>
+            <w:tcBorders>
+              <w:top w:val="single" w:sz="1" w:space="0" w:color="555555"/>
+              <w:left w:val="single" w:sz="1" w:space="0" w:color="555555"/>
+              <w:bottom w:val="single" w:sz="1" w:space="0" w:color="555555"/>
+              <w:right w:val="single" w:sz="1" w:space="0" w:color="555555"/>
+            </w:tcBorders>
+            <w:shd w:val="clear" w:color="auto" w:fill="2E4057"/>
+            <w:tcMar>
+              <w:top w:w="80" w:type="dxa"/>
+              <w:left w:w="120" w:type="dxa"/>
+              <w:bottom w:w="80" w:type="dxa"/>
+              <w:right w:w="120" w:type="dxa"/>
+            </w:tcMar>
+          </w:tcPr>
+          <w:p>
+            <w:r>
+              <w:rPr>
+                <w:b/>
+                <w:bCs/>
+                <w:color w:val="FFFFFF"/>
+              </w:rPr>
+              <w:t>套用對象</w:t>
+            </w:r>
+          </w:p>
+        </w:tc>
+        <w:tc>
+          <w:tcPr>
+            <w:tcW w:w="4126" w:type="dxa"/>
+            <w:tcBorders>
+              <w:top w:val="single" w:sz="1" w:space="0" w:color="555555"/>
+              <w:left w:val="single" w:sz="1" w:space="0" w:color="555555"/>
+              <w:bottom w:val="single" w:sz="1" w:space="0" w:color="555555"/>
+              <w:right w:val="single" w:sz="1" w:space="0" w:color="555555"/>
+            </w:tcBorders>
+            <w:shd w:val="clear" w:color="auto" w:fill="2E4057"/>
+            <w:tcMar>
+              <w:top w:w="80" w:type="dxa"/>
+              <w:left w:w="120" w:type="dxa"/>
+              <w:bottom w:w="80" w:type="dxa"/>
+              <w:right w:w="120" w:type="dxa"/>
+            </w:tcMar>
+          </w:tcPr>
+          <w:p>
+            <w:r>
+              <w:rPr>
+                <w:b/>
+                <w:bCs/>
+                <w:color w:val="FFFFFF"/>
+              </w:rPr>
+              <w:t>Rationale</w:t>
+            </w:r>
+          </w:p>
+        </w:tc>
+      </w:tr>
+      <w:tr>
+        <w:tc>
+          <w:tcPr>
+            <w:tcW w:w="1900" w:type="dxa"/>
+            <w:tcBorders>
+              <w:top w:val="single" w:sz="1" w:space="0" w:color="AAAAAA"/>
+              <w:left w:val="single" w:sz="1" w:space="0" w:color="AAAAAA"/>
+              <w:bottom w:val="single" w:sz="1" w:space="0" w:color="AAAAAA"/>
+              <w:right w:val="single" w:sz="1" w:space="0" w:color="AAAAAA"/>
+            </w:tcBorders>
+            <w:tcMar>
+              <w:top w:w="80" w:type="dxa"/>
+              <w:left w:w="120" w:type="dxa"/>
+              <w:bottom w:w="80" w:type="dxa"/>
+              <w:right w:w="120" w:type="dxa"/>
+            </w:tcMar>
+          </w:tcPr>
+          <w:p>
+            <w:r>
+              <w:t>Controller</w:t>
+            </w:r>
+          </w:p>
+        </w:tc>
+        <w:tc>
+          <w:tcPr>
+            <w:tcW w:w="3000" w:type="dxa"/>
+            <w:tcBorders>
+              <w:top w:val="single" w:sz="1" w:space="0" w:color="AAAAAA"/>
+              <w:left w:val="single" w:sz="1" w:space="0" w:color="AAAAAA"/>
+              <w:bottom w:val="single" w:sz="1" w:space="0" w:color="AAAAAA"/>
+              <w:right w:val="single" w:sz="1" w:space="0" w:color="AAAAAA"/>
+            </w:tcBorders>
+            <w:tcMar>
+              <w:top w:w="80" w:type="dxa"/>
+              <w:left w:w="120" w:type="dxa"/>
+              <w:bottom w:w="80" w:type="dxa"/>
+              <w:right w:w="120" w:type="dxa"/>
+            </w:tcMar>
+          </w:tcPr>
+          <w:p>
+            <w:r>
+              <w:t>:CheckCommand</w:t>
+            </w:r>
+          </w:p>
+        </w:tc>
+        <w:tc>
+          <w:tcPr>
+            <w:tcW w:w="4126" w:type="dxa"/>
+            <w:tcBorders>
+              <w:top w:val="single" w:sz="1" w:space="0" w:color="AAAAAA"/>
+              <w:left w:val="single" w:sz="1" w:space="0" w:color="AAAAAA"/>
+              <w:bottom w:val="single" w:sz="1" w:space="0" w:color="AAAAAA"/>
+              <w:right w:val="single" w:sz="1" w:space="0" w:color="AAAAAA"/>
+            </w:tcBorders>
+            <w:tcMar>
+              <w:top w:w="80" w:type="dxa"/>
+              <w:left w:w="120" w:type="dxa"/>
+              <w:bottom w:w="80" w:type="dxa"/>
+              <w:right w:w="120" w:type="dxa"/>
+            </w:tcMar>
+          </w:tcPr>
+          <w:p>
+            <w:r>
+              <w:t>接收 CLI 系統事件 runCheck(...)，作為 UC-01 use case controller</w:t>
+            </w:r>
+          </w:p>
+        </w:tc>
+      </w:tr>
+      <w:tr>
+        <w:tc>
+          <w:tcPr>
+            <w:tcW w:w="1900" w:type="dxa"/>
+            <w:tcBorders>
+              <w:top w:val="single" w:sz="1" w:space="0" w:color="AAAAAA"/>
+              <w:left w:val="single" w:sz="1" w:space="0" w:color="AAAAAA"/>
+              <w:bottom w:val="single" w:sz="1" w:space="0" w:color="AAAAAA"/>
+              <w:right w:val="single" w:sz="1" w:space="0" w:color="AAAAAA"/>
+            </w:tcBorders>
+            <w:tcMar>
+              <w:top w:w="80" w:type="dxa"/>
+              <w:left w:w="120" w:type="dxa"/>
+              <w:bottom w:w="80" w:type="dxa"/>
+              <w:right w:w="120" w:type="dxa"/>
+            </w:tcMar>
+          </w:tcPr>
+          <w:p>
+            <w:r>
+              <w:t>Pure Fabrication</w:t>
+            </w:r>
+          </w:p>
+        </w:tc>
+        <w:tc>
+          <w:tcPr>
+            <w:tcW w:w="3000" w:type="dxa"/>
+            <w:tcBorders>
+              <w:top w:val="single" w:sz="1" w:space="0" w:color="AAAAAA"/>
+              <w:left w:val="single" w:sz="1" w:space="0" w:color="AAAAAA"/>
+              <w:bottom w:val="single" w:sz="1" w:space="0" w:color="AAAAAA"/>
+              <w:right w:val="single" w:sz="1" w:space="0" w:color="AAAAAA"/>
+            </w:tcBorders>
+            <w:tcMar>
+              <w:top w:w="80" w:type="dxa"/>
+              <w:left w:w="120" w:type="dxa"/>
+              <w:bottom w:w="80" w:type="dxa"/>
+              <w:right w:w="120" w:type="dxa"/>
+            </w:tcMar>
+          </w:tcPr>
+          <w:p>
+            <w:r>
+              <w:t>:ComplianceCheckService、:ProfileLoader、:JavaParserAdapter</w:t>
+            </w:r>
+          </w:p>
+        </w:tc>
+        <w:tc>
+          <w:tcPr>
+            <w:tcW w:w="4126" w:type="dxa"/>
+            <w:tcBorders>
+              <w:top w:val="single" w:sz="1" w:space="0" w:color="AAAAAA"/>
+              <w:left w:val="single" w:sz="1" w:space="0" w:color="AAAAAA"/>
+              <w:bottom w:val="single" w:sz="1" w:space="0" w:color="AAAAAA"/>
+              <w:right w:val="single" w:sz="1" w:space="0" w:color="AAAAAA"/>
+            </w:tcBorders>
+            <w:tcMar>
+              <w:top w:w="80" w:type="dxa"/>
+              <w:left w:w="120" w:type="dxa"/>
+              <w:bottom w:w="80" w:type="dxa"/>
+              <w:right w:w="120" w:type="dxa"/>
+            </w:tcMar>
+          </w:tcPr>
+          <w:p>
+            <w:r>
+              <w:t>為協調 use case 流程或封裝技術細節而建立的非 domain 物件</w:t>
+            </w:r>
+          </w:p>
+        </w:tc>
+      </w:tr>
+      <w:tr>
+        <w:tc>
+          <w:tcPr>
+            <w:tcW w:w="1900" w:type="dxa"/>
+            <w:tcBorders>
+              <w:top w:val="single" w:sz="1" w:space="0" w:color="AAAAAA"/>
+              <w:left w:val="single" w:sz="1" w:space="0" w:color="AAAAAA"/>
+              <w:bottom w:val="single" w:sz="1" w:space="0" w:color="AAAAAA"/>
+              <w:right w:val="single" w:sz="1" w:space="0" w:color="AAAAAA"/>
+            </w:tcBorders>
+            <w:tcMar>
+              <w:top w:w="80" w:type="dxa"/>
+              <w:left w:w="120" w:type="dxa"/>
+              <w:bottom w:w="80" w:type="dxa"/>
+              <w:right w:w="120" w:type="dxa"/>
+            </w:tcMar>
+          </w:tcPr>
+          <w:p>
+            <w:r>
+              <w:t>Polymorphism</w:t>
+            </w:r>
+          </w:p>
+        </w:tc>
+        <w:tc>
+          <w:tcPr>
+            <w:tcW w:w="3000" w:type="dxa"/>
+            <w:tcBorders>
+              <w:top w:val="single" w:sz="1" w:space="0" w:color="AAAAAA"/>
+              <w:left w:val="single" w:sz="1" w:space="0" w:color="AAAAAA"/>
+              <w:bottom w:val="single" w:sz="1" w:space="0" w:color="AAAAAA"/>
+              <w:right w:val="single" w:sz="1" w:space="0" w:color="AAAAAA"/>
+            </w:tcBorders>
+            <w:tcMar>
+              <w:top w:w="80" w:type="dxa"/>
+              <w:left w:w="120" w:type="dxa"/>
+              <w:bottom w:w="80" w:type="dxa"/>
+              <w:right w:w="120" w:type="dxa"/>
+            </w:tcMar>
+          </w:tcPr>
+          <w:p>
+            <w:r>
+              <w:t>rule:ComplianceRule + 4 Rule 子型別</w:t>
+            </w:r>
+          </w:p>
+        </w:tc>
+        <w:tc>
+          <w:tcPr>
+            <w:tcW w:w="4126" w:type="dxa"/>
+            <w:tcBorders>
+              <w:top w:val="single" w:sz="1" w:space="0" w:color="AAAAAA"/>
+              <w:left w:val="single" w:sz="1" w:space="0" w:color="AAAAAA"/>
+              <w:bottom w:val="single" w:sz="1" w:space="0" w:color="AAAAAA"/>
+              <w:right w:val="single" w:sz="1" w:space="0" w:color="AAAAAA"/>
+            </w:tcBorders>
+            <w:tcMar>
+              <w:top w:w="80" w:type="dxa"/>
+              <w:left w:w="120" w:type="dxa"/>
+              <w:bottom w:w="80" w:type="dxa"/>
+              <w:right w:w="120" w:type="dxa"/>
+            </w:tcMar>
+          </w:tcPr>
+          <w:p>
+            <w:r>
+              <w:t>4 種架構規則檢查邏輯由 validate(files) 動態分派</w:t>
+            </w:r>
+          </w:p>
+        </w:tc>
+      </w:tr>
+      <w:tr>
+        <w:tc>
+          <w:tcPr>
+            <w:tcW w:w="1900" w:type="dxa"/>
+            <w:tcBorders>
+              <w:top w:val="single" w:sz="1" w:space="0" w:color="AAAAAA"/>
+              <w:left w:val="single" w:sz="1" w:space="0" w:color="AAAAAA"/>
+              <w:bottom w:val="single" w:sz="1" w:space="0" w:color="AAAAAA"/>
+              <w:right w:val="single" w:sz="1" w:space="0" w:color="AAAAAA"/>
+            </w:tcBorders>
+            <w:tcMar>
+              <w:top w:w="80" w:type="dxa"/>
+              <w:left w:w="120" w:type="dxa"/>
+              <w:bottom w:w="80" w:type="dxa"/>
+              <w:right w:w="120" w:type="dxa"/>
+            </w:tcMar>
+          </w:tcPr>
+          <w:p>
+            <w:r>
+              <w:t>Information Expert</w:t>
+            </w:r>
+          </w:p>
+        </w:tc>
+        <w:tc>
+          <w:tcPr>
+            <w:tcW w:w="3000" w:type="dxa"/>
+            <w:tcBorders>
+              <w:top w:val="single" w:sz="1" w:space="0" w:color="AAAAAA"/>
+              <w:left w:val="single" w:sz="1" w:space="0" w:color="AAAAAA"/>
+              <w:bottom w:val="single" w:sz="1" w:space="0" w:color="AAAAAA"/>
+              <w:right w:val="single" w:sz="1" w:space="0" w:color="AAAAAA"/>
+            </w:tcBorders>
+            <w:tcMar>
+              <w:top w:w="80" w:type="dxa"/>
+              <w:left w:w="120" w:type="dxa"/>
+              <w:bottom w:w="80" w:type="dxa"/>
+              <w:right w:w="120" w:type="dxa"/>
+            </w:tcMar>
+          </w:tcPr>
+          <w:p>
+            <w:r>
+              <w:t>:SuppressionStore</w:t>
+            </w:r>
+          </w:p>
+        </w:tc>
+        <w:tc>
+          <w:tcPr>
+            <w:tcW w:w="4126" w:type="dxa"/>
+            <w:tcBorders>
+              <w:top w:val="single" w:sz="1" w:space="0" w:color="AAAAAA"/>
+              <w:left w:val="single" w:sz="1" w:space="0" w:color="AAAAAA"/>
+              <w:bottom w:val="single" w:sz="1" w:space="0" w:color="AAAAAA"/>
+              <w:right w:val="single" w:sz="1" w:space="0" w:color="AAAAAA"/>
+            </w:tcBorders>
+            <w:tcMar>
+              <w:top w:w="80" w:type="dxa"/>
+              <w:left w:w="120" w:type="dxa"/>
+              <w:bottom w:w="80" w:type="dxa"/>
+              <w:right w:w="120" w:type="dxa"/>
+            </w:tcMar>
+          </w:tcPr>
+          <w:p>
+            <w:r>
+              <w:t>擁有抑制清單持久化資訊</w:t>
+            </w:r>
+          </w:p>
+        </w:tc>
+      </w:tr>
+      <w:tr>
+        <w:tc>
+          <w:tcPr>
+            <w:tcW w:w="1900" w:type="dxa"/>
+            <w:tcBorders>
+              <w:top w:val="single" w:sz="1" w:space="0" w:color="AAAAAA"/>
+              <w:left w:val="single" w:sz="1" w:space="0" w:color="AAAAAA"/>
+              <w:bottom w:val="single" w:sz="1" w:space="0" w:color="AAAAAA"/>
+              <w:right w:val="single" w:sz="1" w:space="0" w:color="AAAAAA"/>
+            </w:tcBorders>
+            <w:tcMar>
+              <w:top w:w="80" w:type="dxa"/>
+              <w:left w:w="120" w:type="dxa"/>
+              <w:bottom w:w="80" w:type="dxa"/>
+              <w:right w:w="120" w:type="dxa"/>
+            </w:tcMar>
+          </w:tcPr>
+          <w:p>
+            <w:r>
+              <w:t>Low Coupling</w:t>
+            </w:r>
+          </w:p>
+        </w:tc>
+        <w:tc>
+          <w:tcPr>
+            <w:tcW w:w="3000" w:type="dxa"/>
+            <w:tcBorders>
+              <w:top w:val="single" w:sz="1" w:space="0" w:color="AAAAAA"/>
+              <w:left w:val="single" w:sz="1" w:space="0" w:color="AAAAAA"/>
+              <w:bottom w:val="single" w:sz="1" w:space="0" w:color="AAAAAA"/>
+              <w:right w:val="single" w:sz="1" w:space="0" w:color="AAAAAA"/>
+            </w:tcBorders>
+            <w:tcMar>
+              <w:top w:w="80" w:type="dxa"/>
+              <w:left w:w="120" w:type="dxa"/>
+              <w:bottom w:w="80" w:type="dxa"/>
+              <w:right w:w="120" w:type="dxa"/>
+            </w:tcMar>
+          </w:tcPr>
+          <w:p>
+            <w:r>
+              <w:t>:JavaParserAdapter、:SuppressionStore、:Reporter</w:t>
+            </w:r>
+          </w:p>
+        </w:tc>
+        <w:tc>
+          <w:tcPr>
+            <w:tcW w:w="4126" w:type="dxa"/>
+            <w:tcBorders>
+              <w:top w:val="single" w:sz="1" w:space="0" w:color="AAAAAA"/>
+              <w:left w:val="single" w:sz="1" w:space="0" w:color="AAAAAA"/>
+              <w:bottom w:val="single" w:sz="1" w:space="0" w:color="AAAAAA"/>
+              <w:right w:val="single" w:sz="1" w:space="0" w:color="AAAAAA"/>
+            </w:tcBorders>
+            <w:tcMar>
+              <w:top w:w="80" w:type="dxa"/>
+              <w:left w:w="120" w:type="dxa"/>
+              <w:bottom w:w="80" w:type="dxa"/>
+              <w:right w:w="120" w:type="dxa"/>
+            </w:tcMar>
+          </w:tcPr>
+          <w:p>
+            <w:r>
+              <w:t>以 port/adapter 隔離第三方解析器、持久化及輸出細節，Service 不直接依賴具體實作</w:t>
+            </w:r>
+          </w:p>
+        </w:tc>
+      </w:tr>
+    </w:tbl>
+    <w:p>
+      <w:pPr>
+        <w:jc w:val="center"/>
+      </w:pPr>
+      <w:r>
+        <w:rPr>
+          <w:noProof/>
+        </w:rPr>
+        <w:drawing>
+          <wp:inline distT="0" distB="0" distL="0" distR="0" wp14:anchorId="B1001003" wp14:editId="B1001004">
+            <wp:extent cx="4602156" cy="8229600"/>
+            <wp:effectExtent l="0" t="0" r="0" b="0"/>
+            <wp:docPr id="2002" name="Picture uc01_sd"/>
+            <wp:cNvGraphicFramePr>
+              <a:graphicFrameLocks xmlns:a="http://schemas.openxmlformats.org/drawingml/2006/main" noChangeAspect="1"/>
+            </wp:cNvGraphicFramePr>
+            <a:graphic xmlns:a="http://schemas.openxmlformats.org/drawingml/2006/main">
+              <a:graphicData uri="http://schemas.openxmlformats.org/drawingml/2006/picture">
+                <pic:pic xmlns:pic="http://schemas.openxmlformats.org/drawingml/2006/picture">
+                  <pic:nvPicPr>
+                    <pic:cNvPr id="0" name="uc01_sd.png"/>
+                    <pic:cNvPicPr/>
+                  </pic:nvPicPr>
+                  <pic:blipFill>
+                    <a:blip r:embed="rId20"/>
+                    <a:stretch>
+                      <a:fillRect/>
+                    </a:stretch>
+                  </pic:blipFill>
+                  <pic:spPr>
+                    <a:xfrm>
+                      <a:off x="0" y="0"/>
+                      <a:ext cx="4602156" cy="8229600"/>
+                    </a:xfrm>
+                    <a:prstGeom prst="rect">
+                      <a:avLst/>
+                    </a:prstGeom>
+                  </pic:spPr>
+                </pic:pic>
+              </a:graphicData>
+            </a:graphic>
+          </wp:inline>
+        </w:drawing>
+      </w:r>
+    </w:p>
+    <w:p>
+      <w:pPr>
+        <w:jc w:val="center"/>
+      </w:pPr>
+      <w:r>
+        <w:rPr>
+          <w:i/>
+          <w:sz w:val="20"/>
+        </w:rPr>
+        <w:t>圖 3-2.2 SD for runCheck()（標示 GRASP 模式）</w:t>
+      </w:r>
+    </w:p>
+    <w:p>
+      <w:pPr>
+        <w:pStyle w:val="3"/>
+      </w:pPr>
+      <w:r>
+        <w:lastRenderedPageBreak/>
+        <w:t>3.2.3 System Sequence Diagram — UC-02 Define Style Profile [new]</w:t>
+      </w:r>
+    </w:p>
+    <w:p>
+      <w:r>
+        <w:t>UC-02 為 Iteration II 最重要的新增使用案例。本節以 System Sequence Diagram（SSD）識別系統事件：initProfile(outputPath) 產生 YAML 範本檔供開發者編輯，Profile 的驗證與載入由 UC-05（Load Style Profile）負責，UC-02 不重複此職責。</w:t>
+      </w:r>
+    </w:p>
+    <w:p>
+      <w:pPr>
+        <w:jc w:val="center"/>
+      </w:pPr>
+      <w:r>
+        <w:rPr>
+          <w:noProof/>
+        </w:rPr>
+        <w:drawing>
           <wp:inline distT="0" distB="0" distL="0" distR="0" wp14:anchorId="797F4699" wp14:editId="22C45891">
-            <wp:extent cx="5486400" cy="4027413"/>
+            <wp:extent cx="5486400" cy="2447363"/>
             <wp:effectExtent l="0" t="0" r="0" b="0"/>
             <wp:docPr id="1004587704" name="Picture 1473456421"/>
             <wp:cNvGraphicFramePr>
@@ -13608,7 +14015,7 @@
                   <pic:spPr>
                     <a:xfrm>
                       <a:off x="0" y="0"/>
-                      <a:ext cx="5486400" cy="4027413"/>
+                      <a:ext cx="5486400" cy="2447363"/>
                     </a:xfrm>
                     <a:prstGeom prst="rect">
                       <a:avLst/>
@@ -13630,7 +14037,7 @@
           <w:i/>
           <w:sz w:val="20"/>
         </w:rPr>
-        <w:t>圖 3-2.1 UC-02 Define Style Profile — System Sequence Diagram</w:t>
+        <w:t>圖 3-2.3 UC-02 Define Style Profile — System Sequence Diagram</w:t>
       </w:r>
     </w:p>
     <w:p>
@@ -13638,7 +14045,7 @@
         <w:pStyle w:val="3"/>
       </w:pPr>
       <w:r>
-        <w:t>3.2.2 Sequence Diagrams with GRASP Patterns</w:t>
+        <w:t>3.2.4 Sequence Diagrams with GRASP Patterns — UC-02 [new]</w:t>
       </w:r>
     </w:p>
     <w:p>
@@ -14008,390 +14415,22 @@
           <w:i/>
           <w:sz w:val="20"/>
         </w:rPr>
-        <w:t>圖 3-2.2a SD for initProfile()（標示 GRASP 模式）</w:t>
-      </w:r>
-    </w:p>
-    <w:p/>
-    <w:p>
-      <w:r>
-        <w:t>系統事件 2：validateProfile(yamlPath)</w:t>
-      </w:r>
-    </w:p>
-    <w:tbl>
-      <w:tblPr>
-        <w:tblW w:w="9026" w:type="dxa"/>
-        <w:tblBorders>
-          <w:top w:val="single" w:sz="4" w:space="0" w:color="auto"/>
-          <w:left w:val="single" w:sz="4" w:space="0" w:color="auto"/>
-          <w:bottom w:val="single" w:sz="4" w:space="0" w:color="auto"/>
-          <w:right w:val="single" w:sz="4" w:space="0" w:color="auto"/>
-          <w:insideH w:val="single" w:sz="4" w:space="0" w:color="auto"/>
-          <w:insideV w:val="single" w:sz="4" w:space="0" w:color="auto"/>
-        </w:tblBorders>
-        <w:tblLook w:val="04A0" w:firstRow="1" w:lastRow="0" w:firstColumn="1" w:lastColumn="0" w:noHBand="0" w:noVBand="1"/>
-      </w:tblPr>
-      <w:tr>
-        <w:trPr>
-          <w:tblHeader/>
-        </w:trPr>
-        <w:tc>
-          <w:tcPr>
-            <w:tcW w:w="1900" w:type="dxa"/>
-            <w:tcBorders>
-              <w:top w:val="single" w:sz="1" w:space="0" w:color="555555"/>
-              <w:left w:val="single" w:sz="1" w:space="0" w:color="555555"/>
-              <w:bottom w:val="single" w:sz="1" w:space="0" w:color="555555"/>
-              <w:right w:val="single" w:sz="1" w:space="0" w:color="555555"/>
-            </w:tcBorders>
-            <w:shd w:val="clear" w:color="auto" w:fill="2E4057"/>
-            <w:tcMar>
-              <w:top w:w="80" w:type="dxa"/>
-              <w:left w:w="120" w:type="dxa"/>
-              <w:bottom w:w="80" w:type="dxa"/>
-              <w:right w:w="120" w:type="dxa"/>
-            </w:tcMar>
-          </w:tcPr>
-          <w:p>
-            <w:r>
-              <w:rPr>
-                <w:b/>
-                <w:bCs/>
-                <w:color w:val="FFFFFF"/>
-              </w:rPr>
-              <w:t>GRASP Pattern</w:t>
-            </w:r>
-          </w:p>
-        </w:tc>
-        <w:tc>
-          <w:tcPr>
-            <w:tcW w:w="2700" w:type="dxa"/>
-            <w:tcBorders>
-              <w:top w:val="single" w:sz="1" w:space="0" w:color="555555"/>
-              <w:left w:val="single" w:sz="1" w:space="0" w:color="555555"/>
-              <w:bottom w:val="single" w:sz="1" w:space="0" w:color="555555"/>
-              <w:right w:val="single" w:sz="1" w:space="0" w:color="555555"/>
-            </w:tcBorders>
-            <w:shd w:val="clear" w:color="auto" w:fill="2E4057"/>
-            <w:tcMar>
-              <w:top w:w="80" w:type="dxa"/>
-              <w:left w:w="120" w:type="dxa"/>
-              <w:bottom w:w="80" w:type="dxa"/>
-              <w:right w:w="120" w:type="dxa"/>
-            </w:tcMar>
-          </w:tcPr>
-          <w:p>
-            <w:r>
-              <w:rPr>
-                <w:b/>
-                <w:bCs/>
-                <w:color w:val="FFFFFF"/>
-              </w:rPr>
-              <w:t>套用對象</w:t>
-            </w:r>
-          </w:p>
-        </w:tc>
-        <w:tc>
-          <w:tcPr>
-            <w:tcW w:w="4426" w:type="dxa"/>
-            <w:tcBorders>
-              <w:top w:val="single" w:sz="1" w:space="0" w:color="555555"/>
-              <w:left w:val="single" w:sz="1" w:space="0" w:color="555555"/>
-              <w:bottom w:val="single" w:sz="1" w:space="0" w:color="555555"/>
-              <w:right w:val="single" w:sz="1" w:space="0" w:color="555555"/>
-            </w:tcBorders>
-            <w:shd w:val="clear" w:color="auto" w:fill="2E4057"/>
-            <w:tcMar>
-              <w:top w:w="80" w:type="dxa"/>
-              <w:left w:w="120" w:type="dxa"/>
-              <w:bottom w:w="80" w:type="dxa"/>
-              <w:right w:w="120" w:type="dxa"/>
-            </w:tcMar>
-          </w:tcPr>
-          <w:p>
-            <w:r>
-              <w:rPr>
-                <w:b/>
-                <w:bCs/>
-                <w:color w:val="FFFFFF"/>
-              </w:rPr>
-              <w:t>Rationale</w:t>
-            </w:r>
-          </w:p>
-        </w:tc>
-      </w:tr>
-      <w:tr>
-        <w:tc>
-          <w:tcPr>
-            <w:tcW w:w="1900" w:type="dxa"/>
-            <w:tcBorders>
-              <w:top w:val="single" w:sz="1" w:space="0" w:color="AAAAAA"/>
-              <w:left w:val="single" w:sz="1" w:space="0" w:color="AAAAAA"/>
-              <w:bottom w:val="single" w:sz="1" w:space="0" w:color="AAAAAA"/>
-              <w:right w:val="single" w:sz="1" w:space="0" w:color="AAAAAA"/>
-            </w:tcBorders>
-            <w:tcMar>
-              <w:top w:w="80" w:type="dxa"/>
-              <w:left w:w="120" w:type="dxa"/>
-              <w:bottom w:w="80" w:type="dxa"/>
-              <w:right w:w="120" w:type="dxa"/>
-            </w:tcMar>
-          </w:tcPr>
-          <w:p>
-            <w:r>
-              <w:t xml:space="preserve">Controller</w:t>
-            </w:r>
-          </w:p>
-        </w:tc>
-        <w:tc>
-          <w:tcPr>
-            <w:tcW w:w="2700" w:type="dxa"/>
-            <w:tcBorders>
-              <w:top w:val="single" w:sz="1" w:space="0" w:color="AAAAAA"/>
-              <w:left w:val="single" w:sz="1" w:space="0" w:color="AAAAAA"/>
-              <w:bottom w:val="single" w:sz="1" w:space="0" w:color="AAAAAA"/>
-              <w:right w:val="single" w:sz="1" w:space="0" w:color="AAAAAA"/>
-            </w:tcBorders>
-            <w:tcMar>
-              <w:top w:w="80" w:type="dxa"/>
-              <w:left w:w="120" w:type="dxa"/>
-              <w:bottom w:w="80" w:type="dxa"/>
-              <w:right w:w="120" w:type="dxa"/>
-            </w:tcMar>
-          </w:tcPr>
-          <w:p>
-            <w:r>
-              <w:t xml:space="preserve">:ProfileValidateCommand</w:t>
-            </w:r>
-          </w:p>
-        </w:tc>
-        <w:tc>
-          <w:tcPr>
-            <w:tcW w:w="4426" w:type="dxa"/>
-            <w:tcBorders>
-              <w:top w:val="single" w:sz="1" w:space="0" w:color="AAAAAA"/>
-              <w:left w:val="single" w:sz="1" w:space="0" w:color="AAAAAA"/>
-              <w:bottom w:val="single" w:sz="1" w:space="0" w:color="AAAAAA"/>
-              <w:right w:val="single" w:sz="1" w:space="0" w:color="AAAAAA"/>
-            </w:tcBorders>
-            <w:tcMar>
-              <w:top w:w="80" w:type="dxa"/>
-              <w:left w:w="120" w:type="dxa"/>
-              <w:bottom w:w="80" w:type="dxa"/>
-              <w:right w:w="120" w:type="dxa"/>
-            </w:tcMar>
-          </w:tcPr>
-          <w:p>
-            <w:r>
-              <w:t xml:space="preserve">接收 validateProfile(yamlPath) 系統事件，作為 UC-02 use case controller。</w:t>
-            </w:r>
-          </w:p>
-        </w:tc>
-      </w:tr>
-      <w:tr>
-        <w:tc>
-          <w:tcPr>
-            <w:tcW w:w="1900" w:type="dxa"/>
-            <w:tcBorders>
-              <w:top w:val="single" w:sz="1" w:space="0" w:color="AAAAAA"/>
-              <w:left w:val="single" w:sz="1" w:space="0" w:color="AAAAAA"/>
-              <w:bottom w:val="single" w:sz="1" w:space="0" w:color="AAAAAA"/>
-              <w:right w:val="single" w:sz="1" w:space="0" w:color="AAAAAA"/>
-            </w:tcBorders>
-            <w:tcMar>
-              <w:top w:w="80" w:type="dxa"/>
-              <w:left w:w="120" w:type="dxa"/>
-              <w:bottom w:w="80" w:type="dxa"/>
-              <w:right w:w="120" w:type="dxa"/>
-            </w:tcMar>
-          </w:tcPr>
-          <w:p>
-            <w:r>
-              <w:t xml:space="preserve">Pure Fabrication</w:t>
-            </w:r>
-          </w:p>
-        </w:tc>
-        <w:tc>
-          <w:tcPr>
-            <w:tcW w:w="2700" w:type="dxa"/>
-            <w:tcBorders>
-              <w:top w:val="single" w:sz="1" w:space="0" w:color="AAAAAA"/>
-              <w:left w:val="single" w:sz="1" w:space="0" w:color="AAAAAA"/>
-              <w:bottom w:val="single" w:sz="1" w:space="0" w:color="AAAAAA"/>
-              <w:right w:val="single" w:sz="1" w:space="0" w:color="AAAAAA"/>
-            </w:tcBorders>
-            <w:tcMar>
-              <w:top w:w="80" w:type="dxa"/>
-              <w:left w:w="120" w:type="dxa"/>
-              <w:bottom w:w="80" w:type="dxa"/>
-              <w:right w:w="120" w:type="dxa"/>
-            </w:tcMar>
-          </w:tcPr>
-          <w:p>
-            <w:r>
-              <w:t xml:space="preserve">:YamlProfileLoader</w:t>
-            </w:r>
-          </w:p>
-        </w:tc>
-        <w:tc>
-          <w:tcPr>
-            <w:tcW w:w="4426" w:type="dxa"/>
-            <w:tcBorders>
-              <w:top w:val="single" w:sz="1" w:space="0" w:color="AAAAAA"/>
-              <w:left w:val="single" w:sz="1" w:space="0" w:color="AAAAAA"/>
-              <w:bottom w:val="single" w:sz="1" w:space="0" w:color="AAAAAA"/>
-              <w:right w:val="single" w:sz="1" w:space="0" w:color="AAAAAA"/>
-            </w:tcBorders>
-            <w:tcMar>
-              <w:top w:w="80" w:type="dxa"/>
-              <w:left w:w="120" w:type="dxa"/>
-              <w:bottom w:w="80" w:type="dxa"/>
-              <w:right w:w="120" w:type="dxa"/>
-            </w:tcMar>
-          </w:tcPr>
-          <w:p>
-            <w:r>
-              <w:t xml:space="preserve">Domain Model 無「載入 YAML 設定檔」概念，為封裝 YAML 解析細節而建立。</w:t>
-            </w:r>
-          </w:p>
-        </w:tc>
-      </w:tr>
-      <w:tr>
-        <w:tc>
-          <w:tcPr>
-            <w:tcW w:w="1900" w:type="dxa"/>
-            <w:tcBorders>
-              <w:top w:val="single" w:sz="1" w:space="0" w:color="AAAAAA"/>
-              <w:left w:val="single" w:sz="1" w:space="0" w:color="AAAAAA"/>
-              <w:bottom w:val="single" w:sz="1" w:space="0" w:color="AAAAAA"/>
-              <w:right w:val="single" w:sz="1" w:space="0" w:color="AAAAAA"/>
-            </w:tcBorders>
-            <w:tcMar>
-              <w:top w:w="80" w:type="dxa"/>
-              <w:left w:w="120" w:type="dxa"/>
-              <w:bottom w:w="80" w:type="dxa"/>
-              <w:right w:w="120" w:type="dxa"/>
-            </w:tcMar>
-          </w:tcPr>
-          <w:p>
-            <w:r>
-              <w:t xml:space="preserve">Information Expert</w:t>
-            </w:r>
-          </w:p>
-        </w:tc>
-        <w:tc>
-          <w:tcPr>
-            <w:tcW w:w="2700" w:type="dxa"/>
-            <w:tcBorders>
-              <w:top w:val="single" w:sz="1" w:space="0" w:color="AAAAAA"/>
-              <w:left w:val="single" w:sz="1" w:space="0" w:color="AAAAAA"/>
-              <w:bottom w:val="single" w:sz="1" w:space="0" w:color="AAAAAA"/>
-              <w:right w:val="single" w:sz="1" w:space="0" w:color="AAAAAA"/>
-            </w:tcBorders>
-            <w:tcMar>
-              <w:top w:w="80" w:type="dxa"/>
-              <w:left w:w="120" w:type="dxa"/>
-              <w:bottom w:w="80" w:type="dxa"/>
-              <w:right w:w="120" w:type="dxa"/>
-            </w:tcMar>
-          </w:tcPr>
-          <w:p>
-            <w:r>
-              <w:t xml:space="preserve">:ProfileValidateService</w:t>
-            </w:r>
-          </w:p>
-        </w:tc>
-        <w:tc>
-          <w:tcPr>
-            <w:tcW w:w="4426" w:type="dxa"/>
-            <w:tcBorders>
-              <w:top w:val="single" w:sz="1" w:space="0" w:color="AAAAAA"/>
-              <w:left w:val="single" w:sz="1" w:space="0" w:color="AAAAAA"/>
-              <w:bottom w:val="single" w:sz="1" w:space="0" w:color="AAAAAA"/>
-              <w:right w:val="single" w:sz="1" w:space="0" w:color="AAAAAA"/>
-            </w:tcBorders>
-            <w:tcMar>
-              <w:top w:w="80" w:type="dxa"/>
-              <w:left w:w="120" w:type="dxa"/>
-              <w:bottom w:w="80" w:type="dxa"/>
-              <w:right w:w="120" w:type="dxa"/>
-            </w:tcMar>
-          </w:tcPr>
-          <w:p>
-            <w:r>
-              <w:t xml:space="preserve">掌握 profile schema 驗證業務邏輯。</w:t>
-            </w:r>
-          </w:p>
-        </w:tc>
-      </w:tr>
-      <w:tr>
-        <w:tc>
-          <w:tcPr>
-            <w:tcW w:w="1900" w:type="dxa"/>
-            <w:tcBorders>
-              <w:top w:val="single" w:sz="1" w:space="0" w:color="AAAAAA"/>
-              <w:left w:val="single" w:sz="1" w:space="0" w:color="AAAAAA"/>
-              <w:bottom w:val="single" w:sz="1" w:space="0" w:color="AAAAAA"/>
-              <w:right w:val="single" w:sz="1" w:space="0" w:color="AAAAAA"/>
-            </w:tcBorders>
-            <w:tcMar>
-              <w:top w:w="80" w:type="dxa"/>
-              <w:left w:w="120" w:type="dxa"/>
-              <w:bottom w:w="80" w:type="dxa"/>
-              <w:right w:w="120" w:type="dxa"/>
-            </w:tcMar>
-          </w:tcPr>
-          <w:p>
-            <w:r>
-              <w:t xml:space="preserve">Low Coupling</w:t>
-            </w:r>
-          </w:p>
-        </w:tc>
-        <w:tc>
-          <w:tcPr>
-            <w:tcW w:w="2700" w:type="dxa"/>
-            <w:tcBorders>
-              <w:top w:val="single" w:sz="1" w:space="0" w:color="AAAAAA"/>
-              <w:left w:val="single" w:sz="1" w:space="0" w:color="AAAAAA"/>
-              <w:bottom w:val="single" w:sz="1" w:space="0" w:color="AAAAAA"/>
-              <w:right w:val="single" w:sz="1" w:space="0" w:color="AAAAAA"/>
-            </w:tcBorders>
-            <w:tcMar>
-              <w:top w:w="80" w:type="dxa"/>
-              <w:left w:w="120" w:type="dxa"/>
-              <w:bottom w:w="80" w:type="dxa"/>
-              <w:right w:w="120" w:type="dxa"/>
-            </w:tcMar>
-          </w:tcPr>
-          <w:p>
-            <w:r>
-              <w:t xml:space="preserve">:ProfileValidateService</w:t>
-            </w:r>
-          </w:p>
-        </w:tc>
-        <w:tc>
-          <w:tcPr>
-            <w:tcW w:w="4426" w:type="dxa"/>
-            <w:tcBorders>
-              <w:top w:val="single" w:sz="1" w:space="0" w:color="AAAAAA"/>
-              <w:left w:val="single" w:sz="1" w:space="0" w:color="AAAAAA"/>
-              <w:bottom w:val="single" w:sz="1" w:space="0" w:color="AAAAAA"/>
-              <w:right w:val="single" w:sz="1" w:space="0" w:color="AAAAAA"/>
-            </w:tcBorders>
-            <w:tcMar>
-              <w:top w:w="80" w:type="dxa"/>
-              <w:left w:w="120" w:type="dxa"/>
-              <w:bottom w:w="80" w:type="dxa"/>
-              <w:right w:w="120" w:type="dxa"/>
-            </w:tcMar>
-          </w:tcPr>
-          <w:p>
-            <w:r>
-              <w:t xml:space="preserve">依賴 ProfileLoader 介面而非 YamlProfileLoader 具體實作，便於替換。</w:t>
-            </w:r>
-          </w:p>
-        </w:tc>
-      </w:tr>
-    </w:tbl>
+        <w:t>圖 3-2.4a SD for initProfile()（標示 GRASP 模式）</w:t>
+      </w:r>
+    </w:p>
+    <w:p>
+      <w:pPr>
+        <w:pStyle w:val="3"/>
+      </w:pPr>
+      <w:r>
+        <w:t>3.2.5 System Sequence Diagram — UC-03 Check with Interactive Fix Suggestions [new]</w:t>
+      </w:r>
+    </w:p>
+    <w:p>
+      <w:r>
+        <w:t xml:space="preserve">UC-03 為 Iteration II 新增之互動式修復使用案例。系統唯一入口事件為 fix(sourcePath, profilePath)；系統對每一筆違規呼叫 displayViolation(violation) 輸出資訊，Developer 逐一回覆 suppress(violationId) 觸發 UC-04（&lt;&lt;include&gt;&gt;），最後系統回傳 fixResult。</w:t>
+      </w:r>
+    </w:p>
     <w:p>
       <w:pPr>
         <w:jc w:val="center"/>
@@ -14401,80 +14440,8 @@
           <w:noProof/>
         </w:rPr>
         <w:drawing>
-          <wp:inline distT="0" distB="0" distL="0" distR="0" wp14:anchorId="709195CE" wp14:editId="1C2CF002">
-            <wp:extent cx="5669280" cy="2755962"/>
-            <wp:effectExtent l="0" t="0" r="0" b="0"/>
-            <wp:docPr id="1435730972" name="Picture 1473456421"/>
-            <wp:cNvGraphicFramePr>
-              <a:graphicFrameLocks xmlns:a="http://schemas.openxmlformats.org/drawingml/2006/main" noChangeAspect="1"/>
-            </wp:cNvGraphicFramePr>
-            <a:graphic xmlns:a="http://schemas.openxmlformats.org/drawingml/2006/main">
-              <a:graphicData uri="http://schemas.openxmlformats.org/drawingml/2006/picture">
-                <pic:pic xmlns:pic="http://schemas.openxmlformats.org/drawingml/2006/picture">
-                  <pic:nvPicPr>
-                    <pic:cNvPr id="0" name="uc02_sd_validate.png"/>
-                    <pic:cNvPicPr/>
-                  </pic:nvPicPr>
-                  <pic:blipFill>
-                    <a:blip r:embed="rId12"/>
-                    <a:stretch>
-                      <a:fillRect/>
-                    </a:stretch>
-                  </pic:blipFill>
-                  <pic:spPr>
-                    <a:xfrm>
-                      <a:off x="0" y="0"/>
-                      <a:ext cx="5669280" cy="2755962"/>
-                    </a:xfrm>
-                    <a:prstGeom prst="rect">
-                      <a:avLst/>
-                    </a:prstGeom>
-                  </pic:spPr>
-                </pic:pic>
-              </a:graphicData>
-            </a:graphic>
-          </wp:inline>
-        </w:drawing>
-      </w:r>
-    </w:p>
-    <w:p>
-      <w:pPr>
-        <w:jc w:val="center"/>
-      </w:pPr>
-      <w:r>
-        <w:rPr>
-          <w:i/>
-          <w:sz w:val="20"/>
-        </w:rPr>
-        <w:t>圖 3-2.2b SD for validateProfile()（標示 GRASP 模式）</w:t>
-      </w:r>
-    </w:p>
-    <w:p>
-      <w:pPr>
-        <w:pStyle w:val="3"/>
-      </w:pPr>
-      <w:r>
-        <w:t>3.2.3 System Sequence Diagram — UC-03 Check with Interactive Fix Suggestions</w:t>
-      </w:r>
-    </w:p>
-    <w:p>
-      <w:r>
-        <w:t>UC-03 為 Iteration II 新增之互動式修復使用案例。使用者執行 arch-checker fix &lt;sourcePath&gt; &lt;profilePath&gt;，系統先執行合規檢查，再對每一筆違規依序顯示違規訊息</w:t>
-        <w:lastRenderedPageBreak/>
-        <w:t>與修正建議（suggestion），使用者輸入 f（suppress）、s（skip）或 q（quit）後，系統輸出修正摘要。本節以 SSD 識別系統事件：fix(sourcePath, profilePath) 為唯一外部觸發事件，內部以互動迴圈處理各違規決策。</w:t>
-      </w:r>
-    </w:p>
-    <w:p>
-      <w:pPr>
-        <w:jc w:val="center"/>
-      </w:pPr>
-      <w:r>
-        <w:rPr>
-          <w:noProof/>
-        </w:rPr>
-        <w:drawing>
           <wp:inline distT="0" distB="0" distL="0" distR="0" wp14:anchorId="03002D0F" wp14:editId="38CD51FF">
-            <wp:extent cx="5486400" cy="3962413"/>
+            <wp:extent cx="5669280" cy="2915330"/>
             <wp:effectExtent l="0" t="0" r="0" b="0"/>
             <wp:docPr id="1473456422" name="Picture uc03_ssd"/>
             <wp:cNvGraphicFramePr>
@@ -14496,7 +14463,7 @@
                   <pic:spPr>
                     <a:xfrm>
                       <a:off x="0" y="0"/>
-                      <a:ext cx="5486400" cy="3962413"/>
+                      <a:ext cx="5669280" cy="2915330"/>
                     </a:xfrm>
                     <a:prstGeom prst="rect">
                       <a:avLst/>
@@ -14518,7 +14485,7 @@
           <w:i/>
           <w:sz w:val="20"/>
         </w:rPr>
-        <w:t>圖 3-2.3 UC-03 Check with Interactive Fix Suggestions — System Sequence Diagram</w:t>
+        <w:t>圖 3-2.5 UC-03 Check with Interactive Fix Suggestions — System Sequence Diagram</w:t>
       </w:r>
     </w:p>
     <w:p>
@@ -14526,7 +14493,7 @@
         <w:pStyle w:val="3"/>
       </w:pPr>
       <w:r>
-        <w:t>3.2.4 Sequence Diagram with GRASP Patterns — UC-03</w:t>
+        <w:t>3.2.6 Sequence Diagram with GRASP Patterns — UC-03 [new]</w:t>
       </w:r>
     </w:p>
     <w:p>
@@ -14635,7 +14602,7 @@
           </w:tcPr>
           <w:p>
             <w:r>
-              <w:t xml:space="preserve">Information Expert</w:t>
+              <w:t xml:space="preserve">Pure Fabrication</w:t>
             </w:r>
           </w:p>
         </w:tc>
@@ -14645,7 +14612,7 @@
           </w:tcPr>
           <w:p>
             <w:r>
-              <w:t xml:space="preserve">InteractiveFixer</w:t>
+              <w:t xml:space="preserve">SuppressionService</w:t>
             </w:r>
           </w:p>
         </w:tc>
@@ -14655,7 +14622,7 @@
           </w:tcPr>
           <w:p>
             <w:r>
-              <w:t xml:space="preserve">掌握互動式修復之完整業務邏輯，逐一顯示違規與建議、讀取使用者決策、呼叫 SuppressionStore 寫出抑制記錄。</w:t>
+              <w:t xml:space="preserve">封裝 suppress 完整流程（loadAll→建立 Suppression→save），不對應任何 Domain 概念；FixCommand 與 SuppressCommand 均可透過同一介面執行 suppress，達成複用（High Cohesion、Indirection）。</w:t>
             </w:r>
           </w:p>
         </w:tc>
@@ -14687,7 +14654,7 @@
           </w:tcPr>
           <w:p>
             <w:r>
-              <w:t xml:space="preserve">僅依賴 InteractiveFixer 與 ComplianceCheckService 介面，不直接操作具體 I/O 邏輯，便於替換實作。</w:t>
+              <w:t xml:space="preserve">FixCommand 僅依賴 ComplianceCheckService 與 SuppressionService 介面，I/O 直接走 System.in/out 而非耦合任何具體類別，便於替換實作。</w:t>
             </w:r>
           </w:p>
         </w:tc>
@@ -14704,7 +14671,7 @@
         <w:lastRenderedPageBreak/>
         <w:drawing>
           <wp:inline distT="0" distB="0" distL="0" distR="0" wp14:anchorId="37CF6A4C" wp14:editId="2B2DBB1B">
-            <wp:extent cx="5669280" cy="4343413"/>
+            <wp:extent cx="5486400" cy="4410838"/>
             <wp:effectExtent l="0" t="0" r="0" b="0"/>
             <wp:docPr id="1473456423" name="Picture uc03_sd"/>
             <wp:cNvGraphicFramePr>
@@ -14726,7 +14693,7 @@
                   <pic:spPr>
                     <a:xfrm>
                       <a:off x="0" y="0"/>
-                      <a:ext cx="5669280" cy="4343413"/>
+                      <a:ext cx="5486400" cy="4410838"/>
                     </a:xfrm>
                     <a:prstGeom prst="rect">
                       <a:avLst/>
@@ -14748,7 +14715,528 @@
           <w:i/>
           <w:sz w:val="20"/>
         </w:rPr>
-        <w:t>圖 3-2.4 SD for fix()（標示 GRASP 模式）</w:t>
+        <w:t>圖 3-2.6 SD for fix()（標示 GRASP 模式）</w:t>
+      </w:r>
+    </w:p>
+    <w:p>
+      <w:pPr>
+        <w:pStyle w:val="3"/>
+      </w:pPr>
+      <w:r>
+        <w:t>3.2.7 System Sequence Diagram — UC-04 Suppress a Violation</w:t>
+      </w:r>
+    </w:p>
+    <w:p>
+      <w:r>
+        <w:t>UC-04 為非互動式的單點抑制：Developer 直接對 :System 發出 suppress(constraintId, filePath, lineNumber, reason) 系統事件，系統持久化 Suppression 紀錄後回傳確認。</w:t>
+      </w:r>
+    </w:p>
+    <w:p>
+      <w:pPr>
+        <w:jc w:val="center"/>
+      </w:pPr>
+      <w:r>
+        <w:rPr>
+          <w:noProof/>
+        </w:rPr>
+        <w:drawing>
+          <wp:inline distT="0" distB="0" distL="0" distR="0" wp14:anchorId="B2001001" wp14:editId="B2001002">
+            <wp:extent cx="5028716" cy="8229600"/>
+            <wp:effectExtent l="0" t="0" r="0" b="0"/>
+            <wp:docPr id="2003" name="Picture uc04_ssd"/>
+            <wp:cNvGraphicFramePr>
+              <a:graphicFrameLocks xmlns:a="http://schemas.openxmlformats.org/drawingml/2006/main" noChangeAspect="1"/>
+            </wp:cNvGraphicFramePr>
+            <a:graphic xmlns:a="http://schemas.openxmlformats.org/drawingml/2006/main">
+              <a:graphicData uri="http://schemas.openxmlformats.org/drawingml/2006/picture">
+                <pic:pic xmlns:pic="http://schemas.openxmlformats.org/drawingml/2006/picture">
+                  <pic:nvPicPr>
+                    <pic:cNvPr id="0" name="uc04_ssd.png"/>
+                    <pic:cNvPicPr/>
+                  </pic:nvPicPr>
+                  <pic:blipFill>
+                    <a:blip r:embed="rId21"/>
+                    <a:stretch>
+                      <a:fillRect/>
+                    </a:stretch>
+                  </pic:blipFill>
+                  <pic:spPr>
+                    <a:xfrm>
+                      <a:off x="0" y="0"/>
+                      <a:ext cx="5028716" cy="8229600"/>
+                    </a:xfrm>
+                    <a:prstGeom prst="rect">
+                      <a:avLst/>
+                    </a:prstGeom>
+                  </pic:spPr>
+                </pic:pic>
+              </a:graphicData>
+            </a:graphic>
+          </wp:inline>
+        </w:drawing>
+      </w:r>
+    </w:p>
+    <w:p>
+      <w:pPr>
+        <w:jc w:val="center"/>
+      </w:pPr>
+      <w:r>
+        <w:rPr>
+          <w:i/>
+          <w:sz w:val="20"/>
+        </w:rPr>
+        <w:t>圖 3-2.7 UC-04 Suppress a Violation — System Sequence Diagram</w:t>
+      </w:r>
+    </w:p>
+    <w:p>
+      <w:pPr>
+        <w:pStyle w:val="3"/>
+      </w:pPr>
+      <w:r>
+        <w:t>3.2.8 Sequence Diagram with GRASP Patterns — UC-04</w:t>
+      </w:r>
+    </w:p>
+    <w:p>
+      <w:r>
+        <w:t>系統事件：suppress(constraintId, filePath, lineNumber, reason)</w:t>
+      </w:r>
+    </w:p>
+    <w:tbl>
+      <w:tblPr>
+        <w:tblW w:w="9026" w:type="dxa"/>
+        <w:tblInd w:w="283" w:type="dxa"/>
+        <w:tblBorders>
+          <w:top w:val="single" w:sz="4" w:space="0" w:color="auto"/>
+          <w:left w:val="single" w:sz="4" w:space="0" w:color="auto"/>
+          <w:bottom w:val="single" w:sz="4" w:space="0" w:color="auto"/>
+          <w:right w:val="single" w:sz="4" w:space="0" w:color="auto"/>
+          <w:insideH w:val="single" w:sz="4" w:space="0" w:color="auto"/>
+          <w:insideV w:val="single" w:sz="4" w:space="0" w:color="auto"/>
+        </w:tblBorders>
+        <w:tblLook w:val="04A0" w:firstRow="1" w:lastRow="0" w:firstColumn="1" w:lastColumn="0" w:noHBand="0" w:noVBand="1"/>
+      </w:tblPr>
+      <w:tblGrid>
+        <w:gridCol w:w="1900"/>
+        <w:gridCol w:w="3000"/>
+        <w:gridCol w:w="4126"/>
+      </w:tblGrid>
+      <w:tr>
+        <w:trPr>
+          <w:tblHeader/>
+        </w:trPr>
+        <w:tc>
+          <w:tcPr>
+            <w:tcW w:w="1900" w:type="dxa"/>
+            <w:tcBorders>
+              <w:top w:val="single" w:sz="1" w:space="0" w:color="555555"/>
+              <w:left w:val="single" w:sz="1" w:space="0" w:color="555555"/>
+              <w:bottom w:val="single" w:sz="1" w:space="0" w:color="555555"/>
+              <w:right w:val="single" w:sz="1" w:space="0" w:color="555555"/>
+            </w:tcBorders>
+            <w:shd w:val="clear" w:color="auto" w:fill="2E4057"/>
+            <w:tcMar>
+              <w:top w:w="80" w:type="dxa"/>
+              <w:left w:w="120" w:type="dxa"/>
+              <w:bottom w:w="80" w:type="dxa"/>
+              <w:right w:w="120" w:type="dxa"/>
+            </w:tcMar>
+          </w:tcPr>
+          <w:p>
+            <w:r>
+              <w:rPr>
+                <w:b/>
+                <w:bCs/>
+                <w:color w:val="FFFFFF"/>
+              </w:rPr>
+              <w:t>GRASP Pattern</w:t>
+            </w:r>
+          </w:p>
+        </w:tc>
+        <w:tc>
+          <w:tcPr>
+            <w:tcW w:w="3000" w:type="dxa"/>
+            <w:tcBorders>
+              <w:top w:val="single" w:sz="1" w:space="0" w:color="555555"/>
+              <w:left w:val="single" w:sz="1" w:space="0" w:color="555555"/>
+              <w:bottom w:val="single" w:sz="1" w:space="0" w:color="555555"/>
+              <w:right w:val="single" w:sz="1" w:space="0" w:color="555555"/>
+            </w:tcBorders>
+            <w:shd w:val="clear" w:color="auto" w:fill="2E4057"/>
+            <w:tcMar>
+              <w:top w:w="80" w:type="dxa"/>
+              <w:left w:w="120" w:type="dxa"/>
+              <w:bottom w:w="80" w:type="dxa"/>
+              <w:right w:w="120" w:type="dxa"/>
+            </w:tcMar>
+          </w:tcPr>
+          <w:p>
+            <w:r>
+              <w:rPr>
+                <w:b/>
+                <w:bCs/>
+                <w:color w:val="FFFFFF"/>
+              </w:rPr>
+              <w:t>套用對象</w:t>
+            </w:r>
+          </w:p>
+        </w:tc>
+        <w:tc>
+          <w:tcPr>
+            <w:tcW w:w="4126" w:type="dxa"/>
+            <w:tcBorders>
+              <w:top w:val="single" w:sz="1" w:space="0" w:color="555555"/>
+              <w:left w:val="single" w:sz="1" w:space="0" w:color="555555"/>
+              <w:bottom w:val="single" w:sz="1" w:space="0" w:color="555555"/>
+              <w:right w:val="single" w:sz="1" w:space="0" w:color="555555"/>
+            </w:tcBorders>
+            <w:shd w:val="clear" w:color="auto" w:fill="2E4057"/>
+            <w:tcMar>
+              <w:top w:w="80" w:type="dxa"/>
+              <w:left w:w="120" w:type="dxa"/>
+              <w:bottom w:w="80" w:type="dxa"/>
+              <w:right w:w="120" w:type="dxa"/>
+            </w:tcMar>
+          </w:tcPr>
+          <w:p>
+            <w:r>
+              <w:rPr>
+                <w:b/>
+                <w:bCs/>
+                <w:color w:val="FFFFFF"/>
+              </w:rPr>
+              <w:t>Rationale</w:t>
+            </w:r>
+          </w:p>
+        </w:tc>
+      </w:tr>
+      <w:tr>
+        <w:tc>
+          <w:tcPr>
+            <w:tcW w:w="1900" w:type="dxa"/>
+            <w:tcBorders>
+              <w:top w:val="single" w:sz="1" w:space="0" w:color="AAAAAA"/>
+              <w:left w:val="single" w:sz="1" w:space="0" w:color="AAAAAA"/>
+              <w:bottom w:val="single" w:sz="1" w:space="0" w:color="AAAAAA"/>
+              <w:right w:val="single" w:sz="1" w:space="0" w:color="AAAAAA"/>
+            </w:tcBorders>
+            <w:tcMar>
+              <w:top w:w="80" w:type="dxa"/>
+              <w:left w:w="120" w:type="dxa"/>
+              <w:bottom w:w="80" w:type="dxa"/>
+              <w:right w:w="120" w:type="dxa"/>
+            </w:tcMar>
+          </w:tcPr>
+          <w:p>
+            <w:r>
+              <w:t>Controller</w:t>
+            </w:r>
+          </w:p>
+        </w:tc>
+        <w:tc>
+          <w:tcPr>
+            <w:tcW w:w="3000" w:type="dxa"/>
+            <w:tcBorders>
+              <w:top w:val="single" w:sz="1" w:space="0" w:color="AAAAAA"/>
+              <w:left w:val="single" w:sz="1" w:space="0" w:color="AAAAAA"/>
+              <w:bottom w:val="single" w:sz="1" w:space="0" w:color="AAAAAA"/>
+              <w:right w:val="single" w:sz="1" w:space="0" w:color="AAAAAA"/>
+            </w:tcBorders>
+            <w:tcMar>
+              <w:top w:w="80" w:type="dxa"/>
+              <w:left w:w="120" w:type="dxa"/>
+              <w:bottom w:w="80" w:type="dxa"/>
+              <w:right w:w="120" w:type="dxa"/>
+            </w:tcMar>
+          </w:tcPr>
+          <w:p>
+            <w:r>
+              <w:t>:SuppressCommand</w:t>
+            </w:r>
+          </w:p>
+        </w:tc>
+        <w:tc>
+          <w:tcPr>
+            <w:tcW w:w="4126" w:type="dxa"/>
+            <w:tcBorders>
+              <w:top w:val="single" w:sz="1" w:space="0" w:color="AAAAAA"/>
+              <w:left w:val="single" w:sz="1" w:space="0" w:color="AAAAAA"/>
+              <w:bottom w:val="single" w:sz="1" w:space="0" w:color="AAAAAA"/>
+              <w:right w:val="single" w:sz="1" w:space="0" w:color="AAAAAA"/>
+            </w:tcBorders>
+            <w:tcMar>
+              <w:top w:w="80" w:type="dxa"/>
+              <w:left w:w="120" w:type="dxa"/>
+              <w:bottom w:w="80" w:type="dxa"/>
+              <w:right w:w="120" w:type="dxa"/>
+            </w:tcMar>
+          </w:tcPr>
+          <w:p>
+            <w:r>
+              <w:t>接收 suppress(...) 系統事件，作為 UC-04 use case controller</w:t>
+            </w:r>
+          </w:p>
+        </w:tc>
+      </w:tr>
+      <w:tr>
+        <w:tc>
+          <w:tcPr>
+            <w:tcW w:w="1900" w:type="dxa"/>
+            <w:tcBorders>
+              <w:top w:val="single" w:sz="1" w:space="0" w:color="AAAAAA"/>
+              <w:left w:val="single" w:sz="1" w:space="0" w:color="AAAAAA"/>
+              <w:bottom w:val="single" w:sz="1" w:space="0" w:color="AAAAAA"/>
+              <w:right w:val="single" w:sz="1" w:space="0" w:color="AAAAAA"/>
+            </w:tcBorders>
+            <w:tcMar>
+              <w:top w:w="80" w:type="dxa"/>
+              <w:left w:w="120" w:type="dxa"/>
+              <w:bottom w:w="80" w:type="dxa"/>
+              <w:right w:w="120" w:type="dxa"/>
+            </w:tcMar>
+          </w:tcPr>
+          <w:p>
+            <w:r>
+              <w:t>Pure Fabrication</w:t>
+            </w:r>
+          </w:p>
+        </w:tc>
+        <w:tc>
+          <w:tcPr>
+            <w:tcW w:w="3000" w:type="dxa"/>
+            <w:tcBorders>
+              <w:top w:val="single" w:sz="1" w:space="0" w:color="AAAAAA"/>
+              <w:left w:val="single" w:sz="1" w:space="0" w:color="AAAAAA"/>
+              <w:bottom w:val="single" w:sz="1" w:space="0" w:color="AAAAAA"/>
+              <w:right w:val="single" w:sz="1" w:space="0" w:color="AAAAAA"/>
+            </w:tcBorders>
+            <w:tcMar>
+              <w:top w:w="80" w:type="dxa"/>
+              <w:left w:w="120" w:type="dxa"/>
+              <w:bottom w:w="80" w:type="dxa"/>
+              <w:right w:w="120" w:type="dxa"/>
+            </w:tcMar>
+          </w:tcPr>
+          <w:p>
+            <w:r>
+              <w:t>:SuppressionStore</w:t>
+            </w:r>
+          </w:p>
+        </w:tc>
+        <w:tc>
+          <w:tcPr>
+            <w:tcW w:w="4126" w:type="dxa"/>
+            <w:tcBorders>
+              <w:top w:val="single" w:sz="1" w:space="0" w:color="AAAAAA"/>
+              <w:left w:val="single" w:sz="1" w:space="0" w:color="AAAAAA"/>
+              <w:bottom w:val="single" w:sz="1" w:space="0" w:color="AAAAAA"/>
+              <w:right w:val="single" w:sz="1" w:space="0" w:color="AAAAAA"/>
+            </w:tcBorders>
+            <w:tcMar>
+              <w:top w:w="80" w:type="dxa"/>
+              <w:left w:w="120" w:type="dxa"/>
+              <w:bottom w:w="80" w:type="dxa"/>
+              <w:right w:w="120" w:type="dxa"/>
+            </w:tcMar>
+          </w:tcPr>
+          <w:p>
+            <w:r>
+              <w:t>Domain Model 無「持久化抑制記錄」概念，為封裝 YAML 讀寫細節而建立</w:t>
+            </w:r>
+          </w:p>
+        </w:tc>
+      </w:tr>
+      <w:tr>
+        <w:tc>
+          <w:tcPr>
+            <w:tcW w:w="1900" w:type="dxa"/>
+            <w:tcBorders>
+              <w:top w:val="single" w:sz="1" w:space="0" w:color="AAAAAA"/>
+              <w:left w:val="single" w:sz="1" w:space="0" w:color="AAAAAA"/>
+              <w:bottom w:val="single" w:sz="1" w:space="0" w:color="AAAAAA"/>
+              <w:right w:val="single" w:sz="1" w:space="0" w:color="AAAAAA"/>
+            </w:tcBorders>
+            <w:tcMar>
+              <w:top w:w="80" w:type="dxa"/>
+              <w:left w:w="120" w:type="dxa"/>
+              <w:bottom w:w="80" w:type="dxa"/>
+              <w:right w:w="120" w:type="dxa"/>
+            </w:tcMar>
+          </w:tcPr>
+          <w:p>
+            <w:r>
+              <w:t>Information Expert</w:t>
+            </w:r>
+          </w:p>
+        </w:tc>
+        <w:tc>
+          <w:tcPr>
+            <w:tcW w:w="3000" w:type="dxa"/>
+            <w:tcBorders>
+              <w:top w:val="single" w:sz="1" w:space="0" w:color="AAAAAA"/>
+              <w:left w:val="single" w:sz="1" w:space="0" w:color="AAAAAA"/>
+              <w:bottom w:val="single" w:sz="1" w:space="0" w:color="AAAAAA"/>
+              <w:right w:val="single" w:sz="1" w:space="0" w:color="AAAAAA"/>
+            </w:tcBorders>
+            <w:tcMar>
+              <w:top w:w="80" w:type="dxa"/>
+              <w:left w:w="120" w:type="dxa"/>
+              <w:bottom w:w="80" w:type="dxa"/>
+              <w:right w:w="120" w:type="dxa"/>
+            </w:tcMar>
+          </w:tcPr>
+          <w:p>
+            <w:r>
+              <w:t>:SuppressionStore</w:t>
+            </w:r>
+          </w:p>
+        </w:tc>
+        <w:tc>
+          <w:tcPr>
+            <w:tcW w:w="4126" w:type="dxa"/>
+            <w:tcBorders>
+              <w:top w:val="single" w:sz="1" w:space="0" w:color="AAAAAA"/>
+              <w:left w:val="single" w:sz="1" w:space="0" w:color="AAAAAA"/>
+              <w:bottom w:val="single" w:sz="1" w:space="0" w:color="AAAAAA"/>
+              <w:right w:val="single" w:sz="1" w:space="0" w:color="AAAAAA"/>
+            </w:tcBorders>
+            <w:tcMar>
+              <w:top w:w="80" w:type="dxa"/>
+              <w:left w:w="120" w:type="dxa"/>
+              <w:bottom w:w="80" w:type="dxa"/>
+              <w:right w:w="120" w:type="dxa"/>
+            </w:tcMar>
+          </w:tcPr>
+          <w:p>
+            <w:r>
+              <w:t>擁有抑制清單持久化責任，掌握所有已存抑制記錄</w:t>
+            </w:r>
+          </w:p>
+        </w:tc>
+      </w:tr>
+      <w:tr>
+        <w:tc>
+          <w:tcPr>
+            <w:tcW w:w="1900" w:type="dxa"/>
+            <w:tcBorders>
+              <w:top w:val="single" w:sz="1" w:space="0" w:color="AAAAAA"/>
+              <w:left w:val="single" w:sz="1" w:space="0" w:color="AAAAAA"/>
+              <w:bottom w:val="single" w:sz="1" w:space="0" w:color="AAAAAA"/>
+              <w:right w:val="single" w:sz="1" w:space="0" w:color="AAAAAA"/>
+            </w:tcBorders>
+            <w:tcMar>
+              <w:top w:w="80" w:type="dxa"/>
+              <w:left w:w="120" w:type="dxa"/>
+              <w:bottom w:w="80" w:type="dxa"/>
+              <w:right w:w="120" w:type="dxa"/>
+            </w:tcMar>
+          </w:tcPr>
+          <w:p>
+            <w:r>
+              <w:t>Low Coupling</w:t>
+            </w:r>
+          </w:p>
+        </w:tc>
+        <w:tc>
+          <w:tcPr>
+            <w:tcW w:w="3000" w:type="dxa"/>
+            <w:tcBorders>
+              <w:top w:val="single" w:sz="1" w:space="0" w:color="AAAAAA"/>
+              <w:left w:val="single" w:sz="1" w:space="0" w:color="AAAAAA"/>
+              <w:bottom w:val="single" w:sz="1" w:space="0" w:color="AAAAAA"/>
+              <w:right w:val="single" w:sz="1" w:space="0" w:color="AAAAAA"/>
+            </w:tcBorders>
+            <w:tcMar>
+              <w:top w:w="80" w:type="dxa"/>
+              <w:left w:w="120" w:type="dxa"/>
+              <w:bottom w:w="80" w:type="dxa"/>
+              <w:right w:w="120" w:type="dxa"/>
+            </w:tcMar>
+          </w:tcPr>
+          <w:p>
+            <w:r>
+              <w:t>:SuppressCommand</w:t>
+            </w:r>
+          </w:p>
+        </w:tc>
+        <w:tc>
+          <w:tcPr>
+            <w:tcW w:w="4126" w:type="dxa"/>
+            <w:tcBorders>
+              <w:top w:val="single" w:sz="1" w:space="0" w:color="AAAAAA"/>
+              <w:left w:val="single" w:sz="1" w:space="0" w:color="AAAAAA"/>
+              <w:bottom w:val="single" w:sz="1" w:space="0" w:color="AAAAAA"/>
+              <w:right w:val="single" w:sz="1" w:space="0" w:color="AAAAAA"/>
+            </w:tcBorders>
+            <w:tcMar>
+              <w:top w:w="80" w:type="dxa"/>
+              <w:left w:w="120" w:type="dxa"/>
+              <w:bottom w:w="80" w:type="dxa"/>
+              <w:right w:w="120" w:type="dxa"/>
+            </w:tcMar>
+          </w:tcPr>
+          <w:p>
+            <w:r>
+              <w:t>僅依賴 SuppressionStore 介面，不直接耦合 YAML 輸出細節</w:t>
+            </w:r>
+          </w:p>
+        </w:tc>
+      </w:tr>
+    </w:tbl>
+    <w:p>
+      <w:pPr>
+        <w:jc w:val="center"/>
+      </w:pPr>
+      <w:r>
+        <w:rPr>
+          <w:noProof/>
+        </w:rPr>
+        <w:drawing>
+          <wp:inline distT="0" distB="0" distL="0" distR="0" wp14:anchorId="B2001003" wp14:editId="B2001004">
+            <wp:extent cx="4598823" cy="8229600"/>
+            <wp:effectExtent l="0" t="0" r="0" b="0"/>
+            <wp:docPr id="2004" name="Picture uc04_sd"/>
+            <wp:cNvGraphicFramePr>
+              <a:graphicFrameLocks xmlns:a="http://schemas.openxmlformats.org/drawingml/2006/main" noChangeAspect="1"/>
+            </wp:cNvGraphicFramePr>
+            <a:graphic xmlns:a="http://schemas.openxmlformats.org/drawingml/2006/main">
+              <a:graphicData uri="http://schemas.openxmlformats.org/drawingml/2006/picture">
+                <pic:pic xmlns:pic="http://schemas.openxmlformats.org/drawingml/2006/picture">
+                  <pic:nvPicPr>
+                    <pic:cNvPr id="0" name="uc04_sd.png"/>
+                    <pic:cNvPicPr/>
+                  </pic:nvPicPr>
+                  <pic:blipFill>
+                    <a:blip r:embed="rId22"/>
+                    <a:stretch>
+                      <a:fillRect/>
+                    </a:stretch>
+                  </pic:blipFill>
+                  <pic:spPr>
+                    <a:xfrm>
+                      <a:off x="0" y="0"/>
+                      <a:ext cx="4598823" cy="8229600"/>
+                    </a:xfrm>
+                    <a:prstGeom prst="rect">
+                      <a:avLst/>
+                    </a:prstGeom>
+                  </pic:spPr>
+                </pic:pic>
+              </a:graphicData>
+            </a:graphic>
+          </wp:inline>
+        </w:drawing>
+      </w:r>
+    </w:p>
+    <w:p>
+      <w:pPr>
+        <w:jc w:val="center"/>
+      </w:pPr>
+      <w:r>
+        <w:rPr>
+          <w:i/>
+          <w:sz w:val="20"/>
+        </w:rPr>
+        <w:t>圖 3-2.8 SD for suppress()（標示 GRASP 模式）</w:t>
       </w:r>
     </w:p>
     <w:p>
@@ -14775,7 +15263,7 @@
         <w:lastRenderedPageBreak/>
         <w:drawing>
           <wp:inline distT="0" distB="0" distL="0" distR="0" wp14:anchorId="146FB7F4" wp14:editId="1CF0C783">
-            <wp:extent cx="5760720" cy="5470973"/>
+            <wp:extent cx="5029200" cy="5333940"/>
             <wp:effectExtent l="0" t="0" r="0" b="0"/>
             <wp:docPr id="1685514452" name="Picture 1473456421"/>
             <wp:cNvGraphicFramePr>
@@ -14797,7 +15285,7 @@
                   <pic:spPr>
                     <a:xfrm>
                       <a:off x="0" y="0"/>
-                      <a:ext cx="5760720" cy="5470973"/>
+                      <a:ext cx="5029200" cy="5333940"/>
                     </a:xfrm>
                     <a:prstGeom prst="rect">
                       <a:avLst/>
@@ -14845,7 +15333,7 @@
     </w:p>
     <w:p>
       <w:r>
-        <w:t>下圖為 arch-checker 之 Implementation Class Diagram（ICD），反映系統實際編譯後的結構。由於實作緊跟 DCD，ICD 在結構上與圖 3-3 相同。與 Iteration I 相比，主要新增為七個新類別（FixCommand、ProfileCommand、ProfileInitCommand、ProfileValidateCommand、InteractiveFixer、ProfileTemplateService、ProfileValidateService）以及 Violation 上的 suggestion 欄位。</w:t>
+        <w:t>下圖為 arch-checker 之 Implementation Class Diagram（ICD），反映系統實際編譯後的結構。由於實作緊跟 DCD，ICD 在結構上與圖 3-3 相同。與 Iteration I 相比，主要新增為六個新類別（FixCommand、ProfileCommand、ProfileInitCommand、ProfileValidateCommand、ProfileTemplateService、ProfileValidateService）以及 Violation 上的 suggestion 欄位。UC-03 互動邏輯由 FixCommand 直接處理；suppress 操作委派 SuppressionService 執行，與 SuppressCommand 共用同一 Application 服務。</w:t>
       </w:r>
     </w:p>
     <w:p>
@@ -14859,7 +15347,7 @@
         <w:lastRenderedPageBreak/>
         <w:drawing>
           <wp:inline distT="0" distB="0" distL="0" distR="0" wp14:anchorId="5C22A516" wp14:editId="3824152F">
-            <wp:extent cx="5760720" cy="5470973"/>
+            <wp:extent cx="5029200" cy="5333940"/>
             <wp:effectExtent l="0" t="0" r="0" b="0"/>
             <wp:docPr id="54178973" name="Picture 1473456421"/>
             <wp:cNvGraphicFramePr>
@@ -14881,7 +15369,7 @@
                   <pic:spPr>
                     <a:xfrm>
                       <a:off x="0" y="0"/>
-                      <a:ext cx="5760720" cy="5470973"/>
+                      <a:ext cx="5029200" cy="5333940"/>
                     </a:xfrm>
                     <a:prstGeom prst="rect">
                       <a:avLst/>
@@ -15352,7 +15840,7 @@
               <w:rPr>
                 <w:sz w:val="20"/>
               </w:rPr>
-              <w:t>InteractiveFixer [new]</w:t>
+              <w:t>FixCommand [new]</w:t>
             </w:r>
           </w:p>
         </w:tc>
@@ -15371,7 +15859,7 @@
               <w:rPr>
                 <w:sz w:val="20"/>
               </w:rPr>
-              <w:t>fix(report, file, profile): FixResult</w:t>
+              <w:t>call(): Integer</w:t>
             </w:r>
           </w:p>
         </w:tc>
@@ -15430,7 +15918,7 @@
               <w:rPr>
                 <w:sz w:val="20"/>
               </w:rPr>
-              <w:t>InteractiveFixer [new]</w:t>
+              <w:t>FixCommand [new]</w:t>
             </w:r>
           </w:p>
         </w:tc>
@@ -15449,7 +15937,7 @@
               <w:rPr>
                 <w:sz w:val="20"/>
               </w:rPr>
-              <w:t>prompt(): String</w:t>
+              <w:t>runInteractiveLoop(...): int[]</w:t>
             </w:r>
           </w:p>
         </w:tc>
@@ -15508,7 +15996,7 @@
               <w:rPr>
                 <w:sz w:val="20"/>
               </w:rPr>
-              <w:t>InteractiveFixer [new]</w:t>
+              <w:t>FixCommand [new]</w:t>
             </w:r>
           </w:p>
         </w:tc>
@@ -15527,7 +16015,7 @@
               <w:rPr>
                 <w:sz w:val="20"/>
               </w:rPr>
-              <w:t>suppress(v, file, profile): void</w:t>
+              <w:t>readAction(): String</w:t>
             </w:r>
           </w:p>
         </w:tc>
@@ -15586,7 +16074,7 @@
               <w:rPr>
                 <w:sz w:val="20"/>
               </w:rPr>
-              <w:t>InteractiveFixer.FixResult [new]</w:t>
+              <w:t>FixCommand [new]</w:t>
             </w:r>
           </w:p>
         </w:tc>
@@ -15605,7 +16093,7 @@
               <w:rPr>
                 <w:sz w:val="20"/>
               </w:rPr>
-              <w:t>getExitCode(): int</w:t>
+              <w:t>suppress(violation, suppressFile): void</w:t>
             </w:r>
           </w:p>
         </w:tc>
@@ -17623,7 +18111,7 @@
               <w:rPr>
                 <w:sz w:val="20"/>
               </w:rPr>
-              <w:t>application.InteractiveFixer [new]</w:t>
+              <w:t>cli.FixCommand [new]</w:t>
             </w:r>
           </w:p>
         </w:tc>
@@ -20078,7 +20566,7 @@
         <w:rPr>
           <w:b/>
         </w:rPr>
-        <w:t>— InteractiveFixer.java [new]</w:t>
+        <w:t>— InteractiveFixer.java [deleted — logic moved to FixCommand]</w:t>
       </w:r>
     </w:p>
     <w:p>
@@ -21655,7 +22143,7 @@
           <w:rFonts w:ascii="Courier New" w:hAnsi="Courier New"/>
           <w:sz w:val="16"/>
         </w:rPr>
-        <w:t>import com.archchecker.application.InteractiveFixer;</w:t>
+        <w:t>import com.archchecker.application.SuppressionStore;</w:t>
       </w:r>
     </w:p>
     <w:p>
@@ -22016,43 +22504,43 @@
           <w:rFonts w:ascii="Courier New" w:hAnsi="Courier New"/>
           <w:sz w:val="16"/>
         </w:rPr>
-        <w:t xml:space="preserve">        InteractiveFixer fixer = new InteractiveFixer(</w:t>
-      </w:r>
-    </w:p>
-    <w:p>
-      <w:r>
-        <w:rPr>
-          <w:rFonts w:ascii="Courier New" w:hAnsi="Courier New"/>
-          <w:sz w:val="16"/>
-        </w:rPr>
-        <w:t xml:space="preserve">                store, System.out,</w:t>
-      </w:r>
-    </w:p>
-    <w:p>
-      <w:r>
-        <w:rPr>
-          <w:rFonts w:ascii="Courier New" w:hAnsi="Courier New"/>
-          <w:sz w:val="16"/>
-        </w:rPr>
-        <w:t xml:space="preserve">                new BufferedReader(new InputStreamReader(System.in)));</w:t>
-      </w:r>
-    </w:p>
-    <w:p>
-      <w:r>
-        <w:rPr>
-          <w:rFonts w:ascii="Courier New" w:hAnsi="Courier New"/>
-          <w:sz w:val="16"/>
-        </w:rPr>
-        <w:t xml:space="preserve">        InteractiveFixer.FixResult fixResult =</w:t>
-      </w:r>
-    </w:p>
-    <w:p>
-      <w:r>
-        <w:rPr>
-          <w:rFonts w:ascii="Courier New" w:hAnsi="Courier New"/>
-          <w:sz w:val="16"/>
-        </w:rPr>
-        <w:t xml:space="preserve">                fixer.fix(report, suppressionFile, profile);</w:t>
+        <w:t xml:space="preserve">        int[] counts = runInteractiveLoop(report, profile, store, suppressionFile);</w:t>
+      </w:r>
+    </w:p>
+    <w:p>
+      <w:r>
+        <w:rPr>
+          <w:rFonts w:ascii="Courier New" w:hAnsi="Courier New"/>
+          <w:sz w:val="16"/>
+        </w:rPr>
+        <w:t xml:space="preserve">        int newlySuppressed = counts[0];</w:t>
+      </w:r>
+    </w:p>
+    <w:p>
+      <w:r>
+        <w:rPr>
+          <w:rFonts w:ascii="Courier New" w:hAnsi="Courier New"/>
+          <w:sz w:val="16"/>
+        </w:rPr>
+        <w:t xml:space="preserve">        int remaining = counts[1];</w:t>
+      </w:r>
+    </w:p>
+    <w:p>
+      <w:r>
+        <w:rPr>
+          <w:rFonts w:ascii="Courier New" w:hAnsi="Courier New"/>
+          <w:sz w:val="16"/>
+        </w:rPr>
+        <w:t xml:space="preserve">        out.println();</w:t>
+      </w:r>
+    </w:p>
+    <w:p>
+      <w:r>
+        <w:rPr>
+          <w:rFonts w:ascii="Courier New" w:hAnsi="Courier New"/>
+          <w:sz w:val="16"/>
+        </w:rPr>
+        <w:t xml:space="preserve">        out.println("--");</w:t>
       </w:r>
     </w:p>
     <w:p/>
@@ -22062,61 +22550,34 @@
           <w:rFonts w:ascii="Courier New" w:hAnsi="Courier New"/>
           <w:sz w:val="16"/>
         </w:rPr>
-        <w:t xml:space="preserve">        System.out.println();</w:t>
-      </w:r>
-    </w:p>
-    <w:p>
-      <w:r>
-        <w:rPr>
-          <w:rFonts w:ascii="Courier New" w:hAnsi="Courier New"/>
-          <w:sz w:val="16"/>
-        </w:rPr>
-        <w:t xml:space="preserve">        System.out.println("--");</w:t>
-      </w:r>
-    </w:p>
-    <w:p>
-      <w:r>
-        <w:rPr>
-          <w:rFonts w:ascii="Courier New" w:hAnsi="Courier New"/>
-          <w:sz w:val="16"/>
-        </w:rPr>
-        <w:t xml:space="preserve">        System.out.println("Checked " + report.getCheckedFileCount() + " file(s); "</w:t>
-      </w:r>
-    </w:p>
-    <w:p>
-      <w:r>
-        <w:rPr>
-          <w:rFonts w:ascii="Courier New" w:hAnsi="Courier New"/>
-          <w:sz w:val="16"/>
-        </w:rPr>
-        <w:t xml:space="preserve">                + fixResult.getRemaining().size() + " violation(s) remaining; "</w:t>
-      </w:r>
-    </w:p>
-    <w:p>
-      <w:r>
-        <w:rPr>
-          <w:rFonts w:ascii="Courier New" w:hAnsi="Courier New"/>
-          <w:sz w:val="16"/>
-        </w:rPr>
-        <w:t xml:space="preserve">                + (report.getSuppressedCount() + fixResult.getNewlySuppressed())</w:t>
-      </w:r>
-    </w:p>
-    <w:p>
-      <w:r>
-        <w:rPr>
-          <w:rFonts w:ascii="Courier New" w:hAnsi="Courier New"/>
-          <w:sz w:val="16"/>
-        </w:rPr>
-        <w:t xml:space="preserve">                + " suppressed.");</w:t>
-      </w:r>
-    </w:p>
-    <w:p>
-      <w:r>
-        <w:rPr>
-          <w:rFonts w:ascii="Courier New" w:hAnsi="Courier New"/>
-          <w:sz w:val="16"/>
-        </w:rPr>
-        <w:t xml:space="preserve">        return fixResult.getExitCode();</w:t>
+        <w:t xml:space="preserve">        out.println("Checked " + report.getCheckedFileCount() + " file(s); "</w:t>
+      </w:r>
+    </w:p>
+    <w:p>
+      <w:r>
+        <w:rPr>
+          <w:rFonts w:ascii="Courier New" w:hAnsi="Courier New"/>
+          <w:sz w:val="16"/>
+        </w:rPr>
+        <w:t xml:space="preserve">                + remaining + " violation(s) remaining; "</w:t>
+      </w:r>
+    </w:p>
+    <w:p>
+      <w:r>
+        <w:rPr>
+          <w:rFonts w:ascii="Courier New" w:hAnsi="Courier New"/>
+          <w:sz w:val="16"/>
+        </w:rPr>
+        <w:t xml:space="preserve">                + (report.getSuppressedCount() + newlySuppressed) + " suppressed.");</w:t>
+      </w:r>
+    </w:p>
+    <w:p>
+      <w:r>
+        <w:rPr>
+          <w:rFonts w:ascii="Courier New" w:hAnsi="Courier New"/>
+          <w:sz w:val="16"/>
+        </w:rPr>
+        <w:t xml:space="preserve">        return remaining == 0 ? 0 : 1;</w:t>
       </w:r>
     </w:p>
     <w:p>
@@ -22657,7 +23118,7 @@
           <w:rFonts w:ascii="Courier New" w:hAnsi="Courier New"/>
           <w:sz w:val="16"/>
         </w:rPr>
-        <w:t>[INFO] Running com.archchecker.application.InteractiveFixerTest        [new]</w:t>
+        <w:t>[INFO] Running com.archchecker.cli.FixCommandTest                  [new]</w:t>
       </w:r>
     </w:p>
     <w:p>
@@ -22849,16 +23310,16 @@
         <w:rPr>
           <w:b/>
         </w:rPr>
-        <w:t>— InteractiveFixerTest.java [new]（UC-03 互動式修復）</w:t>
-      </w:r>
-    </w:p>
-    <w:p>
-      <w:r>
-        <w:rPr>
-          <w:rFonts w:ascii="Courier New" w:hAnsi="Courier New"/>
-          <w:sz w:val="16"/>
-        </w:rPr>
-        <w:t>package com.archchecker.application;</w:t>
+        <w:t>— FixCommandTest.java [new]（UC-03 互動式修復）</w:t>
+      </w:r>
+    </w:p>
+    <w:p>
+      <w:r>
+        <w:rPr>
+          <w:rFonts w:ascii="Courier New" w:hAnsi="Courier New"/>
+          <w:sz w:val="16"/>
+        </w:rPr>
+        <w:t>package com.archchecker.cli;</w:t>
       </w:r>
     </w:p>
     <w:p/>
@@ -23024,7 +23485,7 @@
           <w:rFonts w:ascii="Courier New" w:hAnsi="Courier New"/>
           <w:sz w:val="16"/>
         </w:rPr>
-        <w:t>class InteractiveFixerTest {</w:t>
+        <w:t>class FixCommandTest {</w:t>
       </w:r>
     </w:p>
     <w:p/>
@@ -23043,7 +23504,7 @@
           <w:rFonts w:ascii="Courier New" w:hAnsi="Courier New"/>
           <w:sz w:val="16"/>
         </w:rPr>
-        <w:t xml:space="preserve">    void answerYSuppressesViolationAndReturnsExitZero() {</w:t>
+        <w:t xml:space="preserve">    void actionYSuppressesViolationAndReturnsExitZero() {</w:t>
       </w:r>
     </w:p>
     <w:p>
@@ -23107,16 +23568,16 @@
           <w:rFonts w:ascii="Courier New" w:hAnsi="Courier New"/>
           <w:sz w:val="16"/>
         </w:rPr>
-        <w:t xml:space="preserve">        InteractiveFixer fixer = fixerWithInput("y\n", store);</w:t>
-      </w:r>
-    </w:p>
-    <w:p>
-      <w:r>
-        <w:rPr>
-          <w:rFonts w:ascii="Courier New" w:hAnsi="Courier New"/>
-          <w:sz w:val="16"/>
-        </w:rPr>
-        <w:t xml:space="preserve">        InteractiveFixer.FixResult result = fixer.fix(report, Paths.get("/s.yaml"), profile);</w:t>
+        <w:t xml:space="preserve">        int[] counts = fixCommandWith("y\n", store)</w:t>
+      </w:r>
+    </w:p>
+    <w:p>
+      <w:r>
+        <w:rPr>
+          <w:rFonts w:ascii="Courier New" w:hAnsi="Courier New"/>
+          <w:sz w:val="16"/>
+        </w:rPr>
+        <w:t xml:space="preserve">                .runInteractiveLoop(report, profile, store, Paths.get("/s.yaml"));</w:t>
       </w:r>
     </w:p>
     <w:p/>
@@ -23126,25 +23587,16 @@
           <w:rFonts w:ascii="Courier New" w:hAnsi="Courier New"/>
           <w:sz w:val="16"/>
         </w:rPr>
-        <w:t xml:space="preserve">        assertEquals(0, result.getExitCode());</w:t>
-      </w:r>
-    </w:p>
-    <w:p>
-      <w:r>
-        <w:rPr>
-          <w:rFonts w:ascii="Courier New" w:hAnsi="Courier New"/>
-          <w:sz w:val="16"/>
-        </w:rPr>
-        <w:t xml:space="preserve">        assertEquals(1, result.getNewlySuppressed());</w:t>
-      </w:r>
-    </w:p>
-    <w:p>
-      <w:r>
-        <w:rPr>
-          <w:rFonts w:ascii="Courier New" w:hAnsi="Courier New"/>
-          <w:sz w:val="16"/>
-        </w:rPr>
-        <w:t xml:space="preserve">        assertTrue(result.getRemaining().isEmpty());</w:t>
+        <w:t xml:space="preserve">        assertEquals(1, counts[0], "newlySuppressed");</w:t>
+      </w:r>
+    </w:p>
+    <w:p>
+      <w:r>
+        <w:rPr>
+          <w:rFonts w:ascii="Courier New" w:hAnsi="Courier New"/>
+          <w:sz w:val="16"/>
+        </w:rPr>
+        <w:t xml:space="preserve">        assertEquals(0, counts[1], "remaining");</w:t>
       </w:r>
     </w:p>
     <w:p>
@@ -23162,6 +23614,15 @@
           <w:rFonts w:ascii="Courier New" w:hAnsi="Courier New"/>
           <w:sz w:val="16"/>
         </w:rPr>
+        <w:t xml:space="preserve">        assertEquals(1, store.saved.size());</w:t>
+      </w:r>
+    </w:p>
+    <w:p>
+      <w:r>
+        <w:rPr>
+          <w:rFonts w:ascii="Courier New" w:hAnsi="Courier New"/>
+          <w:sz w:val="16"/>
+        </w:rPr>
         <w:t xml:space="preserve">    }</w:t>
       </w:r>
     </w:p>
@@ -23182,7 +23643,7 @@
           <w:sz w:val="16"/>
         </w:rPr>
         <w:lastRenderedPageBreak/>
-        <w:t xml:space="preserve">    void answerNKeepsViolationInRemaining() {</w:t>
+        <w:t xml:space="preserve">    void actionNKeepsViolationInRemaining() {</w:t>
       </w:r>
     </w:p>
     <w:p>
@@ -23237,25 +23698,25 @@
           <w:rFonts w:ascii="Courier New" w:hAnsi="Courier New"/>
           <w:sz w:val="16"/>
         </w:rPr>
-        <w:t xml:space="preserve">        InteractiveFixer fixer = fixerWithInput("n\n", store);</w:t>
-      </w:r>
-    </w:p>
-    <w:p>
-      <w:r>
-        <w:rPr>
-          <w:rFonts w:ascii="Courier New" w:hAnsi="Courier New"/>
-          <w:sz w:val="16"/>
-        </w:rPr>
-        <w:t xml:space="preserve">        InteractiveFixer.FixResult result =</w:t>
-      </w:r>
-    </w:p>
-    <w:p>
-      <w:r>
-        <w:rPr>
-          <w:rFonts w:ascii="Courier New" w:hAnsi="Courier New"/>
-          <w:sz w:val="16"/>
-        </w:rPr>
-        <w:t xml:space="preserve">                fixer.fix(report, Paths.get("/s.yaml"), new StyleProfile("p", List.of(rule)));</w:t>
+        <w:t xml:space="preserve">        int[] counts = fixCommandWith("n\n", store)</w:t>
+      </w:r>
+    </w:p>
+    <w:p>
+      <w:r>
+        <w:rPr>
+          <w:rFonts w:ascii="Courier New" w:hAnsi="Courier New"/>
+          <w:sz w:val="16"/>
+        </w:rPr>
+        <w:t xml:space="preserve">                .runInteractiveLoop(report, new StyleProfile("p", List.of(rule)), store, Paths.get("/s.yaml"));</w:t>
+      </w:r>
+    </w:p>
+    <w:p>
+      <w:r>
+        <w:rPr>
+          <w:rFonts w:ascii="Courier New" w:hAnsi="Courier New"/>
+          <w:sz w:val="16"/>
+        </w:rPr>
+        <w:t xml:space="preserve">        assertEquals(0, counts[0], "newlySuppressed");</w:t>
       </w:r>
     </w:p>
     <w:p/>
@@ -23265,25 +23726,7 @@
           <w:rFonts w:ascii="Courier New" w:hAnsi="Courier New"/>
           <w:sz w:val="16"/>
         </w:rPr>
-        <w:t xml:space="preserve">        assertEquals(1, result.getExitCode());</w:t>
-      </w:r>
-    </w:p>
-    <w:p>
-      <w:r>
-        <w:rPr>
-          <w:rFonts w:ascii="Courier New" w:hAnsi="Courier New"/>
-          <w:sz w:val="16"/>
-        </w:rPr>
-        <w:t xml:space="preserve">        assertEquals(1, result.getRemaining().size());</w:t>
-      </w:r>
-    </w:p>
-    <w:p>
-      <w:r>
-        <w:rPr>
-          <w:rFonts w:ascii="Courier New" w:hAnsi="Courier New"/>
-          <w:sz w:val="16"/>
-        </w:rPr>
-        <w:t xml:space="preserve">        assertEquals(0, result.getNewlySuppressed());</w:t>
+        <w:t xml:space="preserve">        assertEquals(1, counts[1], "remaining");</w:t>
       </w:r>
     </w:p>
     <w:p>
@@ -23304,6 +23747,24 @@
         <w:t xml:space="preserve">    }</w:t>
       </w:r>
     </w:p>
+    <w:p>
+      <w:r>
+        <w:rPr>
+          <w:rFonts w:ascii="Courier New" w:hAnsi="Courier New"/>
+          <w:sz w:val="16"/>
+        </w:rPr>
+        <w:t xml:space="preserve">    @Test</w:t>
+      </w:r>
+    </w:p>
+    <w:p>
+      <w:r>
+        <w:rPr>
+          <w:rFonts w:ascii="Courier New" w:hAnsi="Courier New"/>
+          <w:sz w:val="16"/>
+        </w:rPr>
+        <w:t xml:space="preserve">    void actionQStopsLoopAndKeepsAllRemainingViolations() {</w:t>
+      </w:r>
+    </w:p>
     <w:p/>
     <w:p>
       <w:r>
@@ -23311,6 +23772,99 @@
           <w:rFonts w:ascii="Courier New" w:hAnsi="Courier New"/>
           <w:sz w:val="16"/>
         </w:rPr>
+        <w:t xml:space="preserve">        File file = new File(Paths.get("/x/A.java"), "com.foo");</w:t>
+      </w:r>
+    </w:p>
+    <w:p>
+      <w:r>
+        <w:rPr>
+          <w:rFonts w:ascii="Courier New" w:hAnsi="Courier New"/>
+          <w:sz w:val="16"/>
+        </w:rPr>
+        <w:t xml:space="preserve">        StubRule rule = new StubRule("R-NAME-01");</w:t>
+      </w:r>
+    </w:p>
+    <w:p>
+      <w:r>
+        <w:rPr>
+          <w:rFonts w:ascii="Courier New" w:hAnsi="Courier New"/>
+          <w:sz w:val="16"/>
+        </w:rPr>
+        <w:t xml:space="preserve">        Violation v1 = new Violation(1, "v1", file, rule);</w:t>
+      </w:r>
+    </w:p>
+    <w:p>
+      <w:r>
+        <w:rPr>
+          <w:rFonts w:ascii="Courier New" w:hAnsi="Courier New"/>
+          <w:sz w:val="16"/>
+        </w:rPr>
+        <w:t xml:space="preserve">        Violation v2 = new Violation(2, "v2", file, rule);</w:t>
+      </w:r>
+    </w:p>
+    <w:p>
+      <w:r>
+        <w:rPr>
+          <w:rFonts w:ascii="Courier New" w:hAnsi="Courier New"/>
+          <w:sz w:val="16"/>
+        </w:rPr>
+        <w:t xml:space="preserve">        SpyStore store = new SpyStore();</w:t>
+      </w:r>
+    </w:p>
+    <w:p/>
+    <w:p>
+      <w:r>
+        <w:rPr>
+          <w:rFonts w:ascii="Courier New" w:hAnsi="Courier New"/>
+          <w:sz w:val="16"/>
+        </w:rPr>
+        <w:t xml:space="preserve">        int[] counts = fixCommandWith("q\n", store)</w:t>
+      </w:r>
+    </w:p>
+    <w:p>
+      <w:r>
+        <w:rPr>
+          <w:rFonts w:ascii="Courier New" w:hAnsi="Courier New"/>
+          <w:sz w:val="16"/>
+        </w:rPr>
+        <w:t xml:space="preserve">                .runInteractiveLoop(reportWith(v1, v2), new StyleProfile("p", List.of(rule)), store, Paths.get("/s.yaml"));</w:t>
+      </w:r>
+    </w:p>
+    <w:p/>
+    <w:p>
+      <w:r>
+        <w:rPr>
+          <w:rFonts w:ascii="Courier New" w:hAnsi="Courier New"/>
+          <w:sz w:val="16"/>
+        </w:rPr>
+        <w:t xml:space="preserve">        assertEquals(2, counts[1], "both violations remain after quit");</w:t>
+      </w:r>
+    </w:p>
+    <w:p>
+      <w:r>
+        <w:rPr>
+          <w:rFonts w:ascii="Courier New" w:hAnsi="Courier New"/>
+          <w:sz w:val="16"/>
+        </w:rPr>
+        <w:t xml:space="preserve">        assertEquals(0, counts[0]);</w:t>
+      </w:r>
+    </w:p>
+    <w:p>
+      <w:r>
+        <w:rPr>
+          <w:rFonts w:ascii="Courier New" w:hAnsi="Courier New"/>
+          <w:sz w:val="16"/>
+        </w:rPr>
+        <w:t xml:space="preserve">    }</w:t>
+      </w:r>
+    </w:p>
+    <w:p/>
+    <w:p>
+      <w:r>
+        <w:rPr>
+          <w:rFonts w:ascii="Courier New" w:hAnsi="Courier New"/>
+          <w:sz w:val="16"/>
+        </w:rPr>
         <w:t xml:space="preserve">    @Test</w:t>
       </w:r>
     </w:p>
@@ -23320,7 +23874,7 @@
           <w:rFonts w:ascii="Courier New" w:hAnsi="Courier New"/>
           <w:sz w:val="16"/>
         </w:rPr>
-        <w:t xml:space="preserve">    void answerQStopsLoopAndKeepsRemainingViolations() {</w:t>
+        <w:t xml:space="preserve">    void invalidInputPromptsAgainBeforeAccepting() {</w:t>
       </w:r>
     </w:p>
     <w:p>
@@ -23332,6 +23886,7 @@
         <w:t xml:space="preserve">        File file = new File(Paths.get("/x/A.java"), "com.foo");</w:t>
       </w:r>
     </w:p>
+    <w:p/>
     <w:p>
       <w:r>
         <w:rPr>
@@ -23347,25 +23902,7 @@
           <w:rFonts w:ascii="Courier New" w:hAnsi="Courier New"/>
           <w:sz w:val="16"/>
         </w:rPr>
-        <w:t xml:space="preserve">        Violation v1 = new Violation(1, "v1", file, rule);</w:t>
-      </w:r>
-    </w:p>
-    <w:p>
-      <w:r>
-        <w:rPr>
-          <w:rFonts w:ascii="Courier New" w:hAnsi="Courier New"/>
-          <w:sz w:val="16"/>
-        </w:rPr>
-        <w:t xml:space="preserve">        Violation v2 = new Violation(2, "v2", file, rule);</w:t>
-      </w:r>
-    </w:p>
-    <w:p>
-      <w:r>
-        <w:rPr>
-          <w:rFonts w:ascii="Courier New" w:hAnsi="Courier New"/>
-          <w:sz w:val="16"/>
-        </w:rPr>
-        <w:t xml:space="preserve">        ViolationReport report = reportWith(v1, v2);</w:t>
+        <w:t xml:space="preserve">        Violation v = new Violation(1, "bad", new File(Paths.get("/x/A.java"), "com.foo"), rule);</w:t>
       </w:r>
     </w:p>
     <w:p>
@@ -23377,6 +23914,15 @@
         <w:t xml:space="preserve">        SpyStore store = new SpyStore();</w:t>
       </w:r>
     </w:p>
+    <w:p>
+      <w:r>
+        <w:rPr>
+          <w:rFonts w:ascii="Courier New" w:hAnsi="Courier New"/>
+          <w:sz w:val="16"/>
+        </w:rPr>
+        <w:t xml:space="preserve">        ByteArrayOutputStream buf = new ByteArrayOutputStream();</w:t>
+      </w:r>
+    </w:p>
     <w:p/>
     <w:p>
       <w:r>
@@ -23384,44 +23930,49 @@
           <w:rFonts w:ascii="Courier New" w:hAnsi="Courier New"/>
           <w:sz w:val="16"/>
         </w:rPr>
-        <w:t xml:space="preserve">        InteractiveFixer fixer = fixerWithInput("q\n", store);</w:t>
-      </w:r>
-    </w:p>
-    <w:p>
-      <w:r>
-        <w:rPr>
-          <w:rFonts w:ascii="Courier New" w:hAnsi="Courier New"/>
-          <w:sz w:val="16"/>
-        </w:rPr>
-        <w:t xml:space="preserve">        InteractiveFixer.FixResult result =</w:t>
-      </w:r>
-    </w:p>
-    <w:p>
-      <w:r>
-        <w:rPr>
-          <w:rFonts w:ascii="Courier New" w:hAnsi="Courier New"/>
-          <w:sz w:val="16"/>
-        </w:rPr>
-        <w:t xml:space="preserve">                fixer.fix(report, Paths.get("/s.yaml"), new StyleProfile("p", List.of(rule)));</w:t>
+        <w:t xml:space="preserve">        FixCommand cmd = new FixCommand(new PrintStream(buf),</w:t>
+      </w:r>
+    </w:p>
+    <w:p>
+      <w:r>
+        <w:rPr>
+          <w:rFonts w:ascii="Courier New" w:hAnsi="Courier New"/>
+          <w:sz w:val="16"/>
+        </w:rPr>
+        <w:t xml:space="preserve">                new BufferedReader(new StringReader("maybe\ny\n")));</w:t>
       </w:r>
     </w:p>
     <w:p/>
-    <w:p>
-      <w:r>
-        <w:rPr>
-          <w:rFonts w:ascii="Courier New" w:hAnsi="Courier New"/>
-          <w:sz w:val="16"/>
-        </w:rPr>
-        <w:t xml:space="preserve">        assertEquals(2, result.getRemaining().size(), "both violations remain after quit");</w:t>
-      </w:r>
-    </w:p>
-    <w:p>
-      <w:r>
-        <w:rPr>
-          <w:rFonts w:ascii="Courier New" w:hAnsi="Courier New"/>
-          <w:sz w:val="16"/>
-        </w:rPr>
-        <w:t xml:space="preserve">        assertEquals(0, result.getNewlySuppressed());</w:t>
+    <w:p/>
+    <w:p>
+      <w:r>
+        <w:rPr>
+          <w:rFonts w:ascii="Courier New" w:hAnsi="Courier New"/>
+          <w:sz w:val="16"/>
+        </w:rPr>
+        <w:t xml:space="preserve">        cmd.runInteractiveLoop(reportWith(v), new StyleProfile("p", List.of(rule)), store, Paths.get("/s.yaml"));</w:t>
+      </w:r>
+    </w:p>
+    <w:p/>
+    <w:p/>
+    <w:p>
+      <w:r>
+        <w:rPr>
+          <w:rFonts w:ascii="Courier New" w:hAnsi="Courier New"/>
+          <w:sz w:val="16"/>
+        </w:rPr>
+        <w:t xml:space="preserve">        assertTrue(buf.toString().contains("Invalid input"),</w:t>
+      </w:r>
+    </w:p>
+    <w:p/>
+    <w:p/>
+    <w:p>
+      <w:r>
+        <w:rPr>
+          <w:rFonts w:ascii="Courier New" w:hAnsi="Courier New"/>
+          <w:sz w:val="16"/>
+        </w:rPr>
+        <w:t xml:space="preserve">                "should re-prompt on invalid input");</w:t>
       </w:r>
     </w:p>
     <w:p>
@@ -23440,61 +23991,7 @@
           <w:rFonts w:ascii="Courier New" w:hAnsi="Courier New"/>
           <w:sz w:val="16"/>
         </w:rPr>
-        <w:t xml:space="preserve">    @Test</w:t>
-      </w:r>
-    </w:p>
-    <w:p>
-      <w:r>
-        <w:rPr>
-          <w:rFonts w:ascii="Courier New" w:hAnsi="Courier New"/>
-          <w:sz w:val="16"/>
-        </w:rPr>
-        <w:t xml:space="preserve">    void invalidInputPromptsAgainBeforeAccepting() {</w:t>
-      </w:r>
-    </w:p>
-    <w:p>
-      <w:r>
-        <w:rPr>
-          <w:rFonts w:ascii="Courier New" w:hAnsi="Courier New"/>
-          <w:sz w:val="16"/>
-        </w:rPr>
-        <w:t xml:space="preserve">        File file = new File(Paths.get("/x/A.java"), "com.foo");</w:t>
-      </w:r>
-    </w:p>
-    <w:p>
-      <w:r>
-        <w:rPr>
-          <w:rFonts w:ascii="Courier New" w:hAnsi="Courier New"/>
-          <w:sz w:val="16"/>
-        </w:rPr>
-        <w:t xml:space="preserve">        StubRule rule = new StubRule("R-NAME-01");</w:t>
-      </w:r>
-    </w:p>
-    <w:p>
-      <w:r>
-        <w:rPr>
-          <w:rFonts w:ascii="Courier New" w:hAnsi="Courier New"/>
-          <w:sz w:val="16"/>
-        </w:rPr>
-        <w:t xml:space="preserve">        Violation v = new Violation(1, "bad", file, rule);</w:t>
-      </w:r>
-    </w:p>
-    <w:p>
-      <w:r>
-        <w:rPr>
-          <w:rFonts w:ascii="Courier New" w:hAnsi="Courier New"/>
-          <w:sz w:val="16"/>
-        </w:rPr>
-        <w:t xml:space="preserve">        ViolationReport report = reportWith(v);</w:t>
-      </w:r>
-    </w:p>
-    <w:p>
-      <w:r>
-        <w:rPr>
-          <w:rFonts w:ascii="Courier New" w:hAnsi="Courier New"/>
-          <w:sz w:val="16"/>
-        </w:rPr>
-        <w:t xml:space="preserve">        SpyStore store = new SpyStore();</w:t>
+        <w:t xml:space="preserve">    private static FixCommand fixCommandWith(String input, SpyStore store) {</w:t>
       </w:r>
     </w:p>
     <w:p>
@@ -23506,97 +24003,13 @@
         <w:t xml:space="preserve">        ByteArrayOutputStream buf = new ByteArrayOutputStream();</w:t>
       </w:r>
     </w:p>
-    <w:p/>
-    <w:p>
-      <w:r>
-        <w:rPr>
-          <w:rFonts w:ascii="Courier New" w:hAnsi="Courier New"/>
-          <w:sz w:val="16"/>
-        </w:rPr>
-        <w:t xml:space="preserve">        InteractiveFixer fixer = new InteractiveFixer(store,</w:t>
-      </w:r>
-    </w:p>
-    <w:p>
-      <w:r>
-        <w:rPr>
-          <w:rFonts w:ascii="Courier New" w:hAnsi="Courier New"/>
-          <w:sz w:val="16"/>
-        </w:rPr>
-        <w:t xml:space="preserve">                new PrintStream(buf),</w:t>
-      </w:r>
-    </w:p>
-    <w:p>
-      <w:r>
-        <w:rPr>
-          <w:rFonts w:ascii="Courier New" w:hAnsi="Courier New"/>
-          <w:sz w:val="16"/>
-        </w:rPr>
-        <w:t xml:space="preserve">                new BufferedReader(new StringReader("maybe\ny\n")));</w:t>
-      </w:r>
-    </w:p>
-    <w:p>
-      <w:r>
-        <w:rPr>
-          <w:rFonts w:ascii="Courier New" w:hAnsi="Courier New"/>
-          <w:sz w:val="16"/>
-        </w:rPr>
-        <w:t xml:space="preserve">        fixer.fix(report, Paths.get("/s.yaml"), new StyleProfile("p", List.of(rule)));</w:t>
-      </w:r>
-    </w:p>
-    <w:p/>
-    <w:p>
-      <w:r>
-        <w:rPr>
-          <w:rFonts w:ascii="Courier New" w:hAnsi="Courier New"/>
-          <w:sz w:val="16"/>
-        </w:rPr>
-        <w:t xml:space="preserve">        assertTrue(buf.toString().contains("Invalid input"),</w:t>
-      </w:r>
-    </w:p>
-    <w:p>
-      <w:r>
-        <w:rPr>
-          <w:rFonts w:ascii="Courier New" w:hAnsi="Courier New"/>
-          <w:sz w:val="16"/>
-        </w:rPr>
-        <w:t xml:space="preserve">                "should re-prompt on invalid input");</w:t>
-      </w:r>
-    </w:p>
-    <w:p>
-      <w:r>
-        <w:rPr>
-          <w:rFonts w:ascii="Courier New" w:hAnsi="Courier New"/>
-          <w:sz w:val="16"/>
-        </w:rPr>
-        <w:t xml:space="preserve">    }</w:t>
-      </w:r>
-    </w:p>
-    <w:p/>
-    <w:p>
-      <w:r>
-        <w:rPr>
-          <w:rFonts w:ascii="Courier New" w:hAnsi="Courier New"/>
-          <w:sz w:val="16"/>
-        </w:rPr>
-        <w:t xml:space="preserve">    private static InteractiveFixer fixerWithInput(String input, SpyStore store) {</w:t>
-      </w:r>
-    </w:p>
-    <w:p>
-      <w:r>
-        <w:rPr>
-          <w:rFonts w:ascii="Courier New" w:hAnsi="Courier New"/>
-          <w:sz w:val="16"/>
-        </w:rPr>
-        <w:t xml:space="preserve">        ByteArrayOutputStream buf = new ByteArrayOutputStream();</w:t>
-      </w:r>
-    </w:p>
-    <w:p>
-      <w:r>
-        <w:rPr>
-          <w:rFonts w:ascii="Courier New" w:hAnsi="Courier New"/>
-          <w:sz w:val="16"/>
-        </w:rPr>
-        <w:t xml:space="preserve">        return new InteractiveFixer(store, new PrintStream(buf),</w:t>
+    <w:p>
+      <w:r>
+        <w:rPr>
+          <w:rFonts w:ascii="Courier New" w:hAnsi="Courier New"/>
+          <w:sz w:val="16"/>
+        </w:rPr>
+        <w:t xml:space="preserve">        return new FixCommand(new PrintStream(buf),</w:t>
       </w:r>
     </w:p>
     <w:p>
@@ -25957,9 +26370,8 @@
         <w:ind w:firstLine="480"/>
       </w:pPr>
       <w:r>
-        <w:t xml:space="preserve">• 新增 fix 子命令，由 FixCommand 作為 Controller 接收 fix(sourcePath, profilePath) 系統事件；FixCommand 先呼叫 ComplianceCheckService 取得 ViolationReport，再交由 </w:t>
+        <w:t xml:space="preserve">• 新增 fix 子命令，由 FixCommand 作為 Controller 接收 fix(sourcePath, profilePath) 系統事件；FixCommand 先呼叫 ComplianceCheckService 取得 ViolationReport，再逐一顯示違規並讀取 Developer 決策（action: y | n）。</w:t>
         <w:lastRenderedPageBreak/>
-        <w:t>InteractiveFixer 執行互動迴圈。</w:t>
       </w:r>
     </w:p>
     <w:p>
@@ -25968,7 +26380,7 @@
         <w:ind w:firstLine="480"/>
       </w:pPr>
       <w:r>
-        <w:t>• InteractiveFixer 作為 Information Expert，逐一顯示違規與 suggestion，讀取使用者決策（f/s/q），並呼叫既有 SuppressionStore 寫出抑制記錄。</w:t>
+        <w:t>• SuppressionService 作為 Pure Fabrication，封裝 suppress 流程（讀取現有清單、建立 Suppression 記錄、寫回 YAML）；FixCommand 於 action == "y" 時委派 SuppressionService.suppress(violation, profile, suppressFile)，無需了解 SuppressionStore 的讀寫細節，達成 Indirection 與 Low Coupling。</w:t>
       </w:r>
     </w:p>
     <w:p>

</xml_diff>

<commit_message>
[Feature Addition] Add optional user-provided reason to interactive suppress flow
In the interactive fix loop, after selecting y, prompt for a reason string.
Empty input falls back to Suppressed interactively. Update UC-03 SD diagram
to show steps 3.2.1/3.2.2 (reason prompt/input) and the updated suppress call.
Add test for custom reason storage.
</commit_message>
<xml_diff>
--- a/hw/hw7/113598009_7.docx
+++ b/hw/hw7/113598009_7.docx
@@ -14654,7 +14654,7 @@
           </w:tcPr>
           <w:p>
             <w:r>
-              <w:t xml:space="preserve">FixCommand 僅依賴 ComplianceCheckService 與 SuppressionService 介面，I/O 直接走 System.in/out 而非耦合任何具體類別，便於替換實作。</w:t>
+              <w:t xml:space="preserve">FixCommand 僅依賴 ComplianceCheckService 與 SuppressionService 介面，I/O（包含 reason 輸入）直接走 System.in/out 而非耦合任何具體類別，便於替換實作。</w:t>
             </w:r>
           </w:p>
         </w:tc>
@@ -14671,7 +14671,7 @@
         <w:lastRenderedPageBreak/>
         <w:drawing>
           <wp:inline distT="0" distB="0" distL="0" distR="0" wp14:anchorId="37CF6A4C" wp14:editId="2B2DBB1B">
-            <wp:extent cx="5486400" cy="4410838"/>
+            <wp:extent cx="5486400" cy="4824516"/>
             <wp:effectExtent l="0" t="0" r="0" b="0"/>
             <wp:docPr id="1473456423" name="Picture uc03_sd"/>
             <wp:cNvGraphicFramePr>
@@ -14693,7 +14693,7 @@
                   <pic:spPr>
                     <a:xfrm>
                       <a:off x="0" y="0"/>
-                      <a:ext cx="5486400" cy="4410838"/>
+                      <a:ext cx="5486400" cy="4824516"/>
                     </a:xfrm>
                     <a:prstGeom prst="rect">
                       <a:avLst/>

</xml_diff>